<commit_message>
checkpoint before v57b post-process rules
</commit_message>
<xml_diff>
--- a/scripts/test-motor-ia/output/test_summary.docx
+++ b/scripts/test-motor-ia/output/test_summary.docx
@@ -22,7 +22,7 @@
         <w:t xml:space="preserve">Fecha de ejecución: </w:t>
       </w:r>
       <w:r>
-        <w:t xml:space="preserve">1/7/2026, 21:48:46</w:t>
+        <w:t xml:space="preserve">1/7/2026, 23:02:32</w:t>
       </w:r>
       <w:r>
         <w:rPr>
@@ -55,7 +55,7 @@
         <w:t xml:space="preserve">Tasa de éxito (OK_CATALOGO + OK_MIXTO): </w:t>
       </w:r>
       <w:r>
-        <w:t xml:space="preserve">373 / 400 (93%)</w:t>
+        <w:t xml:space="preserve">359 / 400 (90%)</w:t>
       </w:r>
     </w:p>
     <w:p>
@@ -70,7 +70,7 @@
         <w:t xml:space="preserve">Tasa de error (VACÍO + ERROR_TECNICO + P.INV): </w:t>
       </w:r>
       <w:r>
-        <w:t xml:space="preserve">7 / 400 (2%)</w:t>
+        <w:t xml:space="preserve">9 / 400 (2%)</w:t>
       </w:r>
     </w:p>
     <w:p>
@@ -85,7 +85,7 @@
         <w:t xml:space="preserve">Coincidencia de oficio detectado: </w:t>
       </w:r>
       <w:r>
-        <w:t xml:space="preserve">291 / 400 (73%)</w:t>
+        <w:t xml:space="preserve">290 / 400 (73%)</w:t>
       </w:r>
     </w:p>
     <w:p>
@@ -100,7 +100,7 @@
         <w:t xml:space="preserve">Latencia media: </w:t>
       </w:r>
       <w:r>
-        <w:t xml:space="preserve">18300ms   </w:t>
+        <w:t xml:space="preserve">18608ms   </w:t>
       </w:r>
       <w:r>
         <w:rPr>
@@ -110,7 +110,7 @@
         <w:t xml:space="preserve">P95: </w:t>
       </w:r>
       <w:r>
-        <w:t xml:space="preserve">29208ms</w:t>
+        <w:t xml:space="preserve">30103ms</w:t>
       </w:r>
     </w:p>
     <w:p>
@@ -137,7 +137,7 @@
         <w:t xml:space="preserve">  • OK_CATALOGO: </w:t>
       </w:r>
       <w:r>
-        <w:t xml:space="preserve">1 (0%)</w:t>
+        <w:t xml:space="preserve">2 (1%)</w:t>
       </w:r>
     </w:p>
     <w:p>
@@ -152,7 +152,7 @@
         <w:t xml:space="preserve">  • OK_MIXTO: </w:t>
       </w:r>
       <w:r>
-        <w:t xml:space="preserve">372 (93%)</w:t>
+        <w:t xml:space="preserve">357 (89%)</w:t>
       </w:r>
     </w:p>
     <w:p>
@@ -167,7 +167,7 @@
         <w:t xml:space="preserve">  • SOLO_SUGERIDAS: </w:t>
       </w:r>
       <w:r>
-        <w:t xml:space="preserve">20 (5%)</w:t>
+        <w:t xml:space="preserve">32 (8%)</w:t>
       </w:r>
     </w:p>
     <w:p>
@@ -182,7 +182,7 @@
         <w:t xml:space="preserve">  • VACIO: </w:t>
       </w:r>
       <w:r>
-        <w:t xml:space="preserve">4 (1%)</w:t>
+        <w:t xml:space="preserve">7 (2%)</w:t>
       </w:r>
     </w:p>
     <w:p>
@@ -212,7 +212,7 @@
         <w:t xml:space="preserve">  • PRECIO_INVALIDO: </w:t>
       </w:r>
       <w:r>
-        <w:t xml:space="preserve">1 (0%)</w:t>
+        <w:t xml:space="preserve">0 (0%)</w:t>
       </w:r>
     </w:p>
     <w:p>
@@ -736,7 +736,7 @@
                 <w:sz w:val="18"/>
                 <w:szCs w:val="18"/>
               </w:rPr>
-              <w:t xml:space="preserve">19450ms</w:t>
+              <w:t xml:space="preserve">19363ms</w:t>
             </w:r>
           </w:p>
         </w:tc>
@@ -830,30 +830,30 @@
                 <w:sz w:val="18"/>
                 <w:szCs w:val="18"/>
               </w:rPr>
-              <w:t xml:space="preserve">19</w:t>
-            </w:r>
-          </w:p>
-        </w:tc>
-        <w:tc>
-          <w:tcPr>
-            <w:shd w:fill="E8F5E9" w:color="E8F5E9" w:val="solid"/>
-            <w:tcMar>
-              <w:top w:type="dxa" w:w="60"/>
-              <w:left w:type="dxa" w:w="80"/>
-              <w:bottom w:type="dxa" w:w="60"/>
-              <w:right w:type="dxa" w:w="80"/>
-            </w:tcMar>
-          </w:tcPr>
-          <w:p>
-            <w:pPr>
-              <w:jc w:val="center"/>
-            </w:pPr>
-            <w:r>
-              <w:rPr>
-                <w:sz w:val="18"/>
-                <w:szCs w:val="18"/>
-              </w:rPr>
-              <w:t xml:space="preserve">1</w:t>
+              <w:t xml:space="preserve">18</w:t>
+            </w:r>
+          </w:p>
+        </w:tc>
+        <w:tc>
+          <w:tcPr>
+            <w:shd w:fill="E8F5E9" w:color="E8F5E9" w:val="solid"/>
+            <w:tcMar>
+              <w:top w:type="dxa" w:w="60"/>
+              <w:left w:type="dxa" w:w="80"/>
+              <w:bottom w:type="dxa" w:w="60"/>
+              <w:right w:type="dxa" w:w="80"/>
+            </w:tcMar>
+          </w:tcPr>
+          <w:p>
+            <w:pPr>
+              <w:jc w:val="center"/>
+            </w:pPr>
+            <w:r>
+              <w:rPr>
+                <w:sz w:val="18"/>
+                <w:szCs w:val="18"/>
+              </w:rPr>
+              <w:t xml:space="preserve">2</w:t>
             </w:r>
           </w:p>
         </w:tc>
@@ -947,30 +947,30 @@
                 <w:sz w:val="18"/>
                 <w:szCs w:val="18"/>
               </w:rPr>
-              <w:t xml:space="preserve">95%</w:t>
-            </w:r>
-          </w:p>
-        </w:tc>
-        <w:tc>
-          <w:tcPr>
-            <w:shd w:fill="E8F5E9" w:color="E8F5E9" w:val="solid"/>
-            <w:tcMar>
-              <w:top w:type="dxa" w:w="60"/>
-              <w:left w:type="dxa" w:w="80"/>
-              <w:bottom w:type="dxa" w:w="60"/>
-              <w:right w:type="dxa" w:w="80"/>
-            </w:tcMar>
-          </w:tcPr>
-          <w:p>
-            <w:pPr>
-              <w:jc w:val="center"/>
-            </w:pPr>
-            <w:r>
-              <w:rPr>
-                <w:sz w:val="18"/>
-                <w:szCs w:val="18"/>
-              </w:rPr>
-              <w:t xml:space="preserve">16318ms</w:t>
+              <w:t xml:space="preserve">90%</w:t>
+            </w:r>
+          </w:p>
+        </w:tc>
+        <w:tc>
+          <w:tcPr>
+            <w:shd w:fill="E8F5E9" w:color="E8F5E9" w:val="solid"/>
+            <w:tcMar>
+              <w:top w:type="dxa" w:w="60"/>
+              <w:left w:type="dxa" w:w="80"/>
+              <w:bottom w:type="dxa" w:w="60"/>
+              <w:right w:type="dxa" w:w="80"/>
+            </w:tcMar>
+          </w:tcPr>
+          <w:p>
+            <w:pPr>
+              <w:jc w:val="center"/>
+            </w:pPr>
+            <w:r>
+              <w:rPr>
+                <w:sz w:val="18"/>
+                <w:szCs w:val="18"/>
+              </w:rPr>
+              <w:t xml:space="preserve">16648ms</w:t>
             </w:r>
           </w:p>
         </w:tc>
@@ -1064,30 +1064,30 @@
                 <w:sz w:val="18"/>
                 <w:szCs w:val="18"/>
               </w:rPr>
-              <w:t xml:space="preserve">20</w:t>
-            </w:r>
-          </w:p>
-        </w:tc>
-        <w:tc>
-          <w:tcPr>
-            <w:shd w:fill="E8F5E9" w:color="E8F5E9" w:val="solid"/>
-            <w:tcMar>
-              <w:top w:type="dxa" w:w="60"/>
-              <w:left w:type="dxa" w:w="80"/>
-              <w:bottom w:type="dxa" w:w="60"/>
-              <w:right w:type="dxa" w:w="80"/>
-            </w:tcMar>
-          </w:tcPr>
-          <w:p>
-            <w:pPr>
-              <w:jc w:val="center"/>
-            </w:pPr>
-            <w:r>
-              <w:rPr>
-                <w:sz w:val="18"/>
-                <w:szCs w:val="18"/>
-              </w:rPr>
-              <w:t xml:space="preserve">0</w:t>
+              <w:t xml:space="preserve">19</w:t>
+            </w:r>
+          </w:p>
+        </w:tc>
+        <w:tc>
+          <w:tcPr>
+            <w:shd w:fill="E8F5E9" w:color="E8F5E9" w:val="solid"/>
+            <w:tcMar>
+              <w:top w:type="dxa" w:w="60"/>
+              <w:left w:type="dxa" w:w="80"/>
+              <w:bottom w:type="dxa" w:w="60"/>
+              <w:right w:type="dxa" w:w="80"/>
+            </w:tcMar>
+          </w:tcPr>
+          <w:p>
+            <w:pPr>
+              <w:jc w:val="center"/>
+            </w:pPr>
+            <w:r>
+              <w:rPr>
+                <w:sz w:val="18"/>
+                <w:szCs w:val="18"/>
+              </w:rPr>
+              <w:t xml:space="preserve">1</w:t>
             </w:r>
           </w:p>
         </w:tc>
@@ -1181,30 +1181,30 @@
                 <w:sz w:val="18"/>
                 <w:szCs w:val="18"/>
               </w:rPr>
-              <w:t xml:space="preserve">100%</w:t>
-            </w:r>
-          </w:p>
-        </w:tc>
-        <w:tc>
-          <w:tcPr>
-            <w:shd w:fill="E8F5E9" w:color="E8F5E9" w:val="solid"/>
-            <w:tcMar>
-              <w:top w:type="dxa" w:w="60"/>
-              <w:left w:type="dxa" w:w="80"/>
-              <w:bottom w:type="dxa" w:w="60"/>
-              <w:right w:type="dxa" w:w="80"/>
-            </w:tcMar>
-          </w:tcPr>
-          <w:p>
-            <w:pPr>
-              <w:jc w:val="center"/>
-            </w:pPr>
-            <w:r>
-              <w:rPr>
-                <w:sz w:val="18"/>
-                <w:szCs w:val="18"/>
-              </w:rPr>
-              <w:t xml:space="preserve">14534ms</w:t>
+              <w:t xml:space="preserve">95%</w:t>
+            </w:r>
+          </w:p>
+        </w:tc>
+        <w:tc>
+          <w:tcPr>
+            <w:shd w:fill="E8F5E9" w:color="E8F5E9" w:val="solid"/>
+            <w:tcMar>
+              <w:top w:type="dxa" w:w="60"/>
+              <w:left w:type="dxa" w:w="80"/>
+              <w:bottom w:type="dxa" w:w="60"/>
+              <w:right w:type="dxa" w:w="80"/>
+            </w:tcMar>
+          </w:tcPr>
+          <w:p>
+            <w:pPr>
+              <w:jc w:val="center"/>
+            </w:pPr>
+            <w:r>
+              <w:rPr>
+                <w:sz w:val="18"/>
+                <w:szCs w:val="18"/>
+              </w:rPr>
+              <w:t xml:space="preserve">15024ms</w:t>
             </w:r>
           </w:p>
         </w:tc>
@@ -1298,7 +1298,7 @@
                 <w:sz w:val="18"/>
                 <w:szCs w:val="18"/>
               </w:rPr>
-              <w:t xml:space="preserve">18</w:t>
+              <w:t xml:space="preserve">19</w:t>
             </w:r>
           </w:p>
         </w:tc>
@@ -1390,7 +1390,7 @@
                 <w:sz w:val="18"/>
                 <w:szCs w:val="18"/>
               </w:rPr>
-              <w:t xml:space="preserve">1</w:t>
+              <w:t xml:space="preserve">0</w:t>
             </w:r>
           </w:p>
         </w:tc>
@@ -1415,30 +1415,30 @@
                 <w:sz w:val="18"/>
                 <w:szCs w:val="18"/>
               </w:rPr>
-              <w:t xml:space="preserve">90%</w:t>
-            </w:r>
-          </w:p>
-        </w:tc>
-        <w:tc>
-          <w:tcPr>
-            <w:shd w:fill="E8F5E9" w:color="E8F5E9" w:val="solid"/>
-            <w:tcMar>
-              <w:top w:type="dxa" w:w="60"/>
-              <w:left w:type="dxa" w:w="80"/>
-              <w:bottom w:type="dxa" w:w="60"/>
-              <w:right w:type="dxa" w:w="80"/>
-            </w:tcMar>
-          </w:tcPr>
-          <w:p>
-            <w:pPr>
-              <w:jc w:val="center"/>
-            </w:pPr>
-            <w:r>
-              <w:rPr>
-                <w:sz w:val="18"/>
-                <w:szCs w:val="18"/>
-              </w:rPr>
-              <w:t xml:space="preserve">20205ms</w:t>
+              <w:t xml:space="preserve">95%</w:t>
+            </w:r>
+          </w:p>
+        </w:tc>
+        <w:tc>
+          <w:tcPr>
+            <w:shd w:fill="E8F5E9" w:color="E8F5E9" w:val="solid"/>
+            <w:tcMar>
+              <w:top w:type="dxa" w:w="60"/>
+              <w:left w:type="dxa" w:w="80"/>
+              <w:bottom w:type="dxa" w:w="60"/>
+              <w:right w:type="dxa" w:w="80"/>
+            </w:tcMar>
+          </w:tcPr>
+          <w:p>
+            <w:pPr>
+              <w:jc w:val="center"/>
+            </w:pPr>
+            <w:r>
+              <w:rPr>
+                <w:sz w:val="18"/>
+                <w:szCs w:val="18"/>
+              </w:rPr>
+              <w:t xml:space="preserve">21546ms</w:t>
             </w:r>
           </w:p>
         </w:tc>
@@ -1532,30 +1532,30 @@
                 <w:sz w:val="18"/>
                 <w:szCs w:val="18"/>
               </w:rPr>
-              <w:t xml:space="preserve">17</w:t>
-            </w:r>
-          </w:p>
-        </w:tc>
-        <w:tc>
-          <w:tcPr>
-            <w:shd w:fill="E8F5E9" w:color="E8F5E9" w:val="solid"/>
-            <w:tcMar>
-              <w:top w:type="dxa" w:w="60"/>
-              <w:left w:type="dxa" w:w="80"/>
-              <w:bottom w:type="dxa" w:w="60"/>
-              <w:right w:type="dxa" w:w="80"/>
-            </w:tcMar>
-          </w:tcPr>
-          <w:p>
-            <w:pPr>
-              <w:jc w:val="center"/>
-            </w:pPr>
-            <w:r>
-              <w:rPr>
-                <w:sz w:val="18"/>
-                <w:szCs w:val="18"/>
-              </w:rPr>
-              <w:t xml:space="preserve">2</w:t>
+              <w:t xml:space="preserve">15</w:t>
+            </w:r>
+          </w:p>
+        </w:tc>
+        <w:tc>
+          <w:tcPr>
+            <w:shd w:fill="E8F5E9" w:color="E8F5E9" w:val="solid"/>
+            <w:tcMar>
+              <w:top w:type="dxa" w:w="60"/>
+              <w:left w:type="dxa" w:w="80"/>
+              <w:bottom w:type="dxa" w:w="60"/>
+              <w:right w:type="dxa" w:w="80"/>
+            </w:tcMar>
+          </w:tcPr>
+          <w:p>
+            <w:pPr>
+              <w:jc w:val="center"/>
+            </w:pPr>
+            <w:r>
+              <w:rPr>
+                <w:sz w:val="18"/>
+                <w:szCs w:val="18"/>
+              </w:rPr>
+              <w:t xml:space="preserve">4</w:t>
             </w:r>
           </w:p>
         </w:tc>
@@ -1649,30 +1649,30 @@
                 <w:sz w:val="18"/>
                 <w:szCs w:val="18"/>
               </w:rPr>
-              <w:t xml:space="preserve">85%</w:t>
-            </w:r>
-          </w:p>
-        </w:tc>
-        <w:tc>
-          <w:tcPr>
-            <w:shd w:fill="E8F5E9" w:color="E8F5E9" w:val="solid"/>
-            <w:tcMar>
-              <w:top w:type="dxa" w:w="60"/>
-              <w:left w:type="dxa" w:w="80"/>
-              <w:bottom w:type="dxa" w:w="60"/>
-              <w:right w:type="dxa" w:w="80"/>
-            </w:tcMar>
-          </w:tcPr>
-          <w:p>
-            <w:pPr>
-              <w:jc w:val="center"/>
-            </w:pPr>
-            <w:r>
-              <w:rPr>
-                <w:sz w:val="18"/>
-                <w:szCs w:val="18"/>
-              </w:rPr>
-              <w:t xml:space="preserve">21630ms</w:t>
+              <w:t xml:space="preserve">75%</w:t>
+            </w:r>
+          </w:p>
+        </w:tc>
+        <w:tc>
+          <w:tcPr>
+            <w:shd w:fill="E8F5E9" w:color="E8F5E9" w:val="solid"/>
+            <w:tcMar>
+              <w:top w:type="dxa" w:w="60"/>
+              <w:left w:type="dxa" w:w="80"/>
+              <w:bottom w:type="dxa" w:w="60"/>
+              <w:right w:type="dxa" w:w="80"/>
+            </w:tcMar>
+          </w:tcPr>
+          <w:p>
+            <w:pPr>
+              <w:jc w:val="center"/>
+            </w:pPr>
+            <w:r>
+              <w:rPr>
+                <w:sz w:val="18"/>
+                <w:szCs w:val="18"/>
+              </w:rPr>
+              <w:t xml:space="preserve">21372ms</w:t>
             </w:r>
           </w:p>
         </w:tc>
@@ -1766,30 +1766,30 @@
                 <w:sz w:val="18"/>
                 <w:szCs w:val="18"/>
               </w:rPr>
-              <w:t xml:space="preserve">19</w:t>
-            </w:r>
-          </w:p>
-        </w:tc>
-        <w:tc>
-          <w:tcPr>
-            <w:shd w:fill="E8F5E9" w:color="E8F5E9" w:val="solid"/>
-            <w:tcMar>
-              <w:top w:type="dxa" w:w="60"/>
-              <w:left w:type="dxa" w:w="80"/>
-              <w:bottom w:type="dxa" w:w="60"/>
-              <w:right w:type="dxa" w:w="80"/>
-            </w:tcMar>
-          </w:tcPr>
-          <w:p>
-            <w:pPr>
-              <w:jc w:val="center"/>
-            </w:pPr>
-            <w:r>
-              <w:rPr>
-                <w:sz w:val="18"/>
-                <w:szCs w:val="18"/>
-              </w:rPr>
-              <w:t xml:space="preserve">1</w:t>
+              <w:t xml:space="preserve">20</w:t>
+            </w:r>
+          </w:p>
+        </w:tc>
+        <w:tc>
+          <w:tcPr>
+            <w:shd w:fill="E8F5E9" w:color="E8F5E9" w:val="solid"/>
+            <w:tcMar>
+              <w:top w:type="dxa" w:w="60"/>
+              <w:left w:type="dxa" w:w="80"/>
+              <w:bottom w:type="dxa" w:w="60"/>
+              <w:right w:type="dxa" w:w="80"/>
+            </w:tcMar>
+          </w:tcPr>
+          <w:p>
+            <w:pPr>
+              <w:jc w:val="center"/>
+            </w:pPr>
+            <w:r>
+              <w:rPr>
+                <w:sz w:val="18"/>
+                <w:szCs w:val="18"/>
+              </w:rPr>
+              <w:t xml:space="preserve">0</w:t>
             </w:r>
           </w:p>
         </w:tc>
@@ -1883,30 +1883,30 @@
                 <w:sz w:val="18"/>
                 <w:szCs w:val="18"/>
               </w:rPr>
-              <w:t xml:space="preserve">95%</w:t>
-            </w:r>
-          </w:p>
-        </w:tc>
-        <w:tc>
-          <w:tcPr>
-            <w:shd w:fill="E8F5E9" w:color="E8F5E9" w:val="solid"/>
-            <w:tcMar>
-              <w:top w:type="dxa" w:w="60"/>
-              <w:left w:type="dxa" w:w="80"/>
-              <w:bottom w:type="dxa" w:w="60"/>
-              <w:right w:type="dxa" w:w="80"/>
-            </w:tcMar>
-          </w:tcPr>
-          <w:p>
-            <w:pPr>
-              <w:jc w:val="center"/>
-            </w:pPr>
-            <w:r>
-              <w:rPr>
-                <w:sz w:val="18"/>
-                <w:szCs w:val="18"/>
-              </w:rPr>
-              <w:t xml:space="preserve">15603ms</w:t>
+              <w:t xml:space="preserve">100%</w:t>
+            </w:r>
+          </w:p>
+        </w:tc>
+        <w:tc>
+          <w:tcPr>
+            <w:shd w:fill="E8F5E9" w:color="E8F5E9" w:val="solid"/>
+            <w:tcMar>
+              <w:top w:type="dxa" w:w="60"/>
+              <w:left w:type="dxa" w:w="80"/>
+              <w:bottom w:type="dxa" w:w="60"/>
+              <w:right w:type="dxa" w:w="80"/>
+            </w:tcMar>
+          </w:tcPr>
+          <w:p>
+            <w:pPr>
+              <w:jc w:val="center"/>
+            </w:pPr>
+            <w:r>
+              <w:rPr>
+                <w:sz w:val="18"/>
+                <w:szCs w:val="18"/>
+              </w:rPr>
+              <w:t xml:space="preserve">15460ms</w:t>
             </w:r>
           </w:p>
         </w:tc>
@@ -2000,30 +2000,30 @@
                 <w:sz w:val="18"/>
                 <w:szCs w:val="18"/>
               </w:rPr>
-              <w:t xml:space="preserve">20</w:t>
-            </w:r>
-          </w:p>
-        </w:tc>
-        <w:tc>
-          <w:tcPr>
-            <w:shd w:fill="E8F5E9" w:color="E8F5E9" w:val="solid"/>
-            <w:tcMar>
-              <w:top w:type="dxa" w:w="60"/>
-              <w:left w:type="dxa" w:w="80"/>
-              <w:bottom w:type="dxa" w:w="60"/>
-              <w:right w:type="dxa" w:w="80"/>
-            </w:tcMar>
-          </w:tcPr>
-          <w:p>
-            <w:pPr>
-              <w:jc w:val="center"/>
-            </w:pPr>
-            <w:r>
-              <w:rPr>
-                <w:sz w:val="18"/>
-                <w:szCs w:val="18"/>
-              </w:rPr>
-              <w:t xml:space="preserve">0</w:t>
+              <w:t xml:space="preserve">19</w:t>
+            </w:r>
+          </w:p>
+        </w:tc>
+        <w:tc>
+          <w:tcPr>
+            <w:shd w:fill="E8F5E9" w:color="E8F5E9" w:val="solid"/>
+            <w:tcMar>
+              <w:top w:type="dxa" w:w="60"/>
+              <w:left w:type="dxa" w:w="80"/>
+              <w:bottom w:type="dxa" w:w="60"/>
+              <w:right w:type="dxa" w:w="80"/>
+            </w:tcMar>
+          </w:tcPr>
+          <w:p>
+            <w:pPr>
+              <w:jc w:val="center"/>
+            </w:pPr>
+            <w:r>
+              <w:rPr>
+                <w:sz w:val="18"/>
+                <w:szCs w:val="18"/>
+              </w:rPr>
+              <w:t xml:space="preserve">1</w:t>
             </w:r>
           </w:p>
         </w:tc>
@@ -2117,30 +2117,30 @@
                 <w:sz w:val="18"/>
                 <w:szCs w:val="18"/>
               </w:rPr>
-              <w:t xml:space="preserve">100%</w:t>
-            </w:r>
-          </w:p>
-        </w:tc>
-        <w:tc>
-          <w:tcPr>
-            <w:shd w:fill="E8F5E9" w:color="E8F5E9" w:val="solid"/>
-            <w:tcMar>
-              <w:top w:type="dxa" w:w="60"/>
-              <w:left w:type="dxa" w:w="80"/>
-              <w:bottom w:type="dxa" w:w="60"/>
-              <w:right w:type="dxa" w:w="80"/>
-            </w:tcMar>
-          </w:tcPr>
-          <w:p>
-            <w:pPr>
-              <w:jc w:val="center"/>
-            </w:pPr>
-            <w:r>
-              <w:rPr>
-                <w:sz w:val="18"/>
-                <w:szCs w:val="18"/>
-              </w:rPr>
-              <w:t xml:space="preserve">17294ms</w:t>
+              <w:t xml:space="preserve">95%</w:t>
+            </w:r>
+          </w:p>
+        </w:tc>
+        <w:tc>
+          <w:tcPr>
+            <w:shd w:fill="E8F5E9" w:color="E8F5E9" w:val="solid"/>
+            <w:tcMar>
+              <w:top w:type="dxa" w:w="60"/>
+              <w:left w:type="dxa" w:w="80"/>
+              <w:bottom w:type="dxa" w:w="60"/>
+              <w:right w:type="dxa" w:w="80"/>
+            </w:tcMar>
+          </w:tcPr>
+          <w:p>
+            <w:pPr>
+              <w:jc w:val="center"/>
+            </w:pPr>
+            <w:r>
+              <w:rPr>
+                <w:sz w:val="18"/>
+                <w:szCs w:val="18"/>
+              </w:rPr>
+              <w:t xml:space="preserve">16378ms</w:t>
             </w:r>
           </w:p>
         </w:tc>
@@ -2234,53 +2234,53 @@
                 <w:sz w:val="18"/>
                 <w:szCs w:val="18"/>
               </w:rPr>
-              <w:t xml:space="preserve">19</w:t>
-            </w:r>
-          </w:p>
-        </w:tc>
-        <w:tc>
-          <w:tcPr>
-            <w:shd w:fill="E8F5E9" w:color="E8F5E9" w:val="solid"/>
-            <w:tcMar>
-              <w:top w:type="dxa" w:w="60"/>
-              <w:left w:type="dxa" w:w="80"/>
-              <w:bottom w:type="dxa" w:w="60"/>
-              <w:right w:type="dxa" w:w="80"/>
-            </w:tcMar>
-          </w:tcPr>
-          <w:p>
-            <w:pPr>
-              <w:jc w:val="center"/>
-            </w:pPr>
-            <w:r>
-              <w:rPr>
-                <w:sz w:val="18"/>
-                <w:szCs w:val="18"/>
-              </w:rPr>
-              <w:t xml:space="preserve">0</w:t>
-            </w:r>
-          </w:p>
-        </w:tc>
-        <w:tc>
-          <w:tcPr>
-            <w:shd w:fill="E8F5E9" w:color="E8F5E9" w:val="solid"/>
-            <w:tcMar>
-              <w:top w:type="dxa" w:w="60"/>
-              <w:left w:type="dxa" w:w="80"/>
-              <w:bottom w:type="dxa" w:w="60"/>
-              <w:right w:type="dxa" w:w="80"/>
-            </w:tcMar>
-          </w:tcPr>
-          <w:p>
-            <w:pPr>
-              <w:jc w:val="center"/>
-            </w:pPr>
-            <w:r>
-              <w:rPr>
-                <w:sz w:val="18"/>
-                <w:szCs w:val="18"/>
-              </w:rPr>
-              <w:t xml:space="preserve">1</w:t>
+              <w:t xml:space="preserve">16</w:t>
+            </w:r>
+          </w:p>
+        </w:tc>
+        <w:tc>
+          <w:tcPr>
+            <w:shd w:fill="E8F5E9" w:color="E8F5E9" w:val="solid"/>
+            <w:tcMar>
+              <w:top w:type="dxa" w:w="60"/>
+              <w:left w:type="dxa" w:w="80"/>
+              <w:bottom w:type="dxa" w:w="60"/>
+              <w:right w:type="dxa" w:w="80"/>
+            </w:tcMar>
+          </w:tcPr>
+          <w:p>
+            <w:pPr>
+              <w:jc w:val="center"/>
+            </w:pPr>
+            <w:r>
+              <w:rPr>
+                <w:sz w:val="18"/>
+                <w:szCs w:val="18"/>
+              </w:rPr>
+              <w:t xml:space="preserve">2</w:t>
+            </w:r>
+          </w:p>
+        </w:tc>
+        <w:tc>
+          <w:tcPr>
+            <w:shd w:fill="E8F5E9" w:color="E8F5E9" w:val="solid"/>
+            <w:tcMar>
+              <w:top w:type="dxa" w:w="60"/>
+              <w:left w:type="dxa" w:w="80"/>
+              <w:bottom w:type="dxa" w:w="60"/>
+              <w:right w:type="dxa" w:w="80"/>
+            </w:tcMar>
+          </w:tcPr>
+          <w:p>
+            <w:pPr>
+              <w:jc w:val="center"/>
+            </w:pPr>
+            <w:r>
+              <w:rPr>
+                <w:sz w:val="18"/>
+                <w:szCs w:val="18"/>
+              </w:rPr>
+              <w:t xml:space="preserve">2</w:t>
             </w:r>
           </w:p>
         </w:tc>
@@ -2351,30 +2351,30 @@
                 <w:sz w:val="18"/>
                 <w:szCs w:val="18"/>
               </w:rPr>
-              <w:t xml:space="preserve">95%</w:t>
-            </w:r>
-          </w:p>
-        </w:tc>
-        <w:tc>
-          <w:tcPr>
-            <w:shd w:fill="E8F5E9" w:color="E8F5E9" w:val="solid"/>
-            <w:tcMar>
-              <w:top w:type="dxa" w:w="60"/>
-              <w:left w:type="dxa" w:w="80"/>
-              <w:bottom w:type="dxa" w:w="60"/>
-              <w:right w:type="dxa" w:w="80"/>
-            </w:tcMar>
-          </w:tcPr>
-          <w:p>
-            <w:pPr>
-              <w:jc w:val="center"/>
-            </w:pPr>
-            <w:r>
-              <w:rPr>
-                <w:sz w:val="18"/>
-                <w:szCs w:val="18"/>
-              </w:rPr>
-              <w:t xml:space="preserve">21164ms</w:t>
+              <w:t xml:space="preserve">80%</w:t>
+            </w:r>
+          </w:p>
+        </w:tc>
+        <w:tc>
+          <w:tcPr>
+            <w:shd w:fill="E8F5E9" w:color="E8F5E9" w:val="solid"/>
+            <w:tcMar>
+              <w:top w:type="dxa" w:w="60"/>
+              <w:left w:type="dxa" w:w="80"/>
+              <w:bottom w:type="dxa" w:w="60"/>
+              <w:right w:type="dxa" w:w="80"/>
+            </w:tcMar>
+          </w:tcPr>
+          <w:p>
+            <w:pPr>
+              <w:jc w:val="center"/>
+            </w:pPr>
+            <w:r>
+              <w:rPr>
+                <w:sz w:val="18"/>
+                <w:szCs w:val="18"/>
+              </w:rPr>
+              <w:t xml:space="preserve">21698ms</w:t>
             </w:r>
           </w:p>
         </w:tc>
@@ -2468,30 +2468,30 @@
                 <w:sz w:val="18"/>
                 <w:szCs w:val="18"/>
               </w:rPr>
-              <w:t xml:space="preserve">20</w:t>
-            </w:r>
-          </w:p>
-        </w:tc>
-        <w:tc>
-          <w:tcPr>
-            <w:shd w:fill="E8F5E9" w:color="E8F5E9" w:val="solid"/>
-            <w:tcMar>
-              <w:top w:type="dxa" w:w="60"/>
-              <w:left w:type="dxa" w:w="80"/>
-              <w:bottom w:type="dxa" w:w="60"/>
-              <w:right w:type="dxa" w:w="80"/>
-            </w:tcMar>
-          </w:tcPr>
-          <w:p>
-            <w:pPr>
-              <w:jc w:val="center"/>
-            </w:pPr>
-            <w:r>
-              <w:rPr>
-                <w:sz w:val="18"/>
-                <w:szCs w:val="18"/>
-              </w:rPr>
-              <w:t xml:space="preserve">0</w:t>
+              <w:t xml:space="preserve">19</w:t>
+            </w:r>
+          </w:p>
+        </w:tc>
+        <w:tc>
+          <w:tcPr>
+            <w:shd w:fill="E8F5E9" w:color="E8F5E9" w:val="solid"/>
+            <w:tcMar>
+              <w:top w:type="dxa" w:w="60"/>
+              <w:left w:type="dxa" w:w="80"/>
+              <w:bottom w:type="dxa" w:w="60"/>
+              <w:right w:type="dxa" w:w="80"/>
+            </w:tcMar>
+          </w:tcPr>
+          <w:p>
+            <w:pPr>
+              <w:jc w:val="center"/>
+            </w:pPr>
+            <w:r>
+              <w:rPr>
+                <w:sz w:val="18"/>
+                <w:szCs w:val="18"/>
+              </w:rPr>
+              <w:t xml:space="preserve">1</w:t>
             </w:r>
           </w:p>
         </w:tc>
@@ -2585,30 +2585,30 @@
                 <w:sz w:val="18"/>
                 <w:szCs w:val="18"/>
               </w:rPr>
-              <w:t xml:space="preserve">100%</w:t>
-            </w:r>
-          </w:p>
-        </w:tc>
-        <w:tc>
-          <w:tcPr>
-            <w:shd w:fill="E8F5E9" w:color="E8F5E9" w:val="solid"/>
-            <w:tcMar>
-              <w:top w:type="dxa" w:w="60"/>
-              <w:left w:type="dxa" w:w="80"/>
-              <w:bottom w:type="dxa" w:w="60"/>
-              <w:right w:type="dxa" w:w="80"/>
-            </w:tcMar>
-          </w:tcPr>
-          <w:p>
-            <w:pPr>
-              <w:jc w:val="center"/>
-            </w:pPr>
-            <w:r>
-              <w:rPr>
-                <w:sz w:val="18"/>
-                <w:szCs w:val="18"/>
-              </w:rPr>
-              <w:t xml:space="preserve">18089ms</w:t>
+              <w:t xml:space="preserve">95%</w:t>
+            </w:r>
+          </w:p>
+        </w:tc>
+        <w:tc>
+          <w:tcPr>
+            <w:shd w:fill="E8F5E9" w:color="E8F5E9" w:val="solid"/>
+            <w:tcMar>
+              <w:top w:type="dxa" w:w="60"/>
+              <w:left w:type="dxa" w:w="80"/>
+              <w:bottom w:type="dxa" w:w="60"/>
+              <w:right w:type="dxa" w:w="80"/>
+            </w:tcMar>
+          </w:tcPr>
+          <w:p>
+            <w:pPr>
+              <w:jc w:val="center"/>
+            </w:pPr>
+            <w:r>
+              <w:rPr>
+                <w:sz w:val="18"/>
+                <w:szCs w:val="18"/>
+              </w:rPr>
+              <w:t xml:space="preserve">20126ms</w:t>
             </w:r>
           </w:p>
         </w:tc>
@@ -2702,30 +2702,7 @@
                 <w:sz w:val="18"/>
                 <w:szCs w:val="18"/>
               </w:rPr>
-              <w:t xml:space="preserve">19</w:t>
-            </w:r>
-          </w:p>
-        </w:tc>
-        <w:tc>
-          <w:tcPr>
-            <w:shd w:fill="E8F5E9" w:color="E8F5E9" w:val="solid"/>
-            <w:tcMar>
-              <w:top w:type="dxa" w:w="60"/>
-              <w:left w:type="dxa" w:w="80"/>
-              <w:bottom w:type="dxa" w:w="60"/>
-              <w:right w:type="dxa" w:w="80"/>
-            </w:tcMar>
-          </w:tcPr>
-          <w:p>
-            <w:pPr>
-              <w:jc w:val="center"/>
-            </w:pPr>
-            <w:r>
-              <w:rPr>
-                <w:sz w:val="18"/>
-                <w:szCs w:val="18"/>
-              </w:rPr>
-              <w:t xml:space="preserve">0</w:t>
+              <w:t xml:space="preserve">17</w:t>
             </w:r>
           </w:p>
         </w:tc>
@@ -2749,6 +2726,29 @@
                 <w:szCs w:val="18"/>
               </w:rPr>
               <w:t xml:space="preserve">1</w:t>
+            </w:r>
+          </w:p>
+        </w:tc>
+        <w:tc>
+          <w:tcPr>
+            <w:shd w:fill="E8F5E9" w:color="E8F5E9" w:val="solid"/>
+            <w:tcMar>
+              <w:top w:type="dxa" w:w="60"/>
+              <w:left w:type="dxa" w:w="80"/>
+              <w:bottom w:type="dxa" w:w="60"/>
+              <w:right w:type="dxa" w:w="80"/>
+            </w:tcMar>
+          </w:tcPr>
+          <w:p>
+            <w:pPr>
+              <w:jc w:val="center"/>
+            </w:pPr>
+            <w:r>
+              <w:rPr>
+                <w:sz w:val="18"/>
+                <w:szCs w:val="18"/>
+              </w:rPr>
+              <w:t xml:space="preserve">2</w:t>
             </w:r>
           </w:p>
         </w:tc>
@@ -2819,30 +2819,30 @@
                 <w:sz w:val="18"/>
                 <w:szCs w:val="18"/>
               </w:rPr>
-              <w:t xml:space="preserve">95%</w:t>
-            </w:r>
-          </w:p>
-        </w:tc>
-        <w:tc>
-          <w:tcPr>
-            <w:shd w:fill="E8F5E9" w:color="E8F5E9" w:val="solid"/>
-            <w:tcMar>
-              <w:top w:type="dxa" w:w="60"/>
-              <w:left w:type="dxa" w:w="80"/>
-              <w:bottom w:type="dxa" w:w="60"/>
-              <w:right w:type="dxa" w:w="80"/>
-            </w:tcMar>
-          </w:tcPr>
-          <w:p>
-            <w:pPr>
-              <w:jc w:val="center"/>
-            </w:pPr>
-            <w:r>
-              <w:rPr>
-                <w:sz w:val="18"/>
-                <w:szCs w:val="18"/>
-              </w:rPr>
-              <w:t xml:space="preserve">17248ms</w:t>
+              <w:t xml:space="preserve">85%</w:t>
+            </w:r>
+          </w:p>
+        </w:tc>
+        <w:tc>
+          <w:tcPr>
+            <w:shd w:fill="E8F5E9" w:color="E8F5E9" w:val="solid"/>
+            <w:tcMar>
+              <w:top w:type="dxa" w:w="60"/>
+              <w:left w:type="dxa" w:w="80"/>
+              <w:bottom w:type="dxa" w:w="60"/>
+              <w:right w:type="dxa" w:w="80"/>
+            </w:tcMar>
+          </w:tcPr>
+          <w:p>
+            <w:pPr>
+              <w:jc w:val="center"/>
+            </w:pPr>
+            <w:r>
+              <w:rPr>
+                <w:sz w:val="18"/>
+                <w:szCs w:val="18"/>
+              </w:rPr>
+              <w:t xml:space="preserve">16837ms</w:t>
             </w:r>
           </w:p>
         </w:tc>
@@ -2936,30 +2936,30 @@
                 <w:sz w:val="18"/>
                 <w:szCs w:val="18"/>
               </w:rPr>
-              <w:t xml:space="preserve">15</w:t>
-            </w:r>
-          </w:p>
-        </w:tc>
-        <w:tc>
-          <w:tcPr>
-            <w:shd w:fill="E8F5E9" w:color="E8F5E9" w:val="solid"/>
-            <w:tcMar>
-              <w:top w:type="dxa" w:w="60"/>
-              <w:left w:type="dxa" w:w="80"/>
-              <w:bottom w:type="dxa" w:w="60"/>
-              <w:right w:type="dxa" w:w="80"/>
-            </w:tcMar>
-          </w:tcPr>
-          <w:p>
-            <w:pPr>
-              <w:jc w:val="center"/>
-            </w:pPr>
-            <w:r>
-              <w:rPr>
-                <w:sz w:val="18"/>
-                <w:szCs w:val="18"/>
-              </w:rPr>
-              <w:t xml:space="preserve">5</w:t>
+              <w:t xml:space="preserve">17</w:t>
+            </w:r>
+          </w:p>
+        </w:tc>
+        <w:tc>
+          <w:tcPr>
+            <w:shd w:fill="E8F5E9" w:color="E8F5E9" w:val="solid"/>
+            <w:tcMar>
+              <w:top w:type="dxa" w:w="60"/>
+              <w:left w:type="dxa" w:w="80"/>
+              <w:bottom w:type="dxa" w:w="60"/>
+              <w:right w:type="dxa" w:w="80"/>
+            </w:tcMar>
+          </w:tcPr>
+          <w:p>
+            <w:pPr>
+              <w:jc w:val="center"/>
+            </w:pPr>
+            <w:r>
+              <w:rPr>
+                <w:sz w:val="18"/>
+                <w:szCs w:val="18"/>
+              </w:rPr>
+              <w:t xml:space="preserve">3</w:t>
             </w:r>
           </w:p>
         </w:tc>
@@ -3053,30 +3053,30 @@
                 <w:sz w:val="18"/>
                 <w:szCs w:val="18"/>
               </w:rPr>
-              <w:t xml:space="preserve">75%</w:t>
-            </w:r>
-          </w:p>
-        </w:tc>
-        <w:tc>
-          <w:tcPr>
-            <w:shd w:fill="E8F5E9" w:color="E8F5E9" w:val="solid"/>
-            <w:tcMar>
-              <w:top w:type="dxa" w:w="60"/>
-              <w:left w:type="dxa" w:w="80"/>
-              <w:bottom w:type="dxa" w:w="60"/>
-              <w:right w:type="dxa" w:w="80"/>
-            </w:tcMar>
-          </w:tcPr>
-          <w:p>
-            <w:pPr>
-              <w:jc w:val="center"/>
-            </w:pPr>
-            <w:r>
-              <w:rPr>
-                <w:sz w:val="18"/>
-                <w:szCs w:val="18"/>
-              </w:rPr>
-              <w:t xml:space="preserve">20421ms</w:t>
+              <w:t xml:space="preserve">85%</w:t>
+            </w:r>
+          </w:p>
+        </w:tc>
+        <w:tc>
+          <w:tcPr>
+            <w:shd w:fill="E8F5E9" w:color="E8F5E9" w:val="solid"/>
+            <w:tcMar>
+              <w:top w:type="dxa" w:w="60"/>
+              <w:left w:type="dxa" w:w="80"/>
+              <w:bottom w:type="dxa" w:w="60"/>
+              <w:right w:type="dxa" w:w="80"/>
+            </w:tcMar>
+          </w:tcPr>
+          <w:p>
+            <w:pPr>
+              <w:jc w:val="center"/>
+            </w:pPr>
+            <w:r>
+              <w:rPr>
+                <w:sz w:val="18"/>
+                <w:szCs w:val="18"/>
+              </w:rPr>
+              <w:t xml:space="preserve">20266ms</w:t>
             </w:r>
           </w:p>
         </w:tc>
@@ -3147,53 +3147,53 @@
                 <w:sz w:val="18"/>
                 <w:szCs w:val="18"/>
               </w:rPr>
-              <w:t xml:space="preserve">0</w:t>
-            </w:r>
-          </w:p>
-        </w:tc>
-        <w:tc>
-          <w:tcPr>
-            <w:shd w:fill="E8F5E9" w:color="E8F5E9" w:val="solid"/>
-            <w:tcMar>
-              <w:top w:type="dxa" w:w="60"/>
-              <w:left w:type="dxa" w:w="80"/>
-              <w:bottom w:type="dxa" w:w="60"/>
-              <w:right w:type="dxa" w:w="80"/>
-            </w:tcMar>
-          </w:tcPr>
-          <w:p>
-            <w:pPr>
-              <w:jc w:val="center"/>
-            </w:pPr>
-            <w:r>
-              <w:rPr>
-                <w:sz w:val="18"/>
-                <w:szCs w:val="18"/>
-              </w:rPr>
-              <w:t xml:space="preserve">20</w:t>
-            </w:r>
-          </w:p>
-        </w:tc>
-        <w:tc>
-          <w:tcPr>
-            <w:shd w:fill="E8F5E9" w:color="E8F5E9" w:val="solid"/>
-            <w:tcMar>
-              <w:top w:type="dxa" w:w="60"/>
-              <w:left w:type="dxa" w:w="80"/>
-              <w:bottom w:type="dxa" w:w="60"/>
-              <w:right w:type="dxa" w:w="80"/>
-            </w:tcMar>
-          </w:tcPr>
-          <w:p>
-            <w:pPr>
-              <w:jc w:val="center"/>
-            </w:pPr>
-            <w:r>
-              <w:rPr>
-                <w:sz w:val="18"/>
-                <w:szCs w:val="18"/>
-              </w:rPr>
-              <w:t xml:space="preserve">0</w:t>
+              <w:t xml:space="preserve">1</w:t>
+            </w:r>
+          </w:p>
+        </w:tc>
+        <w:tc>
+          <w:tcPr>
+            <w:shd w:fill="E8F5E9" w:color="E8F5E9" w:val="solid"/>
+            <w:tcMar>
+              <w:top w:type="dxa" w:w="60"/>
+              <w:left w:type="dxa" w:w="80"/>
+              <w:bottom w:type="dxa" w:w="60"/>
+              <w:right w:type="dxa" w:w="80"/>
+            </w:tcMar>
+          </w:tcPr>
+          <w:p>
+            <w:pPr>
+              <w:jc w:val="center"/>
+            </w:pPr>
+            <w:r>
+              <w:rPr>
+                <w:sz w:val="18"/>
+                <w:szCs w:val="18"/>
+              </w:rPr>
+              <w:t xml:space="preserve">17</w:t>
+            </w:r>
+          </w:p>
+        </w:tc>
+        <w:tc>
+          <w:tcPr>
+            <w:shd w:fill="E8F5E9" w:color="E8F5E9" w:val="solid"/>
+            <w:tcMar>
+              <w:top w:type="dxa" w:w="60"/>
+              <w:left w:type="dxa" w:w="80"/>
+              <w:bottom w:type="dxa" w:w="60"/>
+              <w:right w:type="dxa" w:w="80"/>
+            </w:tcMar>
+          </w:tcPr>
+          <w:p>
+            <w:pPr>
+              <w:jc w:val="center"/>
+            </w:pPr>
+            <w:r>
+              <w:rPr>
+                <w:sz w:val="18"/>
+                <w:szCs w:val="18"/>
+              </w:rPr>
+              <w:t xml:space="preserve">2</w:t>
             </w:r>
           </w:p>
         </w:tc>
@@ -3287,30 +3287,30 @@
                 <w:sz w:val="18"/>
                 <w:szCs w:val="18"/>
               </w:rPr>
-              <w:t xml:space="preserve">100%</w:t>
-            </w:r>
-          </w:p>
-        </w:tc>
-        <w:tc>
-          <w:tcPr>
-            <w:shd w:fill="E8F5E9" w:color="E8F5E9" w:val="solid"/>
-            <w:tcMar>
-              <w:top w:type="dxa" w:w="60"/>
-              <w:left w:type="dxa" w:w="80"/>
-              <w:bottom w:type="dxa" w:w="60"/>
-              <w:right w:type="dxa" w:w="80"/>
-            </w:tcMar>
-          </w:tcPr>
-          <w:p>
-            <w:pPr>
-              <w:jc w:val="center"/>
-            </w:pPr>
-            <w:r>
-              <w:rPr>
-                <w:sz w:val="18"/>
-                <w:szCs w:val="18"/>
-              </w:rPr>
-              <w:t xml:space="preserve">15744ms</w:t>
+              <w:t xml:space="preserve">90%</w:t>
+            </w:r>
+          </w:p>
+        </w:tc>
+        <w:tc>
+          <w:tcPr>
+            <w:shd w:fill="E8F5E9" w:color="E8F5E9" w:val="solid"/>
+            <w:tcMar>
+              <w:top w:type="dxa" w:w="60"/>
+              <w:left w:type="dxa" w:w="80"/>
+              <w:bottom w:type="dxa" w:w="60"/>
+              <w:right w:type="dxa" w:w="80"/>
+            </w:tcMar>
+          </w:tcPr>
+          <w:p>
+            <w:pPr>
+              <w:jc w:val="center"/>
+            </w:pPr>
+            <w:r>
+              <w:rPr>
+                <w:sz w:val="18"/>
+                <w:szCs w:val="18"/>
+              </w:rPr>
+              <w:t xml:space="preserve">16543ms</w:t>
             </w:r>
           </w:p>
         </w:tc>
@@ -3404,30 +3404,30 @@
                 <w:sz w:val="18"/>
                 <w:szCs w:val="18"/>
               </w:rPr>
-              <w:t xml:space="preserve">16</w:t>
-            </w:r>
-          </w:p>
-        </w:tc>
-        <w:tc>
-          <w:tcPr>
-            <w:shd w:fill="E8F5E9" w:color="E8F5E9" w:val="solid"/>
-            <w:tcMar>
-              <w:top w:type="dxa" w:w="60"/>
-              <w:left w:type="dxa" w:w="80"/>
-              <w:bottom w:type="dxa" w:w="60"/>
-              <w:right w:type="dxa" w:w="80"/>
-            </w:tcMar>
-          </w:tcPr>
-          <w:p>
-            <w:pPr>
-              <w:jc w:val="center"/>
-            </w:pPr>
-            <w:r>
-              <w:rPr>
-                <w:sz w:val="18"/>
-                <w:szCs w:val="18"/>
-              </w:rPr>
-              <w:t xml:space="preserve">2</w:t>
+              <w:t xml:space="preserve">18</w:t>
+            </w:r>
+          </w:p>
+        </w:tc>
+        <w:tc>
+          <w:tcPr>
+            <w:shd w:fill="E8F5E9" w:color="E8F5E9" w:val="solid"/>
+            <w:tcMar>
+              <w:top w:type="dxa" w:w="60"/>
+              <w:left w:type="dxa" w:w="80"/>
+              <w:bottom w:type="dxa" w:w="60"/>
+              <w:right w:type="dxa" w:w="80"/>
+            </w:tcMar>
+          </w:tcPr>
+          <w:p>
+            <w:pPr>
+              <w:jc w:val="center"/>
+            </w:pPr>
+            <w:r>
+              <w:rPr>
+                <w:sz w:val="18"/>
+                <w:szCs w:val="18"/>
+              </w:rPr>
+              <w:t xml:space="preserve">0</w:t>
             </w:r>
           </w:p>
         </w:tc>
@@ -3521,30 +3521,30 @@
                 <w:sz w:val="18"/>
                 <w:szCs w:val="18"/>
               </w:rPr>
-              <w:t xml:space="preserve">80%</w:t>
-            </w:r>
-          </w:p>
-        </w:tc>
-        <w:tc>
-          <w:tcPr>
-            <w:shd w:fill="E8F5E9" w:color="E8F5E9" w:val="solid"/>
-            <w:tcMar>
-              <w:top w:type="dxa" w:w="60"/>
-              <w:left w:type="dxa" w:w="80"/>
-              <w:bottom w:type="dxa" w:w="60"/>
-              <w:right w:type="dxa" w:w="80"/>
-            </w:tcMar>
-          </w:tcPr>
-          <w:p>
-            <w:pPr>
-              <w:jc w:val="center"/>
-            </w:pPr>
-            <w:r>
-              <w:rPr>
-                <w:sz w:val="18"/>
-                <w:szCs w:val="18"/>
-              </w:rPr>
-              <w:t xml:space="preserve">13932ms</w:t>
+              <w:t xml:space="preserve">90%</w:t>
+            </w:r>
+          </w:p>
+        </w:tc>
+        <w:tc>
+          <w:tcPr>
+            <w:shd w:fill="E8F5E9" w:color="E8F5E9" w:val="solid"/>
+            <w:tcMar>
+              <w:top w:type="dxa" w:w="60"/>
+              <w:left w:type="dxa" w:w="80"/>
+              <w:bottom w:type="dxa" w:w="60"/>
+              <w:right w:type="dxa" w:w="80"/>
+            </w:tcMar>
+          </w:tcPr>
+          <w:p>
+            <w:pPr>
+              <w:jc w:val="center"/>
+            </w:pPr>
+            <w:r>
+              <w:rPr>
+                <w:sz w:val="18"/>
+                <w:szCs w:val="18"/>
+              </w:rPr>
+              <w:t xml:space="preserve">13662ms</w:t>
             </w:r>
           </w:p>
         </w:tc>
@@ -3778,7 +3778,7 @@
                 <w:sz w:val="18"/>
                 <w:szCs w:val="18"/>
               </w:rPr>
-              <w:t xml:space="preserve">15926ms</w:t>
+              <w:t xml:space="preserve">15294ms</w:t>
             </w:r>
           </w:p>
         </w:tc>
@@ -3872,30 +3872,30 @@
                 <w:sz w:val="18"/>
                 <w:szCs w:val="18"/>
               </w:rPr>
-              <w:t xml:space="preserve">19</w:t>
-            </w:r>
-          </w:p>
-        </w:tc>
-        <w:tc>
-          <w:tcPr>
-            <w:shd w:fill="E8F5E9" w:color="E8F5E9" w:val="solid"/>
-            <w:tcMar>
-              <w:top w:type="dxa" w:w="60"/>
-              <w:left w:type="dxa" w:w="80"/>
-              <w:bottom w:type="dxa" w:w="60"/>
-              <w:right w:type="dxa" w:w="80"/>
-            </w:tcMar>
-          </w:tcPr>
-          <w:p>
-            <w:pPr>
-              <w:jc w:val="center"/>
-            </w:pPr>
-            <w:r>
-              <w:rPr>
-                <w:sz w:val="18"/>
-                <w:szCs w:val="18"/>
-              </w:rPr>
-              <w:t xml:space="preserve">1</w:t>
+              <w:t xml:space="preserve">17</w:t>
+            </w:r>
+          </w:p>
+        </w:tc>
+        <w:tc>
+          <w:tcPr>
+            <w:shd w:fill="E8F5E9" w:color="E8F5E9" w:val="solid"/>
+            <w:tcMar>
+              <w:top w:type="dxa" w:w="60"/>
+              <w:left w:type="dxa" w:w="80"/>
+              <w:bottom w:type="dxa" w:w="60"/>
+              <w:right w:type="dxa" w:w="80"/>
+            </w:tcMar>
+          </w:tcPr>
+          <w:p>
+            <w:pPr>
+              <w:jc w:val="center"/>
+            </w:pPr>
+            <w:r>
+              <w:rPr>
+                <w:sz w:val="18"/>
+                <w:szCs w:val="18"/>
+              </w:rPr>
+              <w:t xml:space="preserve">3</w:t>
             </w:r>
           </w:p>
         </w:tc>
@@ -3989,30 +3989,30 @@
                 <w:sz w:val="18"/>
                 <w:szCs w:val="18"/>
               </w:rPr>
-              <w:t xml:space="preserve">95%</w:t>
-            </w:r>
-          </w:p>
-        </w:tc>
-        <w:tc>
-          <w:tcPr>
-            <w:shd w:fill="E8F5E9" w:color="E8F5E9" w:val="solid"/>
-            <w:tcMar>
-              <w:top w:type="dxa" w:w="60"/>
-              <w:left w:type="dxa" w:w="80"/>
-              <w:bottom w:type="dxa" w:w="60"/>
-              <w:right w:type="dxa" w:w="80"/>
-            </w:tcMar>
-          </w:tcPr>
-          <w:p>
-            <w:pPr>
-              <w:jc w:val="center"/>
-            </w:pPr>
-            <w:r>
-              <w:rPr>
-                <w:sz w:val="18"/>
-                <w:szCs w:val="18"/>
-              </w:rPr>
-              <w:t xml:space="preserve">14799ms</w:t>
+              <w:t xml:space="preserve">85%</w:t>
+            </w:r>
+          </w:p>
+        </w:tc>
+        <w:tc>
+          <w:tcPr>
+            <w:shd w:fill="E8F5E9" w:color="E8F5E9" w:val="solid"/>
+            <w:tcMar>
+              <w:top w:type="dxa" w:w="60"/>
+              <w:left w:type="dxa" w:w="80"/>
+              <w:bottom w:type="dxa" w:w="60"/>
+              <w:right w:type="dxa" w:w="80"/>
+            </w:tcMar>
+          </w:tcPr>
+          <w:p>
+            <w:pPr>
+              <w:jc w:val="center"/>
+            </w:pPr>
+            <w:r>
+              <w:rPr>
+                <w:sz w:val="18"/>
+                <w:szCs w:val="18"/>
+              </w:rPr>
+              <w:t xml:space="preserve">14832ms</w:t>
             </w:r>
           </w:p>
         </w:tc>
@@ -4106,30 +4106,30 @@
                 <w:sz w:val="18"/>
                 <w:szCs w:val="18"/>
               </w:rPr>
-              <w:t xml:space="preserve">19</w:t>
-            </w:r>
-          </w:p>
-        </w:tc>
-        <w:tc>
-          <w:tcPr>
-            <w:shd w:fill="E8F5E9" w:color="E8F5E9" w:val="solid"/>
-            <w:tcMar>
-              <w:top w:type="dxa" w:w="60"/>
-              <w:left w:type="dxa" w:w="80"/>
-              <w:bottom w:type="dxa" w:w="60"/>
-              <w:right w:type="dxa" w:w="80"/>
-            </w:tcMar>
-          </w:tcPr>
-          <w:p>
-            <w:pPr>
-              <w:jc w:val="center"/>
-            </w:pPr>
-            <w:r>
-              <w:rPr>
-                <w:sz w:val="18"/>
-                <w:szCs w:val="18"/>
-              </w:rPr>
-              <w:t xml:space="preserve">1</w:t>
+              <w:t xml:space="preserve">20</w:t>
+            </w:r>
+          </w:p>
+        </w:tc>
+        <w:tc>
+          <w:tcPr>
+            <w:shd w:fill="E8F5E9" w:color="E8F5E9" w:val="solid"/>
+            <w:tcMar>
+              <w:top w:type="dxa" w:w="60"/>
+              <w:left w:type="dxa" w:w="80"/>
+              <w:bottom w:type="dxa" w:w="60"/>
+              <w:right w:type="dxa" w:w="80"/>
+            </w:tcMar>
+          </w:tcPr>
+          <w:p>
+            <w:pPr>
+              <w:jc w:val="center"/>
+            </w:pPr>
+            <w:r>
+              <w:rPr>
+                <w:sz w:val="18"/>
+                <w:szCs w:val="18"/>
+              </w:rPr>
+              <w:t xml:space="preserve">0</w:t>
             </w:r>
           </w:p>
         </w:tc>
@@ -4223,30 +4223,30 @@
                 <w:sz w:val="18"/>
                 <w:szCs w:val="18"/>
               </w:rPr>
-              <w:t xml:space="preserve">95%</w:t>
-            </w:r>
-          </w:p>
-        </w:tc>
-        <w:tc>
-          <w:tcPr>
-            <w:shd w:fill="E8F5E9" w:color="E8F5E9" w:val="solid"/>
-            <w:tcMar>
-              <w:top w:type="dxa" w:w="60"/>
-              <w:left w:type="dxa" w:w="80"/>
-              <w:bottom w:type="dxa" w:w="60"/>
-              <w:right w:type="dxa" w:w="80"/>
-            </w:tcMar>
-          </w:tcPr>
-          <w:p>
-            <w:pPr>
-              <w:jc w:val="center"/>
-            </w:pPr>
-            <w:r>
-              <w:rPr>
-                <w:sz w:val="18"/>
-                <w:szCs w:val="18"/>
-              </w:rPr>
-              <w:t xml:space="preserve">17261ms</w:t>
+              <w:t xml:space="preserve">100%</w:t>
+            </w:r>
+          </w:p>
+        </w:tc>
+        <w:tc>
+          <w:tcPr>
+            <w:shd w:fill="E8F5E9" w:color="E8F5E9" w:val="solid"/>
+            <w:tcMar>
+              <w:top w:type="dxa" w:w="60"/>
+              <w:left w:type="dxa" w:w="80"/>
+              <w:bottom w:type="dxa" w:w="60"/>
+              <w:right w:type="dxa" w:w="80"/>
+            </w:tcMar>
+          </w:tcPr>
+          <w:p>
+            <w:pPr>
+              <w:jc w:val="center"/>
+            </w:pPr>
+            <w:r>
+              <w:rPr>
+                <w:sz w:val="18"/>
+                <w:szCs w:val="18"/>
+              </w:rPr>
+              <w:t xml:space="preserve">19391ms</w:t>
             </w:r>
           </w:p>
         </w:tc>
@@ -4254,7 +4254,7 @@
       <w:tr>
         <w:tc>
           <w:tcPr>
-            <w:shd w:fill="E8F5E9" w:color="E8F5E9" w:val="solid"/>
+            <w:shd w:fill="FFF9C4" w:color="FFF9C4" w:val="solid"/>
             <w:tcMar>
               <w:top w:type="dxa" w:w="60"/>
               <w:left w:type="dxa" w:w="80"/>
@@ -4277,7 +4277,7 @@
         </w:tc>
         <w:tc>
           <w:tcPr>
-            <w:shd w:fill="E8F5E9" w:color="E8F5E9" w:val="solid"/>
+            <w:shd w:fill="FFF9C4" w:color="FFF9C4" w:val="solid"/>
             <w:tcMar>
               <w:top w:type="dxa" w:w="60"/>
               <w:left w:type="dxa" w:w="80"/>
@@ -4300,145 +4300,145 @@
         </w:tc>
         <w:tc>
           <w:tcPr>
-            <w:shd w:fill="E8F5E9" w:color="E8F5E9" w:val="solid"/>
-            <w:tcMar>
-              <w:top w:type="dxa" w:w="60"/>
-              <w:left w:type="dxa" w:w="80"/>
-              <w:bottom w:type="dxa" w:w="60"/>
-              <w:right w:type="dxa" w:w="80"/>
-            </w:tcMar>
-          </w:tcPr>
-          <w:p>
-            <w:pPr>
-              <w:jc w:val="center"/>
-            </w:pPr>
-            <w:r>
-              <w:rPr>
-                <w:sz w:val="18"/>
-                <w:szCs w:val="18"/>
-              </w:rPr>
-              <w:t xml:space="preserve">0</w:t>
-            </w:r>
-          </w:p>
-        </w:tc>
-        <w:tc>
-          <w:tcPr>
-            <w:shd w:fill="E8F5E9" w:color="E8F5E9" w:val="solid"/>
-            <w:tcMar>
-              <w:top w:type="dxa" w:w="60"/>
-              <w:left w:type="dxa" w:w="80"/>
-              <w:bottom w:type="dxa" w:w="60"/>
-              <w:right w:type="dxa" w:w="80"/>
-            </w:tcMar>
-          </w:tcPr>
-          <w:p>
-            <w:pPr>
-              <w:jc w:val="center"/>
-            </w:pPr>
-            <w:r>
-              <w:rPr>
-                <w:sz w:val="18"/>
-                <w:szCs w:val="18"/>
-              </w:rPr>
-              <w:t xml:space="preserve">15</w:t>
-            </w:r>
-          </w:p>
-        </w:tc>
-        <w:tc>
-          <w:tcPr>
-            <w:shd w:fill="E8F5E9" w:color="E8F5E9" w:val="solid"/>
-            <w:tcMar>
-              <w:top w:type="dxa" w:w="60"/>
-              <w:left w:type="dxa" w:w="80"/>
-              <w:bottom w:type="dxa" w:w="60"/>
-              <w:right w:type="dxa" w:w="80"/>
-            </w:tcMar>
-          </w:tcPr>
-          <w:p>
-            <w:pPr>
-              <w:jc w:val="center"/>
-            </w:pPr>
-            <w:r>
-              <w:rPr>
-                <w:sz w:val="18"/>
-                <w:szCs w:val="18"/>
-              </w:rPr>
-              <w:t xml:space="preserve">5</w:t>
-            </w:r>
-          </w:p>
-        </w:tc>
-        <w:tc>
-          <w:tcPr>
-            <w:shd w:fill="E8F5E9" w:color="E8F5E9" w:val="solid"/>
-            <w:tcMar>
-              <w:top w:type="dxa" w:w="60"/>
-              <w:left w:type="dxa" w:w="80"/>
-              <w:bottom w:type="dxa" w:w="60"/>
-              <w:right w:type="dxa" w:w="80"/>
-            </w:tcMar>
-          </w:tcPr>
-          <w:p>
-            <w:pPr>
-              <w:jc w:val="center"/>
-            </w:pPr>
-            <w:r>
-              <w:rPr>
-                <w:sz w:val="18"/>
-                <w:szCs w:val="18"/>
-              </w:rPr>
-              <w:t xml:space="preserve">0</w:t>
-            </w:r>
-          </w:p>
-        </w:tc>
-        <w:tc>
-          <w:tcPr>
-            <w:shd w:fill="E8F5E9" w:color="E8F5E9" w:val="solid"/>
-            <w:tcMar>
-              <w:top w:type="dxa" w:w="60"/>
-              <w:left w:type="dxa" w:w="80"/>
-              <w:bottom w:type="dxa" w:w="60"/>
-              <w:right w:type="dxa" w:w="80"/>
-            </w:tcMar>
-          </w:tcPr>
-          <w:p>
-            <w:pPr>
-              <w:jc w:val="center"/>
-            </w:pPr>
-            <w:r>
-              <w:rPr>
-                <w:sz w:val="18"/>
-                <w:szCs w:val="18"/>
-              </w:rPr>
-              <w:t xml:space="preserve">0</w:t>
-            </w:r>
-          </w:p>
-        </w:tc>
-        <w:tc>
-          <w:tcPr>
-            <w:shd w:fill="E8F5E9" w:color="E8F5E9" w:val="solid"/>
-            <w:tcMar>
-              <w:top w:type="dxa" w:w="60"/>
-              <w:left w:type="dxa" w:w="80"/>
-              <w:bottom w:type="dxa" w:w="60"/>
-              <w:right w:type="dxa" w:w="80"/>
-            </w:tcMar>
-          </w:tcPr>
-          <w:p>
-            <w:pPr>
-              <w:jc w:val="center"/>
-            </w:pPr>
-            <w:r>
-              <w:rPr>
-                <w:sz w:val="18"/>
-                <w:szCs w:val="18"/>
-              </w:rPr>
-              <w:t xml:space="preserve">0</w:t>
-            </w:r>
-          </w:p>
-        </w:tc>
-        <w:tc>
-          <w:tcPr>
-            <w:shd w:fill="E8F5E9" w:color="E8F5E9" w:val="solid"/>
+            <w:shd w:fill="FFF9C4" w:color="FFF9C4" w:val="solid"/>
+            <w:tcMar>
+              <w:top w:type="dxa" w:w="60"/>
+              <w:left w:type="dxa" w:w="80"/>
+              <w:bottom w:type="dxa" w:w="60"/>
+              <w:right w:type="dxa" w:w="80"/>
+            </w:tcMar>
+          </w:tcPr>
+          <w:p>
+            <w:pPr>
+              <w:jc w:val="center"/>
+            </w:pPr>
+            <w:r>
+              <w:rPr>
+                <w:sz w:val="18"/>
+                <w:szCs w:val="18"/>
+              </w:rPr>
+              <w:t xml:space="preserve">0</w:t>
+            </w:r>
+          </w:p>
+        </w:tc>
+        <w:tc>
+          <w:tcPr>
+            <w:shd w:fill="FFF9C4" w:color="FFF9C4" w:val="solid"/>
+            <w:tcMar>
+              <w:top w:type="dxa" w:w="60"/>
+              <w:left w:type="dxa" w:w="80"/>
+              <w:bottom w:type="dxa" w:w="60"/>
+              <w:right w:type="dxa" w:w="80"/>
+            </w:tcMar>
+          </w:tcPr>
+          <w:p>
+            <w:pPr>
+              <w:jc w:val="center"/>
+            </w:pPr>
+            <w:r>
+              <w:rPr>
+                <w:sz w:val="18"/>
+                <w:szCs w:val="18"/>
+              </w:rPr>
+              <w:t xml:space="preserve">12</w:t>
+            </w:r>
+          </w:p>
+        </w:tc>
+        <w:tc>
+          <w:tcPr>
+            <w:shd w:fill="FFF9C4" w:color="FFF9C4" w:val="solid"/>
+            <w:tcMar>
+              <w:top w:type="dxa" w:w="60"/>
+              <w:left w:type="dxa" w:w="80"/>
+              <w:bottom w:type="dxa" w:w="60"/>
+              <w:right w:type="dxa" w:w="80"/>
+            </w:tcMar>
+          </w:tcPr>
+          <w:p>
+            <w:pPr>
+              <w:jc w:val="center"/>
+            </w:pPr>
+            <w:r>
+              <w:rPr>
+                <w:sz w:val="18"/>
+                <w:szCs w:val="18"/>
+              </w:rPr>
+              <w:t xml:space="preserve">7</w:t>
+            </w:r>
+          </w:p>
+        </w:tc>
+        <w:tc>
+          <w:tcPr>
+            <w:shd w:fill="FFF9C4" w:color="FFF9C4" w:val="solid"/>
+            <w:tcMar>
+              <w:top w:type="dxa" w:w="60"/>
+              <w:left w:type="dxa" w:w="80"/>
+              <w:bottom w:type="dxa" w:w="60"/>
+              <w:right w:type="dxa" w:w="80"/>
+            </w:tcMar>
+          </w:tcPr>
+          <w:p>
+            <w:pPr>
+              <w:jc w:val="center"/>
+            </w:pPr>
+            <w:r>
+              <w:rPr>
+                <w:sz w:val="18"/>
+                <w:szCs w:val="18"/>
+              </w:rPr>
+              <w:t xml:space="preserve">1</w:t>
+            </w:r>
+          </w:p>
+        </w:tc>
+        <w:tc>
+          <w:tcPr>
+            <w:shd w:fill="FFF9C4" w:color="FFF9C4" w:val="solid"/>
+            <w:tcMar>
+              <w:top w:type="dxa" w:w="60"/>
+              <w:left w:type="dxa" w:w="80"/>
+              <w:bottom w:type="dxa" w:w="60"/>
+              <w:right w:type="dxa" w:w="80"/>
+            </w:tcMar>
+          </w:tcPr>
+          <w:p>
+            <w:pPr>
+              <w:jc w:val="center"/>
+            </w:pPr>
+            <w:r>
+              <w:rPr>
+                <w:sz w:val="18"/>
+                <w:szCs w:val="18"/>
+              </w:rPr>
+              <w:t xml:space="preserve">0</w:t>
+            </w:r>
+          </w:p>
+        </w:tc>
+        <w:tc>
+          <w:tcPr>
+            <w:shd w:fill="FFF9C4" w:color="FFF9C4" w:val="solid"/>
+            <w:tcMar>
+              <w:top w:type="dxa" w:w="60"/>
+              <w:left w:type="dxa" w:w="80"/>
+              <w:bottom w:type="dxa" w:w="60"/>
+              <w:right w:type="dxa" w:w="80"/>
+            </w:tcMar>
+          </w:tcPr>
+          <w:p>
+            <w:pPr>
+              <w:jc w:val="center"/>
+            </w:pPr>
+            <w:r>
+              <w:rPr>
+                <w:sz w:val="18"/>
+                <w:szCs w:val="18"/>
+              </w:rPr>
+              <w:t xml:space="preserve">0</w:t>
+            </w:r>
+          </w:p>
+        </w:tc>
+        <w:tc>
+          <w:tcPr>
+            <w:shd w:fill="FFF9C4" w:color="FFF9C4" w:val="solid"/>
             <w:tcMar>
               <w:top w:type="dxa" w:w="60"/>
               <w:left w:type="dxa" w:w="80"/>
@@ -4457,30 +4457,30 @@
                 <w:sz w:val="18"/>
                 <w:szCs w:val="18"/>
               </w:rPr>
-              <w:t xml:space="preserve">75%</w:t>
-            </w:r>
-          </w:p>
-        </w:tc>
-        <w:tc>
-          <w:tcPr>
-            <w:shd w:fill="E8F5E9" w:color="E8F5E9" w:val="solid"/>
-            <w:tcMar>
-              <w:top w:type="dxa" w:w="60"/>
-              <w:left w:type="dxa" w:w="80"/>
-              <w:bottom w:type="dxa" w:w="60"/>
-              <w:right w:type="dxa" w:w="80"/>
-            </w:tcMar>
-          </w:tcPr>
-          <w:p>
-            <w:pPr>
-              <w:jc w:val="center"/>
-            </w:pPr>
-            <w:r>
-              <w:rPr>
-                <w:sz w:val="18"/>
-                <w:szCs w:val="18"/>
-              </w:rPr>
-              <w:t xml:space="preserve">32799ms</w:t>
+              <w:t xml:space="preserve">60%</w:t>
+            </w:r>
+          </w:p>
+        </w:tc>
+        <w:tc>
+          <w:tcPr>
+            <w:shd w:fill="FFF9C4" w:color="FFF9C4" w:val="solid"/>
+            <w:tcMar>
+              <w:top w:type="dxa" w:w="60"/>
+              <w:left w:type="dxa" w:w="80"/>
+              <w:bottom w:type="dxa" w:w="60"/>
+              <w:right w:type="dxa" w:w="80"/>
+            </w:tcMar>
+          </w:tcPr>
+          <w:p>
+            <w:pPr>
+              <w:jc w:val="center"/>
+            </w:pPr>
+            <w:r>
+              <w:rPr>
+                <w:sz w:val="18"/>
+                <w:szCs w:val="18"/>
+              </w:rPr>
+              <w:t xml:space="preserve">31163ms</w:t>
             </w:r>
           </w:p>
         </w:tc>
@@ -4574,30 +4574,30 @@
                 <w:sz w:val="18"/>
                 <w:szCs w:val="18"/>
               </w:rPr>
-              <w:t xml:space="preserve">20</w:t>
-            </w:r>
-          </w:p>
-        </w:tc>
-        <w:tc>
-          <w:tcPr>
-            <w:shd w:fill="E8F5E9" w:color="E8F5E9" w:val="solid"/>
-            <w:tcMar>
-              <w:top w:type="dxa" w:w="60"/>
-              <w:left w:type="dxa" w:w="80"/>
-              <w:bottom w:type="dxa" w:w="60"/>
-              <w:right w:type="dxa" w:w="80"/>
-            </w:tcMar>
-          </w:tcPr>
-          <w:p>
-            <w:pPr>
-              <w:jc w:val="center"/>
-            </w:pPr>
-            <w:r>
-              <w:rPr>
-                <w:sz w:val="18"/>
-                <w:szCs w:val="18"/>
-              </w:rPr>
-              <w:t xml:space="preserve">0</w:t>
+              <w:t xml:space="preserve">19</w:t>
+            </w:r>
+          </w:p>
+        </w:tc>
+        <w:tc>
+          <w:tcPr>
+            <w:shd w:fill="E8F5E9" w:color="E8F5E9" w:val="solid"/>
+            <w:tcMar>
+              <w:top w:type="dxa" w:w="60"/>
+              <w:left w:type="dxa" w:w="80"/>
+              <w:bottom w:type="dxa" w:w="60"/>
+              <w:right w:type="dxa" w:w="80"/>
+            </w:tcMar>
+          </w:tcPr>
+          <w:p>
+            <w:pPr>
+              <w:jc w:val="center"/>
+            </w:pPr>
+            <w:r>
+              <w:rPr>
+                <w:sz w:val="18"/>
+                <w:szCs w:val="18"/>
+              </w:rPr>
+              <w:t xml:space="preserve">1</w:t>
             </w:r>
           </w:p>
         </w:tc>
@@ -4691,30 +4691,30 @@
                 <w:sz w:val="18"/>
                 <w:szCs w:val="18"/>
               </w:rPr>
-              <w:t xml:space="preserve">100%</w:t>
-            </w:r>
-          </w:p>
-        </w:tc>
-        <w:tc>
-          <w:tcPr>
-            <w:shd w:fill="E8F5E9" w:color="E8F5E9" w:val="solid"/>
-            <w:tcMar>
-              <w:top w:type="dxa" w:w="60"/>
-              <w:left w:type="dxa" w:w="80"/>
-              <w:bottom w:type="dxa" w:w="60"/>
-              <w:right w:type="dxa" w:w="80"/>
-            </w:tcMar>
-          </w:tcPr>
-          <w:p>
-            <w:pPr>
-              <w:jc w:val="center"/>
-            </w:pPr>
-            <w:r>
-              <w:rPr>
-                <w:sz w:val="18"/>
-                <w:szCs w:val="18"/>
-              </w:rPr>
-              <w:t xml:space="preserve">17147ms</w:t>
+              <w:t xml:space="preserve">95%</w:t>
+            </w:r>
+          </w:p>
+        </w:tc>
+        <w:tc>
+          <w:tcPr>
+            <w:shd w:fill="E8F5E9" w:color="E8F5E9" w:val="solid"/>
+            <w:tcMar>
+              <w:top w:type="dxa" w:w="60"/>
+              <w:left w:type="dxa" w:w="80"/>
+              <w:bottom w:type="dxa" w:w="60"/>
+              <w:right w:type="dxa" w:w="80"/>
+            </w:tcMar>
+          </w:tcPr>
+          <w:p>
+            <w:pPr>
+              <w:jc w:val="center"/>
+            </w:pPr>
+            <w:r>
+              <w:rPr>
+                <w:sz w:val="18"/>
+                <w:szCs w:val="18"/>
+              </w:rPr>
+              <w:t xml:space="preserve">18290ms</w:t>
             </w:r>
           </w:p>
         </w:tc>
@@ -4808,30 +4808,30 @@
                 <w:sz w:val="18"/>
                 <w:szCs w:val="18"/>
               </w:rPr>
-              <w:t xml:space="preserve">19</w:t>
-            </w:r>
-          </w:p>
-        </w:tc>
-        <w:tc>
-          <w:tcPr>
-            <w:shd w:fill="E8F5E9" w:color="E8F5E9" w:val="solid"/>
-            <w:tcMar>
-              <w:top w:type="dxa" w:w="60"/>
-              <w:left w:type="dxa" w:w="80"/>
-              <w:bottom w:type="dxa" w:w="60"/>
-              <w:right w:type="dxa" w:w="80"/>
-            </w:tcMar>
-          </w:tcPr>
-          <w:p>
-            <w:pPr>
-              <w:jc w:val="center"/>
-            </w:pPr>
-            <w:r>
-              <w:rPr>
-                <w:sz w:val="18"/>
-                <w:szCs w:val="18"/>
-              </w:rPr>
-              <w:t xml:space="preserve">1</w:t>
+              <w:t xml:space="preserve">18</w:t>
+            </w:r>
+          </w:p>
+        </w:tc>
+        <w:tc>
+          <w:tcPr>
+            <w:shd w:fill="E8F5E9" w:color="E8F5E9" w:val="solid"/>
+            <w:tcMar>
+              <w:top w:type="dxa" w:w="60"/>
+              <w:left w:type="dxa" w:w="80"/>
+              <w:bottom w:type="dxa" w:w="60"/>
+              <w:right w:type="dxa" w:w="80"/>
+            </w:tcMar>
+          </w:tcPr>
+          <w:p>
+            <w:pPr>
+              <w:jc w:val="center"/>
+            </w:pPr>
+            <w:r>
+              <w:rPr>
+                <w:sz w:val="18"/>
+                <w:szCs w:val="18"/>
+              </w:rPr>
+              <w:t xml:space="preserve">2</w:t>
             </w:r>
           </w:p>
         </w:tc>
@@ -4925,30 +4925,30 @@
                 <w:sz w:val="18"/>
                 <w:szCs w:val="18"/>
               </w:rPr>
-              <w:t xml:space="preserve">95%</w:t>
-            </w:r>
-          </w:p>
-        </w:tc>
-        <w:tc>
-          <w:tcPr>
-            <w:shd w:fill="E8F5E9" w:color="E8F5E9" w:val="solid"/>
-            <w:tcMar>
-              <w:top w:type="dxa" w:w="60"/>
-              <w:left w:type="dxa" w:w="80"/>
-              <w:bottom w:type="dxa" w:w="60"/>
-              <w:right w:type="dxa" w:w="80"/>
-            </w:tcMar>
-          </w:tcPr>
-          <w:p>
-            <w:pPr>
-              <w:jc w:val="center"/>
-            </w:pPr>
-            <w:r>
-              <w:rPr>
-                <w:sz w:val="18"/>
-                <w:szCs w:val="18"/>
-              </w:rPr>
-              <w:t xml:space="preserve">18857ms</w:t>
+              <w:t xml:space="preserve">90%</w:t>
+            </w:r>
+          </w:p>
+        </w:tc>
+        <w:tc>
+          <w:tcPr>
+            <w:shd w:fill="E8F5E9" w:color="E8F5E9" w:val="solid"/>
+            <w:tcMar>
+              <w:top w:type="dxa" w:w="60"/>
+              <w:left w:type="dxa" w:w="80"/>
+              <w:bottom w:type="dxa" w:w="60"/>
+              <w:right w:type="dxa" w:w="80"/>
+            </w:tcMar>
+          </w:tcPr>
+          <w:p>
+            <w:pPr>
+              <w:jc w:val="center"/>
+            </w:pPr>
+            <w:r>
+              <w:rPr>
+                <w:sz w:val="18"/>
+                <w:szCs w:val="18"/>
+              </w:rPr>
+              <w:t xml:space="preserve">20187ms</w:t>
             </w:r>
           </w:p>
         </w:tc>
@@ -5042,30 +5042,30 @@
                 <w:sz w:val="18"/>
                 <w:szCs w:val="18"/>
               </w:rPr>
-              <w:t xml:space="preserve">19</w:t>
-            </w:r>
-          </w:p>
-        </w:tc>
-        <w:tc>
-          <w:tcPr>
-            <w:shd w:fill="E8F5E9" w:color="E8F5E9" w:val="solid"/>
-            <w:tcMar>
-              <w:top w:type="dxa" w:w="60"/>
-              <w:left w:type="dxa" w:w="80"/>
-              <w:bottom w:type="dxa" w:w="60"/>
-              <w:right w:type="dxa" w:w="80"/>
-            </w:tcMar>
-          </w:tcPr>
-          <w:p>
-            <w:pPr>
-              <w:jc w:val="center"/>
-            </w:pPr>
-            <w:r>
-              <w:rPr>
-                <w:sz w:val="18"/>
-                <w:szCs w:val="18"/>
-              </w:rPr>
-              <w:t xml:space="preserve">0</w:t>
+              <w:t xml:space="preserve">18</w:t>
+            </w:r>
+          </w:p>
+        </w:tc>
+        <w:tc>
+          <w:tcPr>
+            <w:shd w:fill="E8F5E9" w:color="E8F5E9" w:val="solid"/>
+            <w:tcMar>
+              <w:top w:type="dxa" w:w="60"/>
+              <w:left w:type="dxa" w:w="80"/>
+              <w:bottom w:type="dxa" w:w="60"/>
+              <w:right w:type="dxa" w:w="80"/>
+            </w:tcMar>
+          </w:tcPr>
+          <w:p>
+            <w:pPr>
+              <w:jc w:val="center"/>
+            </w:pPr>
+            <w:r>
+              <w:rPr>
+                <w:sz w:val="18"/>
+                <w:szCs w:val="18"/>
+              </w:rPr>
+              <w:t xml:space="preserve">1</w:t>
             </w:r>
           </w:p>
         </w:tc>
@@ -5159,30 +5159,30 @@
                 <w:sz w:val="18"/>
                 <w:szCs w:val="18"/>
               </w:rPr>
-              <w:t xml:space="preserve">100%</w:t>
-            </w:r>
-          </w:p>
-        </w:tc>
-        <w:tc>
-          <w:tcPr>
-            <w:shd w:fill="E8F5E9" w:color="E8F5E9" w:val="solid"/>
-            <w:tcMar>
-              <w:top w:type="dxa" w:w="60"/>
-              <w:left w:type="dxa" w:w="80"/>
-              <w:bottom w:type="dxa" w:w="60"/>
-              <w:right w:type="dxa" w:w="80"/>
-            </w:tcMar>
-          </w:tcPr>
-          <w:p>
-            <w:pPr>
-              <w:jc w:val="center"/>
-            </w:pPr>
-            <w:r>
-              <w:rPr>
-                <w:sz w:val="18"/>
-                <w:szCs w:val="18"/>
-              </w:rPr>
-              <w:t xml:space="preserve">17577ms</w:t>
+              <w:t xml:space="preserve">95%</w:t>
+            </w:r>
+          </w:p>
+        </w:tc>
+        <w:tc>
+          <w:tcPr>
+            <w:shd w:fill="E8F5E9" w:color="E8F5E9" w:val="solid"/>
+            <w:tcMar>
+              <w:top w:type="dxa" w:w="60"/>
+              <w:left w:type="dxa" w:w="80"/>
+              <w:bottom w:type="dxa" w:w="60"/>
+              <w:right w:type="dxa" w:w="80"/>
+            </w:tcMar>
+          </w:tcPr>
+          <w:p>
+            <w:pPr>
+              <w:jc w:val="center"/>
+            </w:pPr>
+            <w:r>
+              <w:rPr>
+                <w:sz w:val="18"/>
+                <w:szCs w:val="18"/>
+              </w:rPr>
+              <w:t xml:space="preserve">18073ms</w:t>
             </w:r>
           </w:p>
         </w:tc>
@@ -5259,7 +5259,7 @@
                 <w:sz w:val="18"/>
                 <w:szCs w:val="18"/>
               </w:rPr>
-              <w:t xml:space="preserve">1</w:t>
+              <w:t xml:space="preserve">2</w:t>
             </w:r>
           </w:p>
         </w:tc>
@@ -5284,7 +5284,7 @@
                 <w:sz w:val="18"/>
                 <w:szCs w:val="18"/>
               </w:rPr>
-              <w:t xml:space="preserve">372</w:t>
+              <w:t xml:space="preserve">357</w:t>
             </w:r>
           </w:p>
         </w:tc>
@@ -5309,7 +5309,7 @@
                 <w:sz w:val="18"/>
                 <w:szCs w:val="18"/>
               </w:rPr>
-              <w:t xml:space="preserve">20</w:t>
+              <w:t xml:space="preserve">32</w:t>
             </w:r>
           </w:p>
         </w:tc>
@@ -5334,7 +5334,7 @@
                 <w:sz w:val="18"/>
                 <w:szCs w:val="18"/>
               </w:rPr>
-              <w:t xml:space="preserve">4</w:t>
+              <w:t xml:space="preserve">7</w:t>
             </w:r>
           </w:p>
         </w:tc>
@@ -5384,7 +5384,7 @@
                 <w:sz w:val="18"/>
                 <w:szCs w:val="18"/>
               </w:rPr>
-              <w:t xml:space="preserve">1</w:t>
+              <w:t xml:space="preserve">0</w:t>
             </w:r>
           </w:p>
         </w:tc>
@@ -5409,7 +5409,7 @@
                 <w:sz w:val="18"/>
                 <w:szCs w:val="18"/>
               </w:rPr>
-              <w:t xml:space="preserve">93%</w:t>
+              <w:t xml:space="preserve">90%</w:t>
             </w:r>
           </w:p>
         </w:tc>
@@ -5434,7 +5434,7 @@
                 <w:sz w:val="18"/>
                 <w:szCs w:val="18"/>
               </w:rPr>
-              <w:t xml:space="preserve">18300ms</w:t>
+              <w:t xml:space="preserve">18608ms</w:t>
             </w:r>
           </w:p>
         </w:tc>
@@ -5464,6 +5464,30 @@
           <w:sz w:val="18"/>
           <w:szCs w:val="18"/>
         </w:rPr>
+        <w:t xml:space="preserve">[2] Fontanería — VACIO: </w:t>
+      </w:r>
+      <w:r>
+        <w:rPr>
+          <w:sz w:val="18"/>
+          <w:szCs w:val="18"/>
+        </w:rPr>
+        <w:t xml:space="preserve">Cambio de bañera por plato de ducha en baño principal de 90x90 con mamparas</w:t>
+      </w:r>
+      <w:r>
+        <w:t xml:space="preserve"/>
+      </w:r>
+    </w:p>
+    <w:p>
+      <w:pPr>
+        <w:spacing w:after="60"/>
+      </w:pPr>
+      <w:r>
+        <w:rPr>
+          <w:b/>
+          <w:bCs/>
+          <w:sz w:val="18"/>
+          <w:szCs w:val="18"/>
+        </w:rPr>
         <w:t xml:space="preserve">[7] Fontanería — VACIO: </w:t>
       </w:r>
       <w:r>
@@ -5512,22 +5536,17 @@
           <w:sz w:val="18"/>
           <w:szCs w:val="18"/>
         </w:rPr>
-        <w:t xml:space="preserve">[109] Climatización — PRECIO_INVALIDO: </w:t>
+        <w:t xml:space="preserve">[229] Energía Solar — VACIO: </w:t>
       </w:r>
       <w:r>
         <w:rPr>
           <w:sz w:val="18"/>
           <w:szCs w:val="18"/>
         </w:rPr>
-        <w:t xml:space="preserve">Mantenimiento anual de caldera de gas, limpieza quemador, revisión electrodos y </w:t>
-      </w:r>
-      <w:r>
-        <w:rPr>
-          <w:color w:val="CC0000"/>
-          <w:sz w:val="18"/>
-          <w:szCs w:val="18"/>
-        </w:rPr>
-        <w:t xml:space="preserve"> (Partida de catálogo con precio 0 o nulo)</w:t>
+        <w:t xml:space="preserve">Instalar cargador de coche eléctrico alimentado por energía solar con gestión in</w:t>
+      </w:r>
+      <w:r>
+        <w:t xml:space="preserve"/>
       </w:r>
     </w:p>
     <w:p>
@@ -5634,6 +5653,30 @@
           <w:szCs w:val="18"/>
         </w:rPr>
         <w:t xml:space="preserve"> (Tu plan actual no permite generar contratos de mantenimiento. Actualiza al Plan Empresa+ para acceder a este módulo.)</w:t>
+      </w:r>
+    </w:p>
+    <w:p>
+      <w:pPr>
+        <w:spacing w:after="60"/>
+      </w:pPr>
+      <w:r>
+        <w:rPr>
+          <w:b/>
+          <w:bCs/>
+          <w:sz w:val="18"/>
+          <w:szCs w:val="18"/>
+        </w:rPr>
+        <w:t xml:space="preserve">[364] Reformas Integrales — VACIO: </w:t>
+      </w:r>
+      <w:r>
+        <w:rPr>
+          <w:sz w:val="18"/>
+          <w:szCs w:val="18"/>
+        </w:rPr>
+        <w:t xml:space="preserve">Convertir local comercial en vivienda de 60 metros cuadrados con licencia de cam</w:t>
+      </w:r>
+      <w:r>
+        <w:t xml:space="preserve"/>
       </w:r>
     </w:p>
     <w:p>
@@ -5661,7 +5704,7 @@
         <w:t xml:space="preserve">Tasa OK ≥ 70%: </w:t>
       </w:r>
       <w:r>
-        <w:t xml:space="preserve">✅ CUMPLE (93%)</w:t>
+        <w:t xml:space="preserve">✅ CUMPLE (90%)</w:t>
       </w:r>
     </w:p>
     <w:p>
@@ -5691,7 +5734,7 @@
         <w:t xml:space="preserve">Latencia media ≤ 10 000ms: </w:t>
       </w:r>
       <w:r>
-        <w:t xml:space="preserve">❌ NO CUMPLE (18300ms)</w:t>
+        <w:t xml:space="preserve">❌ NO CUMPLE (18608ms)</w:t>
       </w:r>
     </w:p>
     <w:p>

</xml_diff>

<commit_message>
checkpoint before v58 origen/precio_origen fix
</commit_message>
<xml_diff>
--- a/scripts/test-motor-ia/output/test_summary.docx
+++ b/scripts/test-motor-ia/output/test_summary.docx
@@ -22,7 +22,7 @@
         <w:t xml:space="preserve">Fecha de ejecución: </w:t>
       </w:r>
       <w:r>
-        <w:t xml:space="preserve">1/7/2026, 23:02:32</w:t>
+        <w:t xml:space="preserve">2/7/2026, 21:00:39</w:t>
       </w:r>
       <w:r>
         <w:rPr>
@@ -55,7 +55,7 @@
         <w:t xml:space="preserve">Tasa de éxito (OK_CATALOGO + OK_MIXTO): </w:t>
       </w:r>
       <w:r>
-        <w:t xml:space="preserve">359 / 400 (90%)</w:t>
+        <w:t xml:space="preserve">369 / 400 (92%)</w:t>
       </w:r>
     </w:p>
     <w:p>
@@ -70,7 +70,7 @@
         <w:t xml:space="preserve">Tasa de error (VACÍO + ERROR_TECNICO + P.INV): </w:t>
       </w:r>
       <w:r>
-        <w:t xml:space="preserve">9 / 400 (2%)</w:t>
+        <w:t xml:space="preserve">4 / 400 (1%)</w:t>
       </w:r>
     </w:p>
     <w:p>
@@ -85,7 +85,7 @@
         <w:t xml:space="preserve">Coincidencia de oficio detectado: </w:t>
       </w:r>
       <w:r>
-        <w:t xml:space="preserve">290 / 400 (73%)</w:t>
+        <w:t xml:space="preserve">295 / 400 (74%)</w:t>
       </w:r>
     </w:p>
     <w:p>
@@ -100,7 +100,7 @@
         <w:t xml:space="preserve">Latencia media: </w:t>
       </w:r>
       <w:r>
-        <w:t xml:space="preserve">18608ms   </w:t>
+        <w:t xml:space="preserve">17918ms   </w:t>
       </w:r>
       <w:r>
         <w:rPr>
@@ -110,7 +110,7 @@
         <w:t xml:space="preserve">P95: </w:t>
       </w:r>
       <w:r>
-        <w:t xml:space="preserve">30103ms</w:t>
+        <w:t xml:space="preserve">28545ms</w:t>
       </w:r>
     </w:p>
     <w:p>
@@ -152,7 +152,7 @@
         <w:t xml:space="preserve">  • OK_MIXTO: </w:t>
       </w:r>
       <w:r>
-        <w:t xml:space="preserve">357 (89%)</w:t>
+        <w:t xml:space="preserve">367 (92%)</w:t>
       </w:r>
     </w:p>
     <w:p>
@@ -167,7 +167,7 @@
         <w:t xml:space="preserve">  • SOLO_SUGERIDAS: </w:t>
       </w:r>
       <w:r>
-        <w:t xml:space="preserve">32 (8%)</w:t>
+        <w:t xml:space="preserve">27 (7%)</w:t>
       </w:r>
     </w:p>
     <w:p>
@@ -182,7 +182,7 @@
         <w:t xml:space="preserve">  • VACIO: </w:t>
       </w:r>
       <w:r>
-        <w:t xml:space="preserve">7 (2%)</w:t>
+        <w:t xml:space="preserve">2 (1%)</w:t>
       </w:r>
     </w:p>
     <w:p>
@@ -736,7 +736,7 @@
                 <w:sz w:val="18"/>
                 <w:szCs w:val="18"/>
               </w:rPr>
-              <w:t xml:space="preserve">19363ms</w:t>
+              <w:t xml:space="preserve">19284ms</w:t>
             </w:r>
           </w:p>
         </w:tc>
@@ -830,30 +830,30 @@
                 <w:sz w:val="18"/>
                 <w:szCs w:val="18"/>
               </w:rPr>
-              <w:t xml:space="preserve">18</w:t>
-            </w:r>
-          </w:p>
-        </w:tc>
-        <w:tc>
-          <w:tcPr>
-            <w:shd w:fill="E8F5E9" w:color="E8F5E9" w:val="solid"/>
-            <w:tcMar>
-              <w:top w:type="dxa" w:w="60"/>
-              <w:left w:type="dxa" w:w="80"/>
-              <w:bottom w:type="dxa" w:w="60"/>
-              <w:right w:type="dxa" w:w="80"/>
-            </w:tcMar>
-          </w:tcPr>
-          <w:p>
-            <w:pPr>
-              <w:jc w:val="center"/>
-            </w:pPr>
-            <w:r>
-              <w:rPr>
-                <w:sz w:val="18"/>
-                <w:szCs w:val="18"/>
-              </w:rPr>
-              <w:t xml:space="preserve">2</w:t>
+              <w:t xml:space="preserve">19</w:t>
+            </w:r>
+          </w:p>
+        </w:tc>
+        <w:tc>
+          <w:tcPr>
+            <w:shd w:fill="E8F5E9" w:color="E8F5E9" w:val="solid"/>
+            <w:tcMar>
+              <w:top w:type="dxa" w:w="60"/>
+              <w:left w:type="dxa" w:w="80"/>
+              <w:bottom w:type="dxa" w:w="60"/>
+              <w:right w:type="dxa" w:w="80"/>
+            </w:tcMar>
+          </w:tcPr>
+          <w:p>
+            <w:pPr>
+              <w:jc w:val="center"/>
+            </w:pPr>
+            <w:r>
+              <w:rPr>
+                <w:sz w:val="18"/>
+                <w:szCs w:val="18"/>
+              </w:rPr>
+              <w:t xml:space="preserve">1</w:t>
             </w:r>
           </w:p>
         </w:tc>
@@ -947,30 +947,30 @@
                 <w:sz w:val="18"/>
                 <w:szCs w:val="18"/>
               </w:rPr>
-              <w:t xml:space="preserve">90%</w:t>
-            </w:r>
-          </w:p>
-        </w:tc>
-        <w:tc>
-          <w:tcPr>
-            <w:shd w:fill="E8F5E9" w:color="E8F5E9" w:val="solid"/>
-            <w:tcMar>
-              <w:top w:type="dxa" w:w="60"/>
-              <w:left w:type="dxa" w:w="80"/>
-              <w:bottom w:type="dxa" w:w="60"/>
-              <w:right w:type="dxa" w:w="80"/>
-            </w:tcMar>
-          </w:tcPr>
-          <w:p>
-            <w:pPr>
-              <w:jc w:val="center"/>
-            </w:pPr>
-            <w:r>
-              <w:rPr>
-                <w:sz w:val="18"/>
-                <w:szCs w:val="18"/>
-              </w:rPr>
-              <w:t xml:space="preserve">16648ms</w:t>
+              <w:t xml:space="preserve">95%</w:t>
+            </w:r>
+          </w:p>
+        </w:tc>
+        <w:tc>
+          <w:tcPr>
+            <w:shd w:fill="E8F5E9" w:color="E8F5E9" w:val="solid"/>
+            <w:tcMar>
+              <w:top w:type="dxa" w:w="60"/>
+              <w:left w:type="dxa" w:w="80"/>
+              <w:bottom w:type="dxa" w:w="60"/>
+              <w:right w:type="dxa" w:w="80"/>
+            </w:tcMar>
+          </w:tcPr>
+          <w:p>
+            <w:pPr>
+              <w:jc w:val="center"/>
+            </w:pPr>
+            <w:r>
+              <w:rPr>
+                <w:sz w:val="18"/>
+                <w:szCs w:val="18"/>
+              </w:rPr>
+              <w:t xml:space="preserve">15879ms</w:t>
             </w:r>
           </w:p>
         </w:tc>
@@ -1204,7 +1204,7 @@
                 <w:sz w:val="18"/>
                 <w:szCs w:val="18"/>
               </w:rPr>
-              <w:t xml:space="preserve">15024ms</w:t>
+              <w:t xml:space="preserve">13705ms</w:t>
             </w:r>
           </w:p>
         </w:tc>
@@ -1321,30 +1321,30 @@
                 <w:sz w:val="18"/>
                 <w:szCs w:val="18"/>
               </w:rPr>
-              <w:t xml:space="preserve">0</w:t>
-            </w:r>
-          </w:p>
-        </w:tc>
-        <w:tc>
-          <w:tcPr>
-            <w:shd w:fill="E8F5E9" w:color="E8F5E9" w:val="solid"/>
-            <w:tcMar>
-              <w:top w:type="dxa" w:w="60"/>
-              <w:left w:type="dxa" w:w="80"/>
-              <w:bottom w:type="dxa" w:w="60"/>
-              <w:right w:type="dxa" w:w="80"/>
-            </w:tcMar>
-          </w:tcPr>
-          <w:p>
-            <w:pPr>
-              <w:jc w:val="center"/>
-            </w:pPr>
-            <w:r>
-              <w:rPr>
-                <w:sz w:val="18"/>
-                <w:szCs w:val="18"/>
-              </w:rPr>
               <w:t xml:space="preserve">1</w:t>
+            </w:r>
+          </w:p>
+        </w:tc>
+        <w:tc>
+          <w:tcPr>
+            <w:shd w:fill="E8F5E9" w:color="E8F5E9" w:val="solid"/>
+            <w:tcMar>
+              <w:top w:type="dxa" w:w="60"/>
+              <w:left w:type="dxa" w:w="80"/>
+              <w:bottom w:type="dxa" w:w="60"/>
+              <w:right w:type="dxa" w:w="80"/>
+            </w:tcMar>
+          </w:tcPr>
+          <w:p>
+            <w:pPr>
+              <w:jc w:val="center"/>
+            </w:pPr>
+            <w:r>
+              <w:rPr>
+                <w:sz w:val="18"/>
+                <w:szCs w:val="18"/>
+              </w:rPr>
+              <w:t xml:space="preserve">0</w:t>
             </w:r>
           </w:p>
         </w:tc>
@@ -1438,7 +1438,7 @@
                 <w:sz w:val="18"/>
                 <w:szCs w:val="18"/>
               </w:rPr>
-              <w:t xml:space="preserve">21546ms</w:t>
+              <w:t xml:space="preserve">20142ms</w:t>
             </w:r>
           </w:p>
         </w:tc>
@@ -1532,53 +1532,53 @@
                 <w:sz w:val="18"/>
                 <w:szCs w:val="18"/>
               </w:rPr>
-              <w:t xml:space="preserve">15</w:t>
-            </w:r>
-          </w:p>
-        </w:tc>
-        <w:tc>
-          <w:tcPr>
-            <w:shd w:fill="E8F5E9" w:color="E8F5E9" w:val="solid"/>
-            <w:tcMar>
-              <w:top w:type="dxa" w:w="60"/>
-              <w:left w:type="dxa" w:w="80"/>
-              <w:bottom w:type="dxa" w:w="60"/>
-              <w:right w:type="dxa" w:w="80"/>
-            </w:tcMar>
-          </w:tcPr>
-          <w:p>
-            <w:pPr>
-              <w:jc w:val="center"/>
-            </w:pPr>
-            <w:r>
-              <w:rPr>
-                <w:sz w:val="18"/>
-                <w:szCs w:val="18"/>
-              </w:rPr>
-              <w:t xml:space="preserve">4</w:t>
-            </w:r>
-          </w:p>
-        </w:tc>
-        <w:tc>
-          <w:tcPr>
-            <w:shd w:fill="E8F5E9" w:color="E8F5E9" w:val="solid"/>
-            <w:tcMar>
-              <w:top w:type="dxa" w:w="60"/>
-              <w:left w:type="dxa" w:w="80"/>
-              <w:bottom w:type="dxa" w:w="60"/>
-              <w:right w:type="dxa" w:w="80"/>
-            </w:tcMar>
-          </w:tcPr>
-          <w:p>
-            <w:pPr>
-              <w:jc w:val="center"/>
-            </w:pPr>
-            <w:r>
-              <w:rPr>
-                <w:sz w:val="18"/>
-                <w:szCs w:val="18"/>
-              </w:rPr>
-              <w:t xml:space="preserve">1</w:t>
+              <w:t xml:space="preserve">18</w:t>
+            </w:r>
+          </w:p>
+        </w:tc>
+        <w:tc>
+          <w:tcPr>
+            <w:shd w:fill="E8F5E9" w:color="E8F5E9" w:val="solid"/>
+            <w:tcMar>
+              <w:top w:type="dxa" w:w="60"/>
+              <w:left w:type="dxa" w:w="80"/>
+              <w:bottom w:type="dxa" w:w="60"/>
+              <w:right w:type="dxa" w:w="80"/>
+            </w:tcMar>
+          </w:tcPr>
+          <w:p>
+            <w:pPr>
+              <w:jc w:val="center"/>
+            </w:pPr>
+            <w:r>
+              <w:rPr>
+                <w:sz w:val="18"/>
+                <w:szCs w:val="18"/>
+              </w:rPr>
+              <w:t xml:space="preserve">2</w:t>
+            </w:r>
+          </w:p>
+        </w:tc>
+        <w:tc>
+          <w:tcPr>
+            <w:shd w:fill="E8F5E9" w:color="E8F5E9" w:val="solid"/>
+            <w:tcMar>
+              <w:top w:type="dxa" w:w="60"/>
+              <w:left w:type="dxa" w:w="80"/>
+              <w:bottom w:type="dxa" w:w="60"/>
+              <w:right w:type="dxa" w:w="80"/>
+            </w:tcMar>
+          </w:tcPr>
+          <w:p>
+            <w:pPr>
+              <w:jc w:val="center"/>
+            </w:pPr>
+            <w:r>
+              <w:rPr>
+                <w:sz w:val="18"/>
+                <w:szCs w:val="18"/>
+              </w:rPr>
+              <w:t xml:space="preserve">0</w:t>
             </w:r>
           </w:p>
         </w:tc>
@@ -1649,30 +1649,30 @@
                 <w:sz w:val="18"/>
                 <w:szCs w:val="18"/>
               </w:rPr>
-              <w:t xml:space="preserve">75%</w:t>
-            </w:r>
-          </w:p>
-        </w:tc>
-        <w:tc>
-          <w:tcPr>
-            <w:shd w:fill="E8F5E9" w:color="E8F5E9" w:val="solid"/>
-            <w:tcMar>
-              <w:top w:type="dxa" w:w="60"/>
-              <w:left w:type="dxa" w:w="80"/>
-              <w:bottom w:type="dxa" w:w="60"/>
-              <w:right w:type="dxa" w:w="80"/>
-            </w:tcMar>
-          </w:tcPr>
-          <w:p>
-            <w:pPr>
-              <w:jc w:val="center"/>
-            </w:pPr>
-            <w:r>
-              <w:rPr>
-                <w:sz w:val="18"/>
-                <w:szCs w:val="18"/>
-              </w:rPr>
-              <w:t xml:space="preserve">21372ms</w:t>
+              <w:t xml:space="preserve">90%</w:t>
+            </w:r>
+          </w:p>
+        </w:tc>
+        <w:tc>
+          <w:tcPr>
+            <w:shd w:fill="E8F5E9" w:color="E8F5E9" w:val="solid"/>
+            <w:tcMar>
+              <w:top w:type="dxa" w:w="60"/>
+              <w:left w:type="dxa" w:w="80"/>
+              <w:bottom w:type="dxa" w:w="60"/>
+              <w:right w:type="dxa" w:w="80"/>
+            </w:tcMar>
+          </w:tcPr>
+          <w:p>
+            <w:pPr>
+              <w:jc w:val="center"/>
+            </w:pPr>
+            <w:r>
+              <w:rPr>
+                <w:sz w:val="18"/>
+                <w:szCs w:val="18"/>
+              </w:rPr>
+              <w:t xml:space="preserve">20694ms</w:t>
             </w:r>
           </w:p>
         </w:tc>
@@ -1906,7 +1906,7 @@
                 <w:sz w:val="18"/>
                 <w:szCs w:val="18"/>
               </w:rPr>
-              <w:t xml:space="preserve">15460ms</w:t>
+              <w:t xml:space="preserve">15266ms</w:t>
             </w:r>
           </w:p>
         </w:tc>
@@ -2000,30 +2000,30 @@
                 <w:sz w:val="18"/>
                 <w:szCs w:val="18"/>
               </w:rPr>
-              <w:t xml:space="preserve">19</w:t>
-            </w:r>
-          </w:p>
-        </w:tc>
-        <w:tc>
-          <w:tcPr>
-            <w:shd w:fill="E8F5E9" w:color="E8F5E9" w:val="solid"/>
-            <w:tcMar>
-              <w:top w:type="dxa" w:w="60"/>
-              <w:left w:type="dxa" w:w="80"/>
-              <w:bottom w:type="dxa" w:w="60"/>
-              <w:right w:type="dxa" w:w="80"/>
-            </w:tcMar>
-          </w:tcPr>
-          <w:p>
-            <w:pPr>
-              <w:jc w:val="center"/>
-            </w:pPr>
-            <w:r>
-              <w:rPr>
-                <w:sz w:val="18"/>
-                <w:szCs w:val="18"/>
-              </w:rPr>
-              <w:t xml:space="preserve">1</w:t>
+              <w:t xml:space="preserve">20</w:t>
+            </w:r>
+          </w:p>
+        </w:tc>
+        <w:tc>
+          <w:tcPr>
+            <w:shd w:fill="E8F5E9" w:color="E8F5E9" w:val="solid"/>
+            <w:tcMar>
+              <w:top w:type="dxa" w:w="60"/>
+              <w:left w:type="dxa" w:w="80"/>
+              <w:bottom w:type="dxa" w:w="60"/>
+              <w:right w:type="dxa" w:w="80"/>
+            </w:tcMar>
+          </w:tcPr>
+          <w:p>
+            <w:pPr>
+              <w:jc w:val="center"/>
+            </w:pPr>
+            <w:r>
+              <w:rPr>
+                <w:sz w:val="18"/>
+                <w:szCs w:val="18"/>
+              </w:rPr>
+              <w:t xml:space="preserve">0</w:t>
             </w:r>
           </w:p>
         </w:tc>
@@ -2117,30 +2117,30 @@
                 <w:sz w:val="18"/>
                 <w:szCs w:val="18"/>
               </w:rPr>
-              <w:t xml:space="preserve">95%</w:t>
-            </w:r>
-          </w:p>
-        </w:tc>
-        <w:tc>
-          <w:tcPr>
-            <w:shd w:fill="E8F5E9" w:color="E8F5E9" w:val="solid"/>
-            <w:tcMar>
-              <w:top w:type="dxa" w:w="60"/>
-              <w:left w:type="dxa" w:w="80"/>
-              <w:bottom w:type="dxa" w:w="60"/>
-              <w:right w:type="dxa" w:w="80"/>
-            </w:tcMar>
-          </w:tcPr>
-          <w:p>
-            <w:pPr>
-              <w:jc w:val="center"/>
-            </w:pPr>
-            <w:r>
-              <w:rPr>
-                <w:sz w:val="18"/>
-                <w:szCs w:val="18"/>
-              </w:rPr>
-              <w:t xml:space="preserve">16378ms</w:t>
+              <w:t xml:space="preserve">100%</w:t>
+            </w:r>
+          </w:p>
+        </w:tc>
+        <w:tc>
+          <w:tcPr>
+            <w:shd w:fill="E8F5E9" w:color="E8F5E9" w:val="solid"/>
+            <w:tcMar>
+              <w:top w:type="dxa" w:w="60"/>
+              <w:left w:type="dxa" w:w="80"/>
+              <w:bottom w:type="dxa" w:w="60"/>
+              <w:right w:type="dxa" w:w="80"/>
+            </w:tcMar>
+          </w:tcPr>
+          <w:p>
+            <w:pPr>
+              <w:jc w:val="center"/>
+            </w:pPr>
+            <w:r>
+              <w:rPr>
+                <w:sz w:val="18"/>
+                <w:szCs w:val="18"/>
+              </w:rPr>
+              <w:t xml:space="preserve">16894ms</w:t>
             </w:r>
           </w:p>
         </w:tc>
@@ -2211,7 +2211,7 @@
                 <w:sz w:val="18"/>
                 <w:szCs w:val="18"/>
               </w:rPr>
-              <w:t xml:space="preserve">0</w:t>
+              <w:t xml:space="preserve">1</w:t>
             </w:r>
           </w:p>
         </w:tc>
@@ -2257,7 +2257,7 @@
                 <w:sz w:val="18"/>
                 <w:szCs w:val="18"/>
               </w:rPr>
-              <w:t xml:space="preserve">2</w:t>
+              <w:t xml:space="preserve">1</w:t>
             </w:r>
           </w:p>
         </w:tc>
@@ -2351,30 +2351,30 @@
                 <w:sz w:val="18"/>
                 <w:szCs w:val="18"/>
               </w:rPr>
-              <w:t xml:space="preserve">80%</w:t>
-            </w:r>
-          </w:p>
-        </w:tc>
-        <w:tc>
-          <w:tcPr>
-            <w:shd w:fill="E8F5E9" w:color="E8F5E9" w:val="solid"/>
-            <w:tcMar>
-              <w:top w:type="dxa" w:w="60"/>
-              <w:left w:type="dxa" w:w="80"/>
-              <w:bottom w:type="dxa" w:w="60"/>
-              <w:right w:type="dxa" w:w="80"/>
-            </w:tcMar>
-          </w:tcPr>
-          <w:p>
-            <w:pPr>
-              <w:jc w:val="center"/>
-            </w:pPr>
-            <w:r>
-              <w:rPr>
-                <w:sz w:val="18"/>
-                <w:szCs w:val="18"/>
-              </w:rPr>
-              <w:t xml:space="preserve">21698ms</w:t>
+              <w:t xml:space="preserve">85%</w:t>
+            </w:r>
+          </w:p>
+        </w:tc>
+        <w:tc>
+          <w:tcPr>
+            <w:shd w:fill="E8F5E9" w:color="E8F5E9" w:val="solid"/>
+            <w:tcMar>
+              <w:top w:type="dxa" w:w="60"/>
+              <w:left w:type="dxa" w:w="80"/>
+              <w:bottom w:type="dxa" w:w="60"/>
+              <w:right w:type="dxa" w:w="80"/>
+            </w:tcMar>
+          </w:tcPr>
+          <w:p>
+            <w:pPr>
+              <w:jc w:val="center"/>
+            </w:pPr>
+            <w:r>
+              <w:rPr>
+                <w:sz w:val="18"/>
+                <w:szCs w:val="18"/>
+              </w:rPr>
+              <w:t xml:space="preserve">21066ms</w:t>
             </w:r>
           </w:p>
         </w:tc>
@@ -2468,30 +2468,30 @@
                 <w:sz w:val="18"/>
                 <w:szCs w:val="18"/>
               </w:rPr>
-              <w:t xml:space="preserve">19</w:t>
-            </w:r>
-          </w:p>
-        </w:tc>
-        <w:tc>
-          <w:tcPr>
-            <w:shd w:fill="E8F5E9" w:color="E8F5E9" w:val="solid"/>
-            <w:tcMar>
-              <w:top w:type="dxa" w:w="60"/>
-              <w:left w:type="dxa" w:w="80"/>
-              <w:bottom w:type="dxa" w:w="60"/>
-              <w:right w:type="dxa" w:w="80"/>
-            </w:tcMar>
-          </w:tcPr>
-          <w:p>
-            <w:pPr>
-              <w:jc w:val="center"/>
-            </w:pPr>
-            <w:r>
-              <w:rPr>
-                <w:sz w:val="18"/>
-                <w:szCs w:val="18"/>
-              </w:rPr>
-              <w:t xml:space="preserve">1</w:t>
+              <w:t xml:space="preserve">18</w:t>
+            </w:r>
+          </w:p>
+        </w:tc>
+        <w:tc>
+          <w:tcPr>
+            <w:shd w:fill="E8F5E9" w:color="E8F5E9" w:val="solid"/>
+            <w:tcMar>
+              <w:top w:type="dxa" w:w="60"/>
+              <w:left w:type="dxa" w:w="80"/>
+              <w:bottom w:type="dxa" w:w="60"/>
+              <w:right w:type="dxa" w:w="80"/>
+            </w:tcMar>
+          </w:tcPr>
+          <w:p>
+            <w:pPr>
+              <w:jc w:val="center"/>
+            </w:pPr>
+            <w:r>
+              <w:rPr>
+                <w:sz w:val="18"/>
+                <w:szCs w:val="18"/>
+              </w:rPr>
+              <w:t xml:space="preserve">2</w:t>
             </w:r>
           </w:p>
         </w:tc>
@@ -2585,30 +2585,30 @@
                 <w:sz w:val="18"/>
                 <w:szCs w:val="18"/>
               </w:rPr>
-              <w:t xml:space="preserve">95%</w:t>
-            </w:r>
-          </w:p>
-        </w:tc>
-        <w:tc>
-          <w:tcPr>
-            <w:shd w:fill="E8F5E9" w:color="E8F5E9" w:val="solid"/>
-            <w:tcMar>
-              <w:top w:type="dxa" w:w="60"/>
-              <w:left w:type="dxa" w:w="80"/>
-              <w:bottom w:type="dxa" w:w="60"/>
-              <w:right w:type="dxa" w:w="80"/>
-            </w:tcMar>
-          </w:tcPr>
-          <w:p>
-            <w:pPr>
-              <w:jc w:val="center"/>
-            </w:pPr>
-            <w:r>
-              <w:rPr>
-                <w:sz w:val="18"/>
-                <w:szCs w:val="18"/>
-              </w:rPr>
-              <w:t xml:space="preserve">20126ms</w:t>
+              <w:t xml:space="preserve">90%</w:t>
+            </w:r>
+          </w:p>
+        </w:tc>
+        <w:tc>
+          <w:tcPr>
+            <w:shd w:fill="E8F5E9" w:color="E8F5E9" w:val="solid"/>
+            <w:tcMar>
+              <w:top w:type="dxa" w:w="60"/>
+              <w:left w:type="dxa" w:w="80"/>
+              <w:bottom w:type="dxa" w:w="60"/>
+              <w:right w:type="dxa" w:w="80"/>
+            </w:tcMar>
+          </w:tcPr>
+          <w:p>
+            <w:pPr>
+              <w:jc w:val="center"/>
+            </w:pPr>
+            <w:r>
+              <w:rPr>
+                <w:sz w:val="18"/>
+                <w:szCs w:val="18"/>
+              </w:rPr>
+              <w:t xml:space="preserve">18598ms</w:t>
             </w:r>
           </w:p>
         </w:tc>
@@ -2702,53 +2702,53 @@
                 <w:sz w:val="18"/>
                 <w:szCs w:val="18"/>
               </w:rPr>
-              <w:t xml:space="preserve">17</w:t>
-            </w:r>
-          </w:p>
-        </w:tc>
-        <w:tc>
-          <w:tcPr>
-            <w:shd w:fill="E8F5E9" w:color="E8F5E9" w:val="solid"/>
-            <w:tcMar>
-              <w:top w:type="dxa" w:w="60"/>
-              <w:left w:type="dxa" w:w="80"/>
-              <w:bottom w:type="dxa" w:w="60"/>
-              <w:right w:type="dxa" w:w="80"/>
-            </w:tcMar>
-          </w:tcPr>
-          <w:p>
-            <w:pPr>
-              <w:jc w:val="center"/>
-            </w:pPr>
-            <w:r>
-              <w:rPr>
-                <w:sz w:val="18"/>
-                <w:szCs w:val="18"/>
-              </w:rPr>
-              <w:t xml:space="preserve">1</w:t>
-            </w:r>
-          </w:p>
-        </w:tc>
-        <w:tc>
-          <w:tcPr>
-            <w:shd w:fill="E8F5E9" w:color="E8F5E9" w:val="solid"/>
-            <w:tcMar>
-              <w:top w:type="dxa" w:w="60"/>
-              <w:left w:type="dxa" w:w="80"/>
-              <w:bottom w:type="dxa" w:w="60"/>
-              <w:right w:type="dxa" w:w="80"/>
-            </w:tcMar>
-          </w:tcPr>
-          <w:p>
-            <w:pPr>
-              <w:jc w:val="center"/>
-            </w:pPr>
-            <w:r>
-              <w:rPr>
-                <w:sz w:val="18"/>
-                <w:szCs w:val="18"/>
-              </w:rPr>
-              <w:t xml:space="preserve">2</w:t>
+              <w:t xml:space="preserve">20</w:t>
+            </w:r>
+          </w:p>
+        </w:tc>
+        <w:tc>
+          <w:tcPr>
+            <w:shd w:fill="E8F5E9" w:color="E8F5E9" w:val="solid"/>
+            <w:tcMar>
+              <w:top w:type="dxa" w:w="60"/>
+              <w:left w:type="dxa" w:w="80"/>
+              <w:bottom w:type="dxa" w:w="60"/>
+              <w:right w:type="dxa" w:w="80"/>
+            </w:tcMar>
+          </w:tcPr>
+          <w:p>
+            <w:pPr>
+              <w:jc w:val="center"/>
+            </w:pPr>
+            <w:r>
+              <w:rPr>
+                <w:sz w:val="18"/>
+                <w:szCs w:val="18"/>
+              </w:rPr>
+              <w:t xml:space="preserve">0</w:t>
+            </w:r>
+          </w:p>
+        </w:tc>
+        <w:tc>
+          <w:tcPr>
+            <w:shd w:fill="E8F5E9" w:color="E8F5E9" w:val="solid"/>
+            <w:tcMar>
+              <w:top w:type="dxa" w:w="60"/>
+              <w:left w:type="dxa" w:w="80"/>
+              <w:bottom w:type="dxa" w:w="60"/>
+              <w:right w:type="dxa" w:w="80"/>
+            </w:tcMar>
+          </w:tcPr>
+          <w:p>
+            <w:pPr>
+              <w:jc w:val="center"/>
+            </w:pPr>
+            <w:r>
+              <w:rPr>
+                <w:sz w:val="18"/>
+                <w:szCs w:val="18"/>
+              </w:rPr>
+              <w:t xml:space="preserve">0</w:t>
             </w:r>
           </w:p>
         </w:tc>
@@ -2819,30 +2819,30 @@
                 <w:sz w:val="18"/>
                 <w:szCs w:val="18"/>
               </w:rPr>
-              <w:t xml:space="preserve">85%</w:t>
-            </w:r>
-          </w:p>
-        </w:tc>
-        <w:tc>
-          <w:tcPr>
-            <w:shd w:fill="E8F5E9" w:color="E8F5E9" w:val="solid"/>
-            <w:tcMar>
-              <w:top w:type="dxa" w:w="60"/>
-              <w:left w:type="dxa" w:w="80"/>
-              <w:bottom w:type="dxa" w:w="60"/>
-              <w:right w:type="dxa" w:w="80"/>
-            </w:tcMar>
-          </w:tcPr>
-          <w:p>
-            <w:pPr>
-              <w:jc w:val="center"/>
-            </w:pPr>
-            <w:r>
-              <w:rPr>
-                <w:sz w:val="18"/>
-                <w:szCs w:val="18"/>
-              </w:rPr>
-              <w:t xml:space="preserve">16837ms</w:t>
+              <w:t xml:space="preserve">100%</w:t>
+            </w:r>
+          </w:p>
+        </w:tc>
+        <w:tc>
+          <w:tcPr>
+            <w:shd w:fill="E8F5E9" w:color="E8F5E9" w:val="solid"/>
+            <w:tcMar>
+              <w:top w:type="dxa" w:w="60"/>
+              <w:left w:type="dxa" w:w="80"/>
+              <w:bottom w:type="dxa" w:w="60"/>
+              <w:right w:type="dxa" w:w="80"/>
+            </w:tcMar>
+          </w:tcPr>
+          <w:p>
+            <w:pPr>
+              <w:jc w:val="center"/>
+            </w:pPr>
+            <w:r>
+              <w:rPr>
+                <w:sz w:val="18"/>
+                <w:szCs w:val="18"/>
+              </w:rPr>
+              <w:t xml:space="preserve">16893ms</w:t>
             </w:r>
           </w:p>
         </w:tc>
@@ -2936,30 +2936,30 @@
                 <w:sz w:val="18"/>
                 <w:szCs w:val="18"/>
               </w:rPr>
-              <w:t xml:space="preserve">17</w:t>
-            </w:r>
-          </w:p>
-        </w:tc>
-        <w:tc>
-          <w:tcPr>
-            <w:shd w:fill="E8F5E9" w:color="E8F5E9" w:val="solid"/>
-            <w:tcMar>
-              <w:top w:type="dxa" w:w="60"/>
-              <w:left w:type="dxa" w:w="80"/>
-              <w:bottom w:type="dxa" w:w="60"/>
-              <w:right w:type="dxa" w:w="80"/>
-            </w:tcMar>
-          </w:tcPr>
-          <w:p>
-            <w:pPr>
-              <w:jc w:val="center"/>
-            </w:pPr>
-            <w:r>
-              <w:rPr>
-                <w:sz w:val="18"/>
-                <w:szCs w:val="18"/>
-              </w:rPr>
-              <w:t xml:space="preserve">3</w:t>
+              <w:t xml:space="preserve">16</w:t>
+            </w:r>
+          </w:p>
+        </w:tc>
+        <w:tc>
+          <w:tcPr>
+            <w:shd w:fill="E8F5E9" w:color="E8F5E9" w:val="solid"/>
+            <w:tcMar>
+              <w:top w:type="dxa" w:w="60"/>
+              <w:left w:type="dxa" w:w="80"/>
+              <w:bottom w:type="dxa" w:w="60"/>
+              <w:right w:type="dxa" w:w="80"/>
+            </w:tcMar>
+          </w:tcPr>
+          <w:p>
+            <w:pPr>
+              <w:jc w:val="center"/>
+            </w:pPr>
+            <w:r>
+              <w:rPr>
+                <w:sz w:val="18"/>
+                <w:szCs w:val="18"/>
+              </w:rPr>
+              <w:t xml:space="preserve">4</w:t>
             </w:r>
           </w:p>
         </w:tc>
@@ -3053,30 +3053,30 @@
                 <w:sz w:val="18"/>
                 <w:szCs w:val="18"/>
               </w:rPr>
-              <w:t xml:space="preserve">85%</w:t>
-            </w:r>
-          </w:p>
-        </w:tc>
-        <w:tc>
-          <w:tcPr>
-            <w:shd w:fill="E8F5E9" w:color="E8F5E9" w:val="solid"/>
-            <w:tcMar>
-              <w:top w:type="dxa" w:w="60"/>
-              <w:left w:type="dxa" w:w="80"/>
-              <w:bottom w:type="dxa" w:w="60"/>
-              <w:right w:type="dxa" w:w="80"/>
-            </w:tcMar>
-          </w:tcPr>
-          <w:p>
-            <w:pPr>
-              <w:jc w:val="center"/>
-            </w:pPr>
-            <w:r>
-              <w:rPr>
-                <w:sz w:val="18"/>
-                <w:szCs w:val="18"/>
-              </w:rPr>
-              <w:t xml:space="preserve">20266ms</w:t>
+              <w:t xml:space="preserve">80%</w:t>
+            </w:r>
+          </w:p>
+        </w:tc>
+        <w:tc>
+          <w:tcPr>
+            <w:shd w:fill="E8F5E9" w:color="E8F5E9" w:val="solid"/>
+            <w:tcMar>
+              <w:top w:type="dxa" w:w="60"/>
+              <w:left w:type="dxa" w:w="80"/>
+              <w:bottom w:type="dxa" w:w="60"/>
+              <w:right w:type="dxa" w:w="80"/>
+            </w:tcMar>
+          </w:tcPr>
+          <w:p>
+            <w:pPr>
+              <w:jc w:val="center"/>
+            </w:pPr>
+            <w:r>
+              <w:rPr>
+                <w:sz w:val="18"/>
+                <w:szCs w:val="18"/>
+              </w:rPr>
+              <w:t xml:space="preserve">20224ms</w:t>
             </w:r>
           </w:p>
         </w:tc>
@@ -3147,53 +3147,53 @@
                 <w:sz w:val="18"/>
                 <w:szCs w:val="18"/>
               </w:rPr>
+              <w:t xml:space="preserve">0</w:t>
+            </w:r>
+          </w:p>
+        </w:tc>
+        <w:tc>
+          <w:tcPr>
+            <w:shd w:fill="E8F5E9" w:color="E8F5E9" w:val="solid"/>
+            <w:tcMar>
+              <w:top w:type="dxa" w:w="60"/>
+              <w:left w:type="dxa" w:w="80"/>
+              <w:bottom w:type="dxa" w:w="60"/>
+              <w:right w:type="dxa" w:w="80"/>
+            </w:tcMar>
+          </w:tcPr>
+          <w:p>
+            <w:pPr>
+              <w:jc w:val="center"/>
+            </w:pPr>
+            <w:r>
+              <w:rPr>
+                <w:sz w:val="18"/>
+                <w:szCs w:val="18"/>
+              </w:rPr>
+              <w:t xml:space="preserve">19</w:t>
+            </w:r>
+          </w:p>
+        </w:tc>
+        <w:tc>
+          <w:tcPr>
+            <w:shd w:fill="E8F5E9" w:color="E8F5E9" w:val="solid"/>
+            <w:tcMar>
+              <w:top w:type="dxa" w:w="60"/>
+              <w:left w:type="dxa" w:w="80"/>
+              <w:bottom w:type="dxa" w:w="60"/>
+              <w:right w:type="dxa" w:w="80"/>
+            </w:tcMar>
+          </w:tcPr>
+          <w:p>
+            <w:pPr>
+              <w:jc w:val="center"/>
+            </w:pPr>
+            <w:r>
+              <w:rPr>
+                <w:sz w:val="18"/>
+                <w:szCs w:val="18"/>
+              </w:rPr>
               <w:t xml:space="preserve">1</w:t>
-            </w:r>
-          </w:p>
-        </w:tc>
-        <w:tc>
-          <w:tcPr>
-            <w:shd w:fill="E8F5E9" w:color="E8F5E9" w:val="solid"/>
-            <w:tcMar>
-              <w:top w:type="dxa" w:w="60"/>
-              <w:left w:type="dxa" w:w="80"/>
-              <w:bottom w:type="dxa" w:w="60"/>
-              <w:right w:type="dxa" w:w="80"/>
-            </w:tcMar>
-          </w:tcPr>
-          <w:p>
-            <w:pPr>
-              <w:jc w:val="center"/>
-            </w:pPr>
-            <w:r>
-              <w:rPr>
-                <w:sz w:val="18"/>
-                <w:szCs w:val="18"/>
-              </w:rPr>
-              <w:t xml:space="preserve">17</w:t>
-            </w:r>
-          </w:p>
-        </w:tc>
-        <w:tc>
-          <w:tcPr>
-            <w:shd w:fill="E8F5E9" w:color="E8F5E9" w:val="solid"/>
-            <w:tcMar>
-              <w:top w:type="dxa" w:w="60"/>
-              <w:left w:type="dxa" w:w="80"/>
-              <w:bottom w:type="dxa" w:w="60"/>
-              <w:right w:type="dxa" w:w="80"/>
-            </w:tcMar>
-          </w:tcPr>
-          <w:p>
-            <w:pPr>
-              <w:jc w:val="center"/>
-            </w:pPr>
-            <w:r>
-              <w:rPr>
-                <w:sz w:val="18"/>
-                <w:szCs w:val="18"/>
-              </w:rPr>
-              <w:t xml:space="preserve">2</w:t>
             </w:r>
           </w:p>
         </w:tc>
@@ -3287,30 +3287,30 @@
                 <w:sz w:val="18"/>
                 <w:szCs w:val="18"/>
               </w:rPr>
-              <w:t xml:space="preserve">90%</w:t>
-            </w:r>
-          </w:p>
-        </w:tc>
-        <w:tc>
-          <w:tcPr>
-            <w:shd w:fill="E8F5E9" w:color="E8F5E9" w:val="solid"/>
-            <w:tcMar>
-              <w:top w:type="dxa" w:w="60"/>
-              <w:left w:type="dxa" w:w="80"/>
-              <w:bottom w:type="dxa" w:w="60"/>
-              <w:right w:type="dxa" w:w="80"/>
-            </w:tcMar>
-          </w:tcPr>
-          <w:p>
-            <w:pPr>
-              <w:jc w:val="center"/>
-            </w:pPr>
-            <w:r>
-              <w:rPr>
-                <w:sz w:val="18"/>
-                <w:szCs w:val="18"/>
-              </w:rPr>
-              <w:t xml:space="preserve">16543ms</w:t>
+              <w:t xml:space="preserve">95%</w:t>
+            </w:r>
+          </w:p>
+        </w:tc>
+        <w:tc>
+          <w:tcPr>
+            <w:shd w:fill="E8F5E9" w:color="E8F5E9" w:val="solid"/>
+            <w:tcMar>
+              <w:top w:type="dxa" w:w="60"/>
+              <w:left w:type="dxa" w:w="80"/>
+              <w:bottom w:type="dxa" w:w="60"/>
+              <w:right w:type="dxa" w:w="80"/>
+            </w:tcMar>
+          </w:tcPr>
+          <w:p>
+            <w:pPr>
+              <w:jc w:val="center"/>
+            </w:pPr>
+            <w:r>
+              <w:rPr>
+                <w:sz w:val="18"/>
+                <w:szCs w:val="18"/>
+              </w:rPr>
+              <w:t xml:space="preserve">15492ms</w:t>
             </w:r>
           </w:p>
         </w:tc>
@@ -3544,7 +3544,7 @@
                 <w:sz w:val="18"/>
                 <w:szCs w:val="18"/>
               </w:rPr>
-              <w:t xml:space="preserve">13662ms</w:t>
+              <w:t xml:space="preserve">13357ms</w:t>
             </w:r>
           </w:p>
         </w:tc>
@@ -3778,7 +3778,7 @@
                 <w:sz w:val="18"/>
                 <w:szCs w:val="18"/>
               </w:rPr>
-              <w:t xml:space="preserve">15294ms</w:t>
+              <w:t xml:space="preserve">15269ms</w:t>
             </w:r>
           </w:p>
         </w:tc>
@@ -3872,30 +3872,30 @@
                 <w:sz w:val="18"/>
                 <w:szCs w:val="18"/>
               </w:rPr>
-              <w:t xml:space="preserve">17</w:t>
-            </w:r>
-          </w:p>
-        </w:tc>
-        <w:tc>
-          <w:tcPr>
-            <w:shd w:fill="E8F5E9" w:color="E8F5E9" w:val="solid"/>
-            <w:tcMar>
-              <w:top w:type="dxa" w:w="60"/>
-              <w:left w:type="dxa" w:w="80"/>
-              <w:bottom w:type="dxa" w:w="60"/>
-              <w:right w:type="dxa" w:w="80"/>
-            </w:tcMar>
-          </w:tcPr>
-          <w:p>
-            <w:pPr>
-              <w:jc w:val="center"/>
-            </w:pPr>
-            <w:r>
-              <w:rPr>
-                <w:sz w:val="18"/>
-                <w:szCs w:val="18"/>
-              </w:rPr>
-              <w:t xml:space="preserve">3</w:t>
+              <w:t xml:space="preserve">18</w:t>
+            </w:r>
+          </w:p>
+        </w:tc>
+        <w:tc>
+          <w:tcPr>
+            <w:shd w:fill="E8F5E9" w:color="E8F5E9" w:val="solid"/>
+            <w:tcMar>
+              <w:top w:type="dxa" w:w="60"/>
+              <w:left w:type="dxa" w:w="80"/>
+              <w:bottom w:type="dxa" w:w="60"/>
+              <w:right w:type="dxa" w:w="80"/>
+            </w:tcMar>
+          </w:tcPr>
+          <w:p>
+            <w:pPr>
+              <w:jc w:val="center"/>
+            </w:pPr>
+            <w:r>
+              <w:rPr>
+                <w:sz w:val="18"/>
+                <w:szCs w:val="18"/>
+              </w:rPr>
+              <w:t xml:space="preserve">2</w:t>
             </w:r>
           </w:p>
         </w:tc>
@@ -3989,30 +3989,30 @@
                 <w:sz w:val="18"/>
                 <w:szCs w:val="18"/>
               </w:rPr>
-              <w:t xml:space="preserve">85%</w:t>
-            </w:r>
-          </w:p>
-        </w:tc>
-        <w:tc>
-          <w:tcPr>
-            <w:shd w:fill="E8F5E9" w:color="E8F5E9" w:val="solid"/>
-            <w:tcMar>
-              <w:top w:type="dxa" w:w="60"/>
-              <w:left w:type="dxa" w:w="80"/>
-              <w:bottom w:type="dxa" w:w="60"/>
-              <w:right w:type="dxa" w:w="80"/>
-            </w:tcMar>
-          </w:tcPr>
-          <w:p>
-            <w:pPr>
-              <w:jc w:val="center"/>
-            </w:pPr>
-            <w:r>
-              <w:rPr>
-                <w:sz w:val="18"/>
-                <w:szCs w:val="18"/>
-              </w:rPr>
-              <w:t xml:space="preserve">14832ms</w:t>
+              <w:t xml:space="preserve">90%</w:t>
+            </w:r>
+          </w:p>
+        </w:tc>
+        <w:tc>
+          <w:tcPr>
+            <w:shd w:fill="E8F5E9" w:color="E8F5E9" w:val="solid"/>
+            <w:tcMar>
+              <w:top w:type="dxa" w:w="60"/>
+              <w:left w:type="dxa" w:w="80"/>
+              <w:bottom w:type="dxa" w:w="60"/>
+              <w:right w:type="dxa" w:w="80"/>
+            </w:tcMar>
+          </w:tcPr>
+          <w:p>
+            <w:pPr>
+              <w:jc w:val="center"/>
+            </w:pPr>
+            <w:r>
+              <w:rPr>
+                <w:sz w:val="18"/>
+                <w:szCs w:val="18"/>
+              </w:rPr>
+              <w:t xml:space="preserve">14117ms</w:t>
             </w:r>
           </w:p>
         </w:tc>
@@ -4106,30 +4106,30 @@
                 <w:sz w:val="18"/>
                 <w:szCs w:val="18"/>
               </w:rPr>
-              <w:t xml:space="preserve">20</w:t>
-            </w:r>
-          </w:p>
-        </w:tc>
-        <w:tc>
-          <w:tcPr>
-            <w:shd w:fill="E8F5E9" w:color="E8F5E9" w:val="solid"/>
-            <w:tcMar>
-              <w:top w:type="dxa" w:w="60"/>
-              <w:left w:type="dxa" w:w="80"/>
-              <w:bottom w:type="dxa" w:w="60"/>
-              <w:right w:type="dxa" w:w="80"/>
-            </w:tcMar>
-          </w:tcPr>
-          <w:p>
-            <w:pPr>
-              <w:jc w:val="center"/>
-            </w:pPr>
-            <w:r>
-              <w:rPr>
-                <w:sz w:val="18"/>
-                <w:szCs w:val="18"/>
-              </w:rPr>
-              <w:t xml:space="preserve">0</w:t>
+              <w:t xml:space="preserve">19</w:t>
+            </w:r>
+          </w:p>
+        </w:tc>
+        <w:tc>
+          <w:tcPr>
+            <w:shd w:fill="E8F5E9" w:color="E8F5E9" w:val="solid"/>
+            <w:tcMar>
+              <w:top w:type="dxa" w:w="60"/>
+              <w:left w:type="dxa" w:w="80"/>
+              <w:bottom w:type="dxa" w:w="60"/>
+              <w:right w:type="dxa" w:w="80"/>
+            </w:tcMar>
+          </w:tcPr>
+          <w:p>
+            <w:pPr>
+              <w:jc w:val="center"/>
+            </w:pPr>
+            <w:r>
+              <w:rPr>
+                <w:sz w:val="18"/>
+                <w:szCs w:val="18"/>
+              </w:rPr>
+              <w:t xml:space="preserve">1</w:t>
             </w:r>
           </w:p>
         </w:tc>
@@ -4223,30 +4223,30 @@
                 <w:sz w:val="18"/>
                 <w:szCs w:val="18"/>
               </w:rPr>
-              <w:t xml:space="preserve">100%</w:t>
-            </w:r>
-          </w:p>
-        </w:tc>
-        <w:tc>
-          <w:tcPr>
-            <w:shd w:fill="E8F5E9" w:color="E8F5E9" w:val="solid"/>
-            <w:tcMar>
-              <w:top w:type="dxa" w:w="60"/>
-              <w:left w:type="dxa" w:w="80"/>
-              <w:bottom w:type="dxa" w:w="60"/>
-              <w:right w:type="dxa" w:w="80"/>
-            </w:tcMar>
-          </w:tcPr>
-          <w:p>
-            <w:pPr>
-              <w:jc w:val="center"/>
-            </w:pPr>
-            <w:r>
-              <w:rPr>
-                <w:sz w:val="18"/>
-                <w:szCs w:val="18"/>
-              </w:rPr>
-              <w:t xml:space="preserve">19391ms</w:t>
+              <w:t xml:space="preserve">95%</w:t>
+            </w:r>
+          </w:p>
+        </w:tc>
+        <w:tc>
+          <w:tcPr>
+            <w:shd w:fill="E8F5E9" w:color="E8F5E9" w:val="solid"/>
+            <w:tcMar>
+              <w:top w:type="dxa" w:w="60"/>
+              <w:left w:type="dxa" w:w="80"/>
+              <w:bottom w:type="dxa" w:w="60"/>
+              <w:right w:type="dxa" w:w="80"/>
+            </w:tcMar>
+          </w:tcPr>
+          <w:p>
+            <w:pPr>
+              <w:jc w:val="center"/>
+            </w:pPr>
+            <w:r>
+              <w:rPr>
+                <w:sz w:val="18"/>
+                <w:szCs w:val="18"/>
+              </w:rPr>
+              <w:t xml:space="preserve">17992ms</w:t>
             </w:r>
           </w:p>
         </w:tc>
@@ -4340,7 +4340,7 @@
                 <w:sz w:val="18"/>
                 <w:szCs w:val="18"/>
               </w:rPr>
-              <w:t xml:space="preserve">12</w:t>
+              <w:t xml:space="preserve">13</w:t>
             </w:r>
           </w:p>
         </w:tc>
@@ -4386,7 +4386,7 @@
                 <w:sz w:val="18"/>
                 <w:szCs w:val="18"/>
               </w:rPr>
-              <w:t xml:space="preserve">1</w:t>
+              <w:t xml:space="preserve">0</w:t>
             </w:r>
           </w:p>
         </w:tc>
@@ -4457,7 +4457,7 @@
                 <w:sz w:val="18"/>
                 <w:szCs w:val="18"/>
               </w:rPr>
-              <w:t xml:space="preserve">60%</w:t>
+              <w:t xml:space="preserve">65%</w:t>
             </w:r>
           </w:p>
         </w:tc>
@@ -4480,7 +4480,7 @@
                 <w:sz w:val="18"/>
                 <w:szCs w:val="18"/>
               </w:rPr>
-              <w:t xml:space="preserve">31163ms</w:t>
+              <w:t xml:space="preserve">31969ms</w:t>
             </w:r>
           </w:p>
         </w:tc>
@@ -4574,30 +4574,30 @@
                 <w:sz w:val="18"/>
                 <w:szCs w:val="18"/>
               </w:rPr>
-              <w:t xml:space="preserve">19</w:t>
-            </w:r>
-          </w:p>
-        </w:tc>
-        <w:tc>
-          <w:tcPr>
-            <w:shd w:fill="E8F5E9" w:color="E8F5E9" w:val="solid"/>
-            <w:tcMar>
-              <w:top w:type="dxa" w:w="60"/>
-              <w:left w:type="dxa" w:w="80"/>
-              <w:bottom w:type="dxa" w:w="60"/>
-              <w:right w:type="dxa" w:w="80"/>
-            </w:tcMar>
-          </w:tcPr>
-          <w:p>
-            <w:pPr>
-              <w:jc w:val="center"/>
-            </w:pPr>
-            <w:r>
-              <w:rPr>
-                <w:sz w:val="18"/>
-                <w:szCs w:val="18"/>
-              </w:rPr>
-              <w:t xml:space="preserve">1</w:t>
+              <w:t xml:space="preserve">18</w:t>
+            </w:r>
+          </w:p>
+        </w:tc>
+        <w:tc>
+          <w:tcPr>
+            <w:shd w:fill="E8F5E9" w:color="E8F5E9" w:val="solid"/>
+            <w:tcMar>
+              <w:top w:type="dxa" w:w="60"/>
+              <w:left w:type="dxa" w:w="80"/>
+              <w:bottom w:type="dxa" w:w="60"/>
+              <w:right w:type="dxa" w:w="80"/>
+            </w:tcMar>
+          </w:tcPr>
+          <w:p>
+            <w:pPr>
+              <w:jc w:val="center"/>
+            </w:pPr>
+            <w:r>
+              <w:rPr>
+                <w:sz w:val="18"/>
+                <w:szCs w:val="18"/>
+              </w:rPr>
+              <w:t xml:space="preserve">2</w:t>
             </w:r>
           </w:p>
         </w:tc>
@@ -4691,30 +4691,30 @@
                 <w:sz w:val="18"/>
                 <w:szCs w:val="18"/>
               </w:rPr>
-              <w:t xml:space="preserve">95%</w:t>
-            </w:r>
-          </w:p>
-        </w:tc>
-        <w:tc>
-          <w:tcPr>
-            <w:shd w:fill="E8F5E9" w:color="E8F5E9" w:val="solid"/>
-            <w:tcMar>
-              <w:top w:type="dxa" w:w="60"/>
-              <w:left w:type="dxa" w:w="80"/>
-              <w:bottom w:type="dxa" w:w="60"/>
-              <w:right w:type="dxa" w:w="80"/>
-            </w:tcMar>
-          </w:tcPr>
-          <w:p>
-            <w:pPr>
-              <w:jc w:val="center"/>
-            </w:pPr>
-            <w:r>
-              <w:rPr>
-                <w:sz w:val="18"/>
-                <w:szCs w:val="18"/>
-              </w:rPr>
-              <w:t xml:space="preserve">18290ms</w:t>
+              <w:t xml:space="preserve">90%</w:t>
+            </w:r>
+          </w:p>
+        </w:tc>
+        <w:tc>
+          <w:tcPr>
+            <w:shd w:fill="E8F5E9" w:color="E8F5E9" w:val="solid"/>
+            <w:tcMar>
+              <w:top w:type="dxa" w:w="60"/>
+              <w:left w:type="dxa" w:w="80"/>
+              <w:bottom w:type="dxa" w:w="60"/>
+              <w:right w:type="dxa" w:w="80"/>
+            </w:tcMar>
+          </w:tcPr>
+          <w:p>
+            <w:pPr>
+              <w:jc w:val="center"/>
+            </w:pPr>
+            <w:r>
+              <w:rPr>
+                <w:sz w:val="18"/>
+                <w:szCs w:val="18"/>
+              </w:rPr>
+              <w:t xml:space="preserve">17499ms</w:t>
             </w:r>
           </w:p>
         </w:tc>
@@ -4808,30 +4808,30 @@
                 <w:sz w:val="18"/>
                 <w:szCs w:val="18"/>
               </w:rPr>
-              <w:t xml:space="preserve">18</w:t>
-            </w:r>
-          </w:p>
-        </w:tc>
-        <w:tc>
-          <w:tcPr>
-            <w:shd w:fill="E8F5E9" w:color="E8F5E9" w:val="solid"/>
-            <w:tcMar>
-              <w:top w:type="dxa" w:w="60"/>
-              <w:left w:type="dxa" w:w="80"/>
-              <w:bottom w:type="dxa" w:w="60"/>
-              <w:right w:type="dxa" w:w="80"/>
-            </w:tcMar>
-          </w:tcPr>
-          <w:p>
-            <w:pPr>
-              <w:jc w:val="center"/>
-            </w:pPr>
-            <w:r>
-              <w:rPr>
-                <w:sz w:val="18"/>
-                <w:szCs w:val="18"/>
-              </w:rPr>
-              <w:t xml:space="preserve">2</w:t>
+              <w:t xml:space="preserve">19</w:t>
+            </w:r>
+          </w:p>
+        </w:tc>
+        <w:tc>
+          <w:tcPr>
+            <w:shd w:fill="E8F5E9" w:color="E8F5E9" w:val="solid"/>
+            <w:tcMar>
+              <w:top w:type="dxa" w:w="60"/>
+              <w:left w:type="dxa" w:w="80"/>
+              <w:bottom w:type="dxa" w:w="60"/>
+              <w:right w:type="dxa" w:w="80"/>
+            </w:tcMar>
+          </w:tcPr>
+          <w:p>
+            <w:pPr>
+              <w:jc w:val="center"/>
+            </w:pPr>
+            <w:r>
+              <w:rPr>
+                <w:sz w:val="18"/>
+                <w:szCs w:val="18"/>
+              </w:rPr>
+              <w:t xml:space="preserve">1</w:t>
             </w:r>
           </w:p>
         </w:tc>
@@ -4925,30 +4925,30 @@
                 <w:sz w:val="18"/>
                 <w:szCs w:val="18"/>
               </w:rPr>
-              <w:t xml:space="preserve">90%</w:t>
-            </w:r>
-          </w:p>
-        </w:tc>
-        <w:tc>
-          <w:tcPr>
-            <w:shd w:fill="E8F5E9" w:color="E8F5E9" w:val="solid"/>
-            <w:tcMar>
-              <w:top w:type="dxa" w:w="60"/>
-              <w:left w:type="dxa" w:w="80"/>
-              <w:bottom w:type="dxa" w:w="60"/>
-              <w:right w:type="dxa" w:w="80"/>
-            </w:tcMar>
-          </w:tcPr>
-          <w:p>
-            <w:pPr>
-              <w:jc w:val="center"/>
-            </w:pPr>
-            <w:r>
-              <w:rPr>
-                <w:sz w:val="18"/>
-                <w:szCs w:val="18"/>
-              </w:rPr>
-              <w:t xml:space="preserve">20187ms</w:t>
+              <w:t xml:space="preserve">95%</w:t>
+            </w:r>
+          </w:p>
+        </w:tc>
+        <w:tc>
+          <w:tcPr>
+            <w:shd w:fill="E8F5E9" w:color="E8F5E9" w:val="solid"/>
+            <w:tcMar>
+              <w:top w:type="dxa" w:w="60"/>
+              <w:left w:type="dxa" w:w="80"/>
+              <w:bottom w:type="dxa" w:w="60"/>
+              <w:right w:type="dxa" w:w="80"/>
+            </w:tcMar>
+          </w:tcPr>
+          <w:p>
+            <w:pPr>
+              <w:jc w:val="center"/>
+            </w:pPr>
+            <w:r>
+              <w:rPr>
+                <w:sz w:val="18"/>
+                <w:szCs w:val="18"/>
+              </w:rPr>
+              <w:t xml:space="preserve">17528ms</w:t>
             </w:r>
           </w:p>
         </w:tc>
@@ -5042,30 +5042,30 @@
                 <w:sz w:val="18"/>
                 <w:szCs w:val="18"/>
               </w:rPr>
-              <w:t xml:space="preserve">18</w:t>
-            </w:r>
-          </w:p>
-        </w:tc>
-        <w:tc>
-          <w:tcPr>
-            <w:shd w:fill="E8F5E9" w:color="E8F5E9" w:val="solid"/>
-            <w:tcMar>
-              <w:top w:type="dxa" w:w="60"/>
-              <w:left w:type="dxa" w:w="80"/>
-              <w:bottom w:type="dxa" w:w="60"/>
-              <w:right w:type="dxa" w:w="80"/>
-            </w:tcMar>
-          </w:tcPr>
-          <w:p>
-            <w:pPr>
-              <w:jc w:val="center"/>
-            </w:pPr>
-            <w:r>
-              <w:rPr>
-                <w:sz w:val="18"/>
-                <w:szCs w:val="18"/>
-              </w:rPr>
-              <w:t xml:space="preserve">1</w:t>
+              <w:t xml:space="preserve">19</w:t>
+            </w:r>
+          </w:p>
+        </w:tc>
+        <w:tc>
+          <w:tcPr>
+            <w:shd w:fill="E8F5E9" w:color="E8F5E9" w:val="solid"/>
+            <w:tcMar>
+              <w:top w:type="dxa" w:w="60"/>
+              <w:left w:type="dxa" w:w="80"/>
+              <w:bottom w:type="dxa" w:w="60"/>
+              <w:right w:type="dxa" w:w="80"/>
+            </w:tcMar>
+          </w:tcPr>
+          <w:p>
+            <w:pPr>
+              <w:jc w:val="center"/>
+            </w:pPr>
+            <w:r>
+              <w:rPr>
+                <w:sz w:val="18"/>
+                <w:szCs w:val="18"/>
+              </w:rPr>
+              <w:t xml:space="preserve">0</w:t>
             </w:r>
           </w:p>
         </w:tc>
@@ -5159,30 +5159,30 @@
                 <w:sz w:val="18"/>
                 <w:szCs w:val="18"/>
               </w:rPr>
-              <w:t xml:space="preserve">95%</w:t>
-            </w:r>
-          </w:p>
-        </w:tc>
-        <w:tc>
-          <w:tcPr>
-            <w:shd w:fill="E8F5E9" w:color="E8F5E9" w:val="solid"/>
-            <w:tcMar>
-              <w:top w:type="dxa" w:w="60"/>
-              <w:left w:type="dxa" w:w="80"/>
-              <w:bottom w:type="dxa" w:w="60"/>
-              <w:right w:type="dxa" w:w="80"/>
-            </w:tcMar>
-          </w:tcPr>
-          <w:p>
-            <w:pPr>
-              <w:jc w:val="center"/>
-            </w:pPr>
-            <w:r>
-              <w:rPr>
-                <w:sz w:val="18"/>
-                <w:szCs w:val="18"/>
-              </w:rPr>
-              <w:t xml:space="preserve">18073ms</w:t>
+              <w:t xml:space="preserve">100%</w:t>
+            </w:r>
+          </w:p>
+        </w:tc>
+        <w:tc>
+          <w:tcPr>
+            <w:shd w:fill="E8F5E9" w:color="E8F5E9" w:val="solid"/>
+            <w:tcMar>
+              <w:top w:type="dxa" w:w="60"/>
+              <w:left w:type="dxa" w:w="80"/>
+              <w:bottom w:type="dxa" w:w="60"/>
+              <w:right w:type="dxa" w:w="80"/>
+            </w:tcMar>
+          </w:tcPr>
+          <w:p>
+            <w:pPr>
+              <w:jc w:val="center"/>
+            </w:pPr>
+            <w:r>
+              <w:rPr>
+                <w:sz w:val="18"/>
+                <w:szCs w:val="18"/>
+              </w:rPr>
+              <w:t xml:space="preserve">16493ms</w:t>
             </w:r>
           </w:p>
         </w:tc>
@@ -5284,7 +5284,7 @@
                 <w:sz w:val="18"/>
                 <w:szCs w:val="18"/>
               </w:rPr>
-              <w:t xml:space="preserve">357</w:t>
+              <w:t xml:space="preserve">367</w:t>
             </w:r>
           </w:p>
         </w:tc>
@@ -5309,7 +5309,7 @@
                 <w:sz w:val="18"/>
                 <w:szCs w:val="18"/>
               </w:rPr>
-              <w:t xml:space="preserve">32</w:t>
+              <w:t xml:space="preserve">27</w:t>
             </w:r>
           </w:p>
         </w:tc>
@@ -5334,7 +5334,7 @@
                 <w:sz w:val="18"/>
                 <w:szCs w:val="18"/>
               </w:rPr>
-              <w:t xml:space="preserve">7</w:t>
+              <w:t xml:space="preserve">2</w:t>
             </w:r>
           </w:p>
         </w:tc>
@@ -5409,7 +5409,7 @@
                 <w:sz w:val="18"/>
                 <w:szCs w:val="18"/>
               </w:rPr>
-              <w:t xml:space="preserve">90%</w:t>
+              <w:t xml:space="preserve">92%</w:t>
             </w:r>
           </w:p>
         </w:tc>
@@ -5434,7 +5434,7 @@
                 <w:sz w:val="18"/>
                 <w:szCs w:val="18"/>
               </w:rPr>
-              <w:t xml:space="preserve">18608ms</w:t>
+              <w:t xml:space="preserve">17918ms</w:t>
             </w:r>
           </w:p>
         </w:tc>
@@ -5451,102 +5451,6 @@
       </w:pPr>
       <w:r>
         <w:t xml:space="preserve">3. Principales Fallos</w:t>
-      </w:r>
-    </w:p>
-    <w:p>
-      <w:pPr>
-        <w:spacing w:after="60"/>
-      </w:pPr>
-      <w:r>
-        <w:rPr>
-          <w:b/>
-          <w:bCs/>
-          <w:sz w:val="18"/>
-          <w:szCs w:val="18"/>
-        </w:rPr>
-        <w:t xml:space="preserve">[2] Fontanería — VACIO: </w:t>
-      </w:r>
-      <w:r>
-        <w:rPr>
-          <w:sz w:val="18"/>
-          <w:szCs w:val="18"/>
-        </w:rPr>
-        <w:t xml:space="preserve">Cambio de bañera por plato de ducha en baño principal de 90x90 con mamparas</w:t>
-      </w:r>
-      <w:r>
-        <w:t xml:space="preserve"/>
-      </w:r>
-    </w:p>
-    <w:p>
-      <w:pPr>
-        <w:spacing w:after="60"/>
-      </w:pPr>
-      <w:r>
-        <w:rPr>
-          <w:b/>
-          <w:bCs/>
-          <w:sz w:val="18"/>
-          <w:szCs w:val="18"/>
-        </w:rPr>
-        <w:t xml:space="preserve">[7] Fontanería — VACIO: </w:t>
-      </w:r>
-      <w:r>
-        <w:rPr>
-          <w:sz w:val="18"/>
-          <w:szCs w:val="18"/>
-        </w:rPr>
-        <w:t xml:space="preserve">Instalación completa de baño nuevo con lavabo empotrado, inodoro suspendido, duc</w:t>
-      </w:r>
-      <w:r>
-        <w:t xml:space="preserve"/>
-      </w:r>
-    </w:p>
-    <w:p>
-      <w:pPr>
-        <w:spacing w:after="60"/>
-      </w:pPr>
-      <w:r>
-        <w:rPr>
-          <w:b/>
-          <w:bCs/>
-          <w:sz w:val="18"/>
-          <w:szCs w:val="18"/>
-        </w:rPr>
-        <w:t xml:space="preserve">[106] Climatización — VACIO: </w:t>
-      </w:r>
-      <w:r>
-        <w:rPr>
-          <w:sz w:val="18"/>
-          <w:szCs w:val="18"/>
-        </w:rPr>
-        <w:t xml:space="preserve">Instalación de suelo radiante con bomba de calor en planta baja de 90 metros cua</w:t>
-      </w:r>
-      <w:r>
-        <w:t xml:space="preserve"/>
-      </w:r>
-    </w:p>
-    <w:p>
-      <w:pPr>
-        <w:spacing w:after="60"/>
-      </w:pPr>
-      <w:r>
-        <w:rPr>
-          <w:b/>
-          <w:bCs/>
-          <w:sz w:val="18"/>
-          <w:szCs w:val="18"/>
-        </w:rPr>
-        <w:t xml:space="preserve">[229] Energía Solar — VACIO: </w:t>
-      </w:r>
-      <w:r>
-        <w:rPr>
-          <w:sz w:val="18"/>
-          <w:szCs w:val="18"/>
-        </w:rPr>
-        <w:t xml:space="preserve">Instalar cargador de coche eléctrico alimentado por energía solar con gestión in</w:t>
-      </w:r>
-      <w:r>
-        <w:t xml:space="preserve"/>
       </w:r>
     </w:p>
     <w:p>
@@ -5584,14 +5488,14 @@
           <w:sz w:val="18"/>
           <w:szCs w:val="18"/>
         </w:rPr>
-        <w:t xml:space="preserve">[320] Contra Incendios — VACIO: </w:t>
+        <w:t xml:space="preserve">[239] Energía Solar — VACIO: </w:t>
       </w:r>
       <w:r>
         <w:rPr>
           <w:sz w:val="18"/>
           <w:szCs w:val="18"/>
         </w:rPr>
-        <w:t xml:space="preserve">Instalar detección temprana de incendios en archivo de documentación, sistema de</w:t>
+        <w:t xml:space="preserve">Proyecto de comunidad energética solar en barrio, 20 viviendas participantes, ge</w:t>
       </w:r>
       <w:r>
         <w:t xml:space="preserve"/>
@@ -5657,30 +5561,6 @@
     </w:p>
     <w:p>
       <w:pPr>
-        <w:spacing w:after="60"/>
-      </w:pPr>
-      <w:r>
-        <w:rPr>
-          <w:b/>
-          <w:bCs/>
-          <w:sz w:val="18"/>
-          <w:szCs w:val="18"/>
-        </w:rPr>
-        <w:t xml:space="preserve">[364] Reformas Integrales — VACIO: </w:t>
-      </w:r>
-      <w:r>
-        <w:rPr>
-          <w:sz w:val="18"/>
-          <w:szCs w:val="18"/>
-        </w:rPr>
-        <w:t xml:space="preserve">Convertir local comercial en vivienda de 60 metros cuadrados con licencia de cam</w:t>
-      </w:r>
-      <w:r>
-        <w:t xml:space="preserve"/>
-      </w:r>
-    </w:p>
-    <w:p>
-      <w:pPr>
         <w:spacing w:after="300"/>
       </w:pPr>
     </w:p>
@@ -5704,7 +5584,7 @@
         <w:t xml:space="preserve">Tasa OK ≥ 70%: </w:t>
       </w:r>
       <w:r>
-        <w:t xml:space="preserve">✅ CUMPLE (90%)</w:t>
+        <w:t xml:space="preserve">✅ CUMPLE (92%)</w:t>
       </w:r>
     </w:p>
     <w:p>
@@ -5719,7 +5599,7 @@
         <w:t xml:space="preserve">Coincidencia oficio ≥ 80%: </w:t>
       </w:r>
       <w:r>
-        <w:t xml:space="preserve">❌ NO CUMPLE (73%)</w:t>
+        <w:t xml:space="preserve">❌ NO CUMPLE (74%)</w:t>
       </w:r>
     </w:p>
     <w:p>
@@ -5734,7 +5614,7 @@
         <w:t xml:space="preserve">Latencia media ≤ 10 000ms: </w:t>
       </w:r>
       <w:r>
-        <w:t xml:space="preserve">❌ NO CUMPLE (18608ms)</w:t>
+        <w:t xml:space="preserve">❌ NO CUMPLE (17918ms)</w:t>
       </w:r>
     </w:p>
     <w:p>

</xml_diff>

<commit_message>
docs: AI Validation Center implementation document + compare scripts v58
</commit_message>
<xml_diff>
--- a/scripts/test-motor-ia/output/test_summary.docx
+++ b/scripts/test-motor-ia/output/test_summary.docx
@@ -22,7 +22,7 @@
         <w:t xml:space="preserve">Fecha de ejecución: </w:t>
       </w:r>
       <w:r>
-        <w:t xml:space="preserve">2/7/2026, 21:00:39</w:t>
+        <w:t xml:space="preserve">3/7/2026, 0:20:03</w:t>
       </w:r>
       <w:r>
         <w:rPr>
@@ -55,7 +55,7 @@
         <w:t xml:space="preserve">Tasa de éxito (OK_CATALOGO + OK_MIXTO): </w:t>
       </w:r>
       <w:r>
-        <w:t xml:space="preserve">369 / 400 (92%)</w:t>
+        <w:t xml:space="preserve">367 / 400 (92%)</w:t>
       </w:r>
     </w:p>
     <w:p>
@@ -70,7 +70,7 @@
         <w:t xml:space="preserve">Tasa de error (VACÍO + ERROR_TECNICO + P.INV): </w:t>
       </w:r>
       <w:r>
-        <w:t xml:space="preserve">4 / 400 (1%)</w:t>
+        <w:t xml:space="preserve">17 / 400 (4%)</w:t>
       </w:r>
     </w:p>
     <w:p>
@@ -85,7 +85,7 @@
         <w:t xml:space="preserve">Coincidencia de oficio detectado: </w:t>
       </w:r>
       <w:r>
-        <w:t xml:space="preserve">295 / 400 (74%)</w:t>
+        <w:t xml:space="preserve">291 / 400 (73%)</w:t>
       </w:r>
     </w:p>
     <w:p>
@@ -100,7 +100,7 @@
         <w:t xml:space="preserve">Latencia media: </w:t>
       </w:r>
       <w:r>
-        <w:t xml:space="preserve">17918ms   </w:t>
+        <w:t xml:space="preserve">17880ms   </w:t>
       </w:r>
       <w:r>
         <w:rPr>
@@ -110,7 +110,7 @@
         <w:t xml:space="preserve">P95: </w:t>
       </w:r>
       <w:r>
-        <w:t xml:space="preserve">28545ms</w:t>
+        <w:t xml:space="preserve">29759ms</w:t>
       </w:r>
     </w:p>
     <w:p>
@@ -137,7 +137,7 @@
         <w:t xml:space="preserve">  • OK_CATALOGO: </w:t>
       </w:r>
       <w:r>
-        <w:t xml:space="preserve">2 (1%)</w:t>
+        <w:t xml:space="preserve">0 (0%)</w:t>
       </w:r>
     </w:p>
     <w:p>
@@ -167,7 +167,7 @@
         <w:t xml:space="preserve">  • SOLO_SUGERIDAS: </w:t>
       </w:r>
       <w:r>
-        <w:t xml:space="preserve">27 (7%)</w:t>
+        <w:t xml:space="preserve">16 (4%)</w:t>
       </w:r>
     </w:p>
     <w:p>
@@ -182,7 +182,7 @@
         <w:t xml:space="preserve">  • VACIO: </w:t>
       </w:r>
       <w:r>
-        <w:t xml:space="preserve">2 (1%)</w:t>
+        <w:t xml:space="preserve">5 (1%)</w:t>
       </w:r>
     </w:p>
     <w:p>
@@ -212,7 +212,7 @@
         <w:t xml:space="preserve">  • PRECIO_INVALIDO: </w:t>
       </w:r>
       <w:r>
-        <w:t xml:space="preserve">0 (0%)</w:t>
+        <w:t xml:space="preserve">10 (3%)</w:t>
       </w:r>
     </w:p>
     <w:p>
@@ -736,7 +736,7 @@
                 <w:sz w:val="18"/>
                 <w:szCs w:val="18"/>
               </w:rPr>
-              <w:t xml:space="preserve">19284ms</w:t>
+              <w:t xml:space="preserve">19522ms</w:t>
             </w:r>
           </w:p>
         </w:tc>
@@ -970,7 +970,7 @@
                 <w:sz w:val="18"/>
                 <w:szCs w:val="18"/>
               </w:rPr>
-              <w:t xml:space="preserve">15879ms</w:t>
+              <w:t xml:space="preserve">15718ms</w:t>
             </w:r>
           </w:p>
         </w:tc>
@@ -1064,7 +1064,7 @@
                 <w:sz w:val="18"/>
                 <w:szCs w:val="18"/>
               </w:rPr>
-              <w:t xml:space="preserve">19</w:t>
+              <w:t xml:space="preserve">18</w:t>
             </w:r>
           </w:p>
         </w:tc>
@@ -1156,7 +1156,7 @@
                 <w:sz w:val="18"/>
                 <w:szCs w:val="18"/>
               </w:rPr>
-              <w:t xml:space="preserve">0</w:t>
+              <w:t xml:space="preserve">1</w:t>
             </w:r>
           </w:p>
         </w:tc>
@@ -1181,30 +1181,30 @@
                 <w:sz w:val="18"/>
                 <w:szCs w:val="18"/>
               </w:rPr>
-              <w:t xml:space="preserve">95%</w:t>
-            </w:r>
-          </w:p>
-        </w:tc>
-        <w:tc>
-          <w:tcPr>
-            <w:shd w:fill="E8F5E9" w:color="E8F5E9" w:val="solid"/>
-            <w:tcMar>
-              <w:top w:type="dxa" w:w="60"/>
-              <w:left w:type="dxa" w:w="80"/>
-              <w:bottom w:type="dxa" w:w="60"/>
-              <w:right w:type="dxa" w:w="80"/>
-            </w:tcMar>
-          </w:tcPr>
-          <w:p>
-            <w:pPr>
-              <w:jc w:val="center"/>
-            </w:pPr>
-            <w:r>
-              <w:rPr>
-                <w:sz w:val="18"/>
-                <w:szCs w:val="18"/>
-              </w:rPr>
-              <w:t xml:space="preserve">13705ms</w:t>
+              <w:t xml:space="preserve">90%</w:t>
+            </w:r>
+          </w:p>
+        </w:tc>
+        <w:tc>
+          <w:tcPr>
+            <w:shd w:fill="E8F5E9" w:color="E8F5E9" w:val="solid"/>
+            <w:tcMar>
+              <w:top w:type="dxa" w:w="60"/>
+              <w:left w:type="dxa" w:w="80"/>
+              <w:bottom w:type="dxa" w:w="60"/>
+              <w:right w:type="dxa" w:w="80"/>
+            </w:tcMar>
+          </w:tcPr>
+          <w:p>
+            <w:pPr>
+              <w:jc w:val="center"/>
+            </w:pPr>
+            <w:r>
+              <w:rPr>
+                <w:sz w:val="18"/>
+                <w:szCs w:val="18"/>
+              </w:rPr>
+              <w:t xml:space="preserve">13346ms</w:t>
             </w:r>
           </w:p>
         </w:tc>
@@ -1298,7 +1298,7 @@
                 <w:sz w:val="18"/>
                 <w:szCs w:val="18"/>
               </w:rPr>
-              <w:t xml:space="preserve">19</w:t>
+              <w:t xml:space="preserve">17</w:t>
             </w:r>
           </w:p>
         </w:tc>
@@ -1344,53 +1344,53 @@
                 <w:sz w:val="18"/>
                 <w:szCs w:val="18"/>
               </w:rPr>
-              <w:t xml:space="preserve">0</w:t>
-            </w:r>
-          </w:p>
-        </w:tc>
-        <w:tc>
-          <w:tcPr>
-            <w:shd w:fill="E8F5E9" w:color="E8F5E9" w:val="solid"/>
-            <w:tcMar>
-              <w:top w:type="dxa" w:w="60"/>
-              <w:left w:type="dxa" w:w="80"/>
-              <w:bottom w:type="dxa" w:w="60"/>
-              <w:right w:type="dxa" w:w="80"/>
-            </w:tcMar>
-          </w:tcPr>
-          <w:p>
-            <w:pPr>
-              <w:jc w:val="center"/>
-            </w:pPr>
-            <w:r>
-              <w:rPr>
-                <w:sz w:val="18"/>
-                <w:szCs w:val="18"/>
-              </w:rPr>
-              <w:t xml:space="preserve">0</w:t>
-            </w:r>
-          </w:p>
-        </w:tc>
-        <w:tc>
-          <w:tcPr>
-            <w:shd w:fill="E8F5E9" w:color="E8F5E9" w:val="solid"/>
-            <w:tcMar>
-              <w:top w:type="dxa" w:w="60"/>
-              <w:left w:type="dxa" w:w="80"/>
-              <w:bottom w:type="dxa" w:w="60"/>
-              <w:right w:type="dxa" w:w="80"/>
-            </w:tcMar>
-          </w:tcPr>
-          <w:p>
-            <w:pPr>
-              <w:jc w:val="center"/>
-            </w:pPr>
-            <w:r>
-              <w:rPr>
-                <w:sz w:val="18"/>
-                <w:szCs w:val="18"/>
-              </w:rPr>
-              <w:t xml:space="preserve">0</w:t>
+              <w:t xml:space="preserve">1</w:t>
+            </w:r>
+          </w:p>
+        </w:tc>
+        <w:tc>
+          <w:tcPr>
+            <w:shd w:fill="E8F5E9" w:color="E8F5E9" w:val="solid"/>
+            <w:tcMar>
+              <w:top w:type="dxa" w:w="60"/>
+              <w:left w:type="dxa" w:w="80"/>
+              <w:bottom w:type="dxa" w:w="60"/>
+              <w:right w:type="dxa" w:w="80"/>
+            </w:tcMar>
+          </w:tcPr>
+          <w:p>
+            <w:pPr>
+              <w:jc w:val="center"/>
+            </w:pPr>
+            <w:r>
+              <w:rPr>
+                <w:sz w:val="18"/>
+                <w:szCs w:val="18"/>
+              </w:rPr>
+              <w:t xml:space="preserve">0</w:t>
+            </w:r>
+          </w:p>
+        </w:tc>
+        <w:tc>
+          <w:tcPr>
+            <w:shd w:fill="E8F5E9" w:color="E8F5E9" w:val="solid"/>
+            <w:tcMar>
+              <w:top w:type="dxa" w:w="60"/>
+              <w:left w:type="dxa" w:w="80"/>
+              <w:bottom w:type="dxa" w:w="60"/>
+              <w:right w:type="dxa" w:w="80"/>
+            </w:tcMar>
+          </w:tcPr>
+          <w:p>
+            <w:pPr>
+              <w:jc w:val="center"/>
+            </w:pPr>
+            <w:r>
+              <w:rPr>
+                <w:sz w:val="18"/>
+                <w:szCs w:val="18"/>
+              </w:rPr>
+              <w:t xml:space="preserve">1</w:t>
             </w:r>
           </w:p>
         </w:tc>
@@ -1415,30 +1415,30 @@
                 <w:sz w:val="18"/>
                 <w:szCs w:val="18"/>
               </w:rPr>
-              <w:t xml:space="preserve">95%</w:t>
-            </w:r>
-          </w:p>
-        </w:tc>
-        <w:tc>
-          <w:tcPr>
-            <w:shd w:fill="E8F5E9" w:color="E8F5E9" w:val="solid"/>
-            <w:tcMar>
-              <w:top w:type="dxa" w:w="60"/>
-              <w:left w:type="dxa" w:w="80"/>
-              <w:bottom w:type="dxa" w:w="60"/>
-              <w:right w:type="dxa" w:w="80"/>
-            </w:tcMar>
-          </w:tcPr>
-          <w:p>
-            <w:pPr>
-              <w:jc w:val="center"/>
-            </w:pPr>
-            <w:r>
-              <w:rPr>
-                <w:sz w:val="18"/>
-                <w:szCs w:val="18"/>
-              </w:rPr>
-              <w:t xml:space="preserve">20142ms</w:t>
+              <w:t xml:space="preserve">85%</w:t>
+            </w:r>
+          </w:p>
+        </w:tc>
+        <w:tc>
+          <w:tcPr>
+            <w:shd w:fill="E8F5E9" w:color="E8F5E9" w:val="solid"/>
+            <w:tcMar>
+              <w:top w:type="dxa" w:w="60"/>
+              <w:left w:type="dxa" w:w="80"/>
+              <w:bottom w:type="dxa" w:w="60"/>
+              <w:right w:type="dxa" w:w="80"/>
+            </w:tcMar>
+          </w:tcPr>
+          <w:p>
+            <w:pPr>
+              <w:jc w:val="center"/>
+            </w:pPr>
+            <w:r>
+              <w:rPr>
+                <w:sz w:val="18"/>
+                <w:szCs w:val="18"/>
+              </w:rPr>
+              <w:t xml:space="preserve">19454ms</w:t>
             </w:r>
           </w:p>
         </w:tc>
@@ -1532,99 +1532,99 @@
                 <w:sz w:val="18"/>
                 <w:szCs w:val="18"/>
               </w:rPr>
-              <w:t xml:space="preserve">18</w:t>
-            </w:r>
-          </w:p>
-        </w:tc>
-        <w:tc>
-          <w:tcPr>
-            <w:shd w:fill="E8F5E9" w:color="E8F5E9" w:val="solid"/>
-            <w:tcMar>
-              <w:top w:type="dxa" w:w="60"/>
-              <w:left w:type="dxa" w:w="80"/>
-              <w:bottom w:type="dxa" w:w="60"/>
-              <w:right w:type="dxa" w:w="80"/>
-            </w:tcMar>
-          </w:tcPr>
-          <w:p>
-            <w:pPr>
-              <w:jc w:val="center"/>
-            </w:pPr>
-            <w:r>
-              <w:rPr>
-                <w:sz w:val="18"/>
-                <w:szCs w:val="18"/>
-              </w:rPr>
-              <w:t xml:space="preserve">2</w:t>
-            </w:r>
-          </w:p>
-        </w:tc>
-        <w:tc>
-          <w:tcPr>
-            <w:shd w:fill="E8F5E9" w:color="E8F5E9" w:val="solid"/>
-            <w:tcMar>
-              <w:top w:type="dxa" w:w="60"/>
-              <w:left w:type="dxa" w:w="80"/>
-              <w:bottom w:type="dxa" w:w="60"/>
-              <w:right w:type="dxa" w:w="80"/>
-            </w:tcMar>
-          </w:tcPr>
-          <w:p>
-            <w:pPr>
-              <w:jc w:val="center"/>
-            </w:pPr>
-            <w:r>
-              <w:rPr>
-                <w:sz w:val="18"/>
-                <w:szCs w:val="18"/>
-              </w:rPr>
-              <w:t xml:space="preserve">0</w:t>
-            </w:r>
-          </w:p>
-        </w:tc>
-        <w:tc>
-          <w:tcPr>
-            <w:shd w:fill="E8F5E9" w:color="E8F5E9" w:val="solid"/>
-            <w:tcMar>
-              <w:top w:type="dxa" w:w="60"/>
-              <w:left w:type="dxa" w:w="80"/>
-              <w:bottom w:type="dxa" w:w="60"/>
-              <w:right w:type="dxa" w:w="80"/>
-            </w:tcMar>
-          </w:tcPr>
-          <w:p>
-            <w:pPr>
-              <w:jc w:val="center"/>
-            </w:pPr>
-            <w:r>
-              <w:rPr>
-                <w:sz w:val="18"/>
-                <w:szCs w:val="18"/>
-              </w:rPr>
-              <w:t xml:space="preserve">0</w:t>
-            </w:r>
-          </w:p>
-        </w:tc>
-        <w:tc>
-          <w:tcPr>
-            <w:shd w:fill="E8F5E9" w:color="E8F5E9" w:val="solid"/>
-            <w:tcMar>
-              <w:top w:type="dxa" w:w="60"/>
-              <w:left w:type="dxa" w:w="80"/>
-              <w:bottom w:type="dxa" w:w="60"/>
-              <w:right w:type="dxa" w:w="80"/>
-            </w:tcMar>
-          </w:tcPr>
-          <w:p>
-            <w:pPr>
-              <w:jc w:val="center"/>
-            </w:pPr>
-            <w:r>
-              <w:rPr>
-                <w:sz w:val="18"/>
-                <w:szCs w:val="18"/>
-              </w:rPr>
-              <w:t xml:space="preserve">0</w:t>
+              <w:t xml:space="preserve">19</w:t>
+            </w:r>
+          </w:p>
+        </w:tc>
+        <w:tc>
+          <w:tcPr>
+            <w:shd w:fill="E8F5E9" w:color="E8F5E9" w:val="solid"/>
+            <w:tcMar>
+              <w:top w:type="dxa" w:w="60"/>
+              <w:left w:type="dxa" w:w="80"/>
+              <w:bottom w:type="dxa" w:w="60"/>
+              <w:right w:type="dxa" w:w="80"/>
+            </w:tcMar>
+          </w:tcPr>
+          <w:p>
+            <w:pPr>
+              <w:jc w:val="center"/>
+            </w:pPr>
+            <w:r>
+              <w:rPr>
+                <w:sz w:val="18"/>
+                <w:szCs w:val="18"/>
+              </w:rPr>
+              <w:t xml:space="preserve">0</w:t>
+            </w:r>
+          </w:p>
+        </w:tc>
+        <w:tc>
+          <w:tcPr>
+            <w:shd w:fill="E8F5E9" w:color="E8F5E9" w:val="solid"/>
+            <w:tcMar>
+              <w:top w:type="dxa" w:w="60"/>
+              <w:left w:type="dxa" w:w="80"/>
+              <w:bottom w:type="dxa" w:w="60"/>
+              <w:right w:type="dxa" w:w="80"/>
+            </w:tcMar>
+          </w:tcPr>
+          <w:p>
+            <w:pPr>
+              <w:jc w:val="center"/>
+            </w:pPr>
+            <w:r>
+              <w:rPr>
+                <w:sz w:val="18"/>
+                <w:szCs w:val="18"/>
+              </w:rPr>
+              <w:t xml:space="preserve">0</w:t>
+            </w:r>
+          </w:p>
+        </w:tc>
+        <w:tc>
+          <w:tcPr>
+            <w:shd w:fill="E8F5E9" w:color="E8F5E9" w:val="solid"/>
+            <w:tcMar>
+              <w:top w:type="dxa" w:w="60"/>
+              <w:left w:type="dxa" w:w="80"/>
+              <w:bottom w:type="dxa" w:w="60"/>
+              <w:right w:type="dxa" w:w="80"/>
+            </w:tcMar>
+          </w:tcPr>
+          <w:p>
+            <w:pPr>
+              <w:jc w:val="center"/>
+            </w:pPr>
+            <w:r>
+              <w:rPr>
+                <w:sz w:val="18"/>
+                <w:szCs w:val="18"/>
+              </w:rPr>
+              <w:t xml:space="preserve">0</w:t>
+            </w:r>
+          </w:p>
+        </w:tc>
+        <w:tc>
+          <w:tcPr>
+            <w:shd w:fill="E8F5E9" w:color="E8F5E9" w:val="solid"/>
+            <w:tcMar>
+              <w:top w:type="dxa" w:w="60"/>
+              <w:left w:type="dxa" w:w="80"/>
+              <w:bottom w:type="dxa" w:w="60"/>
+              <w:right w:type="dxa" w:w="80"/>
+            </w:tcMar>
+          </w:tcPr>
+          <w:p>
+            <w:pPr>
+              <w:jc w:val="center"/>
+            </w:pPr>
+            <w:r>
+              <w:rPr>
+                <w:sz w:val="18"/>
+                <w:szCs w:val="18"/>
+              </w:rPr>
+              <w:t xml:space="preserve">1</w:t>
             </w:r>
           </w:p>
         </w:tc>
@@ -1649,30 +1649,30 @@
                 <w:sz w:val="18"/>
                 <w:szCs w:val="18"/>
               </w:rPr>
-              <w:t xml:space="preserve">90%</w:t>
-            </w:r>
-          </w:p>
-        </w:tc>
-        <w:tc>
-          <w:tcPr>
-            <w:shd w:fill="E8F5E9" w:color="E8F5E9" w:val="solid"/>
-            <w:tcMar>
-              <w:top w:type="dxa" w:w="60"/>
-              <w:left w:type="dxa" w:w="80"/>
-              <w:bottom w:type="dxa" w:w="60"/>
-              <w:right w:type="dxa" w:w="80"/>
-            </w:tcMar>
-          </w:tcPr>
-          <w:p>
-            <w:pPr>
-              <w:jc w:val="center"/>
-            </w:pPr>
-            <w:r>
-              <w:rPr>
-                <w:sz w:val="18"/>
-                <w:szCs w:val="18"/>
-              </w:rPr>
-              <w:t xml:space="preserve">20694ms</w:t>
+              <w:t xml:space="preserve">95%</w:t>
+            </w:r>
+          </w:p>
+        </w:tc>
+        <w:tc>
+          <w:tcPr>
+            <w:shd w:fill="E8F5E9" w:color="E8F5E9" w:val="solid"/>
+            <w:tcMar>
+              <w:top w:type="dxa" w:w="60"/>
+              <w:left w:type="dxa" w:w="80"/>
+              <w:bottom w:type="dxa" w:w="60"/>
+              <w:right w:type="dxa" w:w="80"/>
+            </w:tcMar>
+          </w:tcPr>
+          <w:p>
+            <w:pPr>
+              <w:jc w:val="center"/>
+            </w:pPr>
+            <w:r>
+              <w:rPr>
+                <w:sz w:val="18"/>
+                <w:szCs w:val="18"/>
+              </w:rPr>
+              <w:t xml:space="preserve">20440ms</w:t>
             </w:r>
           </w:p>
         </w:tc>
@@ -1906,7 +1906,7 @@
                 <w:sz w:val="18"/>
                 <w:szCs w:val="18"/>
               </w:rPr>
-              <w:t xml:space="preserve">15266ms</w:t>
+              <w:t xml:space="preserve">15408ms</w:t>
             </w:r>
           </w:p>
         </w:tc>
@@ -2000,99 +2000,99 @@
                 <w:sz w:val="18"/>
                 <w:szCs w:val="18"/>
               </w:rPr>
-              <w:t xml:space="preserve">20</w:t>
-            </w:r>
-          </w:p>
-        </w:tc>
-        <w:tc>
-          <w:tcPr>
-            <w:shd w:fill="E8F5E9" w:color="E8F5E9" w:val="solid"/>
-            <w:tcMar>
-              <w:top w:type="dxa" w:w="60"/>
-              <w:left w:type="dxa" w:w="80"/>
-              <w:bottom w:type="dxa" w:w="60"/>
-              <w:right w:type="dxa" w:w="80"/>
-            </w:tcMar>
-          </w:tcPr>
-          <w:p>
-            <w:pPr>
-              <w:jc w:val="center"/>
-            </w:pPr>
-            <w:r>
-              <w:rPr>
-                <w:sz w:val="18"/>
-                <w:szCs w:val="18"/>
-              </w:rPr>
-              <w:t xml:space="preserve">0</w:t>
-            </w:r>
-          </w:p>
-        </w:tc>
-        <w:tc>
-          <w:tcPr>
-            <w:shd w:fill="E8F5E9" w:color="E8F5E9" w:val="solid"/>
-            <w:tcMar>
-              <w:top w:type="dxa" w:w="60"/>
-              <w:left w:type="dxa" w:w="80"/>
-              <w:bottom w:type="dxa" w:w="60"/>
-              <w:right w:type="dxa" w:w="80"/>
-            </w:tcMar>
-          </w:tcPr>
-          <w:p>
-            <w:pPr>
-              <w:jc w:val="center"/>
-            </w:pPr>
-            <w:r>
-              <w:rPr>
-                <w:sz w:val="18"/>
-                <w:szCs w:val="18"/>
-              </w:rPr>
-              <w:t xml:space="preserve">0</w:t>
-            </w:r>
-          </w:p>
-        </w:tc>
-        <w:tc>
-          <w:tcPr>
-            <w:shd w:fill="E8F5E9" w:color="E8F5E9" w:val="solid"/>
-            <w:tcMar>
-              <w:top w:type="dxa" w:w="60"/>
-              <w:left w:type="dxa" w:w="80"/>
-              <w:bottom w:type="dxa" w:w="60"/>
-              <w:right w:type="dxa" w:w="80"/>
-            </w:tcMar>
-          </w:tcPr>
-          <w:p>
-            <w:pPr>
-              <w:jc w:val="center"/>
-            </w:pPr>
-            <w:r>
-              <w:rPr>
-                <w:sz w:val="18"/>
-                <w:szCs w:val="18"/>
-              </w:rPr>
-              <w:t xml:space="preserve">0</w:t>
-            </w:r>
-          </w:p>
-        </w:tc>
-        <w:tc>
-          <w:tcPr>
-            <w:shd w:fill="E8F5E9" w:color="E8F5E9" w:val="solid"/>
-            <w:tcMar>
-              <w:top w:type="dxa" w:w="60"/>
-              <w:left w:type="dxa" w:w="80"/>
-              <w:bottom w:type="dxa" w:w="60"/>
-              <w:right w:type="dxa" w:w="80"/>
-            </w:tcMar>
-          </w:tcPr>
-          <w:p>
-            <w:pPr>
-              <w:jc w:val="center"/>
-            </w:pPr>
-            <w:r>
-              <w:rPr>
-                <w:sz w:val="18"/>
-                <w:szCs w:val="18"/>
-              </w:rPr>
-              <w:t xml:space="preserve">0</w:t>
+              <w:t xml:space="preserve">19</w:t>
+            </w:r>
+          </w:p>
+        </w:tc>
+        <w:tc>
+          <w:tcPr>
+            <w:shd w:fill="E8F5E9" w:color="E8F5E9" w:val="solid"/>
+            <w:tcMar>
+              <w:top w:type="dxa" w:w="60"/>
+              <w:left w:type="dxa" w:w="80"/>
+              <w:bottom w:type="dxa" w:w="60"/>
+              <w:right w:type="dxa" w:w="80"/>
+            </w:tcMar>
+          </w:tcPr>
+          <w:p>
+            <w:pPr>
+              <w:jc w:val="center"/>
+            </w:pPr>
+            <w:r>
+              <w:rPr>
+                <w:sz w:val="18"/>
+                <w:szCs w:val="18"/>
+              </w:rPr>
+              <w:t xml:space="preserve">0</w:t>
+            </w:r>
+          </w:p>
+        </w:tc>
+        <w:tc>
+          <w:tcPr>
+            <w:shd w:fill="E8F5E9" w:color="E8F5E9" w:val="solid"/>
+            <w:tcMar>
+              <w:top w:type="dxa" w:w="60"/>
+              <w:left w:type="dxa" w:w="80"/>
+              <w:bottom w:type="dxa" w:w="60"/>
+              <w:right w:type="dxa" w:w="80"/>
+            </w:tcMar>
+          </w:tcPr>
+          <w:p>
+            <w:pPr>
+              <w:jc w:val="center"/>
+            </w:pPr>
+            <w:r>
+              <w:rPr>
+                <w:sz w:val="18"/>
+                <w:szCs w:val="18"/>
+              </w:rPr>
+              <w:t xml:space="preserve">0</w:t>
+            </w:r>
+          </w:p>
+        </w:tc>
+        <w:tc>
+          <w:tcPr>
+            <w:shd w:fill="E8F5E9" w:color="E8F5E9" w:val="solid"/>
+            <w:tcMar>
+              <w:top w:type="dxa" w:w="60"/>
+              <w:left w:type="dxa" w:w="80"/>
+              <w:bottom w:type="dxa" w:w="60"/>
+              <w:right w:type="dxa" w:w="80"/>
+            </w:tcMar>
+          </w:tcPr>
+          <w:p>
+            <w:pPr>
+              <w:jc w:val="center"/>
+            </w:pPr>
+            <w:r>
+              <w:rPr>
+                <w:sz w:val="18"/>
+                <w:szCs w:val="18"/>
+              </w:rPr>
+              <w:t xml:space="preserve">0</w:t>
+            </w:r>
+          </w:p>
+        </w:tc>
+        <w:tc>
+          <w:tcPr>
+            <w:shd w:fill="E8F5E9" w:color="E8F5E9" w:val="solid"/>
+            <w:tcMar>
+              <w:top w:type="dxa" w:w="60"/>
+              <w:left w:type="dxa" w:w="80"/>
+              <w:bottom w:type="dxa" w:w="60"/>
+              <w:right w:type="dxa" w:w="80"/>
+            </w:tcMar>
+          </w:tcPr>
+          <w:p>
+            <w:pPr>
+              <w:jc w:val="center"/>
+            </w:pPr>
+            <w:r>
+              <w:rPr>
+                <w:sz w:val="18"/>
+                <w:szCs w:val="18"/>
+              </w:rPr>
+              <w:t xml:space="preserve">1</w:t>
             </w:r>
           </w:p>
         </w:tc>
@@ -2117,30 +2117,30 @@
                 <w:sz w:val="18"/>
                 <w:szCs w:val="18"/>
               </w:rPr>
-              <w:t xml:space="preserve">100%</w:t>
-            </w:r>
-          </w:p>
-        </w:tc>
-        <w:tc>
-          <w:tcPr>
-            <w:shd w:fill="E8F5E9" w:color="E8F5E9" w:val="solid"/>
-            <w:tcMar>
-              <w:top w:type="dxa" w:w="60"/>
-              <w:left w:type="dxa" w:w="80"/>
-              <w:bottom w:type="dxa" w:w="60"/>
-              <w:right w:type="dxa" w:w="80"/>
-            </w:tcMar>
-          </w:tcPr>
-          <w:p>
-            <w:pPr>
-              <w:jc w:val="center"/>
-            </w:pPr>
-            <w:r>
-              <w:rPr>
-                <w:sz w:val="18"/>
-                <w:szCs w:val="18"/>
-              </w:rPr>
-              <w:t xml:space="preserve">16894ms</w:t>
+              <w:t xml:space="preserve">95%</w:t>
+            </w:r>
+          </w:p>
+        </w:tc>
+        <w:tc>
+          <w:tcPr>
+            <w:shd w:fill="E8F5E9" w:color="E8F5E9" w:val="solid"/>
+            <w:tcMar>
+              <w:top w:type="dxa" w:w="60"/>
+              <w:left w:type="dxa" w:w="80"/>
+              <w:bottom w:type="dxa" w:w="60"/>
+              <w:right w:type="dxa" w:w="80"/>
+            </w:tcMar>
+          </w:tcPr>
+          <w:p>
+            <w:pPr>
+              <w:jc w:val="center"/>
+            </w:pPr>
+            <w:r>
+              <w:rPr>
+                <w:sz w:val="18"/>
+                <w:szCs w:val="18"/>
+              </w:rPr>
+              <w:t xml:space="preserve">16277ms</w:t>
             </w:r>
           </w:p>
         </w:tc>
@@ -2211,122 +2211,122 @@
                 <w:sz w:val="18"/>
                 <w:szCs w:val="18"/>
               </w:rPr>
+              <w:t xml:space="preserve">0</w:t>
+            </w:r>
+          </w:p>
+        </w:tc>
+        <w:tc>
+          <w:tcPr>
+            <w:shd w:fill="E8F5E9" w:color="E8F5E9" w:val="solid"/>
+            <w:tcMar>
+              <w:top w:type="dxa" w:w="60"/>
+              <w:left w:type="dxa" w:w="80"/>
+              <w:bottom w:type="dxa" w:w="60"/>
+              <w:right w:type="dxa" w:w="80"/>
+            </w:tcMar>
+          </w:tcPr>
+          <w:p>
+            <w:pPr>
+              <w:jc w:val="center"/>
+            </w:pPr>
+            <w:r>
+              <w:rPr>
+                <w:sz w:val="18"/>
+                <w:szCs w:val="18"/>
+              </w:rPr>
+              <w:t xml:space="preserve">16</w:t>
+            </w:r>
+          </w:p>
+        </w:tc>
+        <w:tc>
+          <w:tcPr>
+            <w:shd w:fill="E8F5E9" w:color="E8F5E9" w:val="solid"/>
+            <w:tcMar>
+              <w:top w:type="dxa" w:w="60"/>
+              <w:left w:type="dxa" w:w="80"/>
+              <w:bottom w:type="dxa" w:w="60"/>
+              <w:right w:type="dxa" w:w="80"/>
+            </w:tcMar>
+          </w:tcPr>
+          <w:p>
+            <w:pPr>
+              <w:jc w:val="center"/>
+            </w:pPr>
+            <w:r>
+              <w:rPr>
+                <w:sz w:val="18"/>
+                <w:szCs w:val="18"/>
+              </w:rPr>
+              <w:t xml:space="preserve">0</w:t>
+            </w:r>
+          </w:p>
+        </w:tc>
+        <w:tc>
+          <w:tcPr>
+            <w:shd w:fill="E8F5E9" w:color="E8F5E9" w:val="solid"/>
+            <w:tcMar>
+              <w:top w:type="dxa" w:w="60"/>
+              <w:left w:type="dxa" w:w="80"/>
+              <w:bottom w:type="dxa" w:w="60"/>
+              <w:right w:type="dxa" w:w="80"/>
+            </w:tcMar>
+          </w:tcPr>
+          <w:p>
+            <w:pPr>
+              <w:jc w:val="center"/>
+            </w:pPr>
+            <w:r>
+              <w:rPr>
+                <w:sz w:val="18"/>
+                <w:szCs w:val="18"/>
+              </w:rPr>
+              <w:t xml:space="preserve">3</w:t>
+            </w:r>
+          </w:p>
+        </w:tc>
+        <w:tc>
+          <w:tcPr>
+            <w:shd w:fill="E8F5E9" w:color="E8F5E9" w:val="solid"/>
+            <w:tcMar>
+              <w:top w:type="dxa" w:w="60"/>
+              <w:left w:type="dxa" w:w="80"/>
+              <w:bottom w:type="dxa" w:w="60"/>
+              <w:right w:type="dxa" w:w="80"/>
+            </w:tcMar>
+          </w:tcPr>
+          <w:p>
+            <w:pPr>
+              <w:jc w:val="center"/>
+            </w:pPr>
+            <w:r>
+              <w:rPr>
+                <w:sz w:val="18"/>
+                <w:szCs w:val="18"/>
+              </w:rPr>
+              <w:t xml:space="preserve">0</w:t>
+            </w:r>
+          </w:p>
+        </w:tc>
+        <w:tc>
+          <w:tcPr>
+            <w:shd w:fill="E8F5E9" w:color="E8F5E9" w:val="solid"/>
+            <w:tcMar>
+              <w:top w:type="dxa" w:w="60"/>
+              <w:left w:type="dxa" w:w="80"/>
+              <w:bottom w:type="dxa" w:w="60"/>
+              <w:right w:type="dxa" w:w="80"/>
+            </w:tcMar>
+          </w:tcPr>
+          <w:p>
+            <w:pPr>
+              <w:jc w:val="center"/>
+            </w:pPr>
+            <w:r>
+              <w:rPr>
+                <w:sz w:val="18"/>
+                <w:szCs w:val="18"/>
+              </w:rPr>
               <w:t xml:space="preserve">1</w:t>
-            </w:r>
-          </w:p>
-        </w:tc>
-        <w:tc>
-          <w:tcPr>
-            <w:shd w:fill="E8F5E9" w:color="E8F5E9" w:val="solid"/>
-            <w:tcMar>
-              <w:top w:type="dxa" w:w="60"/>
-              <w:left w:type="dxa" w:w="80"/>
-              <w:bottom w:type="dxa" w:w="60"/>
-              <w:right w:type="dxa" w:w="80"/>
-            </w:tcMar>
-          </w:tcPr>
-          <w:p>
-            <w:pPr>
-              <w:jc w:val="center"/>
-            </w:pPr>
-            <w:r>
-              <w:rPr>
-                <w:sz w:val="18"/>
-                <w:szCs w:val="18"/>
-              </w:rPr>
-              <w:t xml:space="preserve">16</w:t>
-            </w:r>
-          </w:p>
-        </w:tc>
-        <w:tc>
-          <w:tcPr>
-            <w:shd w:fill="E8F5E9" w:color="E8F5E9" w:val="solid"/>
-            <w:tcMar>
-              <w:top w:type="dxa" w:w="60"/>
-              <w:left w:type="dxa" w:w="80"/>
-              <w:bottom w:type="dxa" w:w="60"/>
-              <w:right w:type="dxa" w:w="80"/>
-            </w:tcMar>
-          </w:tcPr>
-          <w:p>
-            <w:pPr>
-              <w:jc w:val="center"/>
-            </w:pPr>
-            <w:r>
-              <w:rPr>
-                <w:sz w:val="18"/>
-                <w:szCs w:val="18"/>
-              </w:rPr>
-              <w:t xml:space="preserve">1</w:t>
-            </w:r>
-          </w:p>
-        </w:tc>
-        <w:tc>
-          <w:tcPr>
-            <w:shd w:fill="E8F5E9" w:color="E8F5E9" w:val="solid"/>
-            <w:tcMar>
-              <w:top w:type="dxa" w:w="60"/>
-              <w:left w:type="dxa" w:w="80"/>
-              <w:bottom w:type="dxa" w:w="60"/>
-              <w:right w:type="dxa" w:w="80"/>
-            </w:tcMar>
-          </w:tcPr>
-          <w:p>
-            <w:pPr>
-              <w:jc w:val="center"/>
-            </w:pPr>
-            <w:r>
-              <w:rPr>
-                <w:sz w:val="18"/>
-                <w:szCs w:val="18"/>
-              </w:rPr>
-              <w:t xml:space="preserve">2</w:t>
-            </w:r>
-          </w:p>
-        </w:tc>
-        <w:tc>
-          <w:tcPr>
-            <w:shd w:fill="E8F5E9" w:color="E8F5E9" w:val="solid"/>
-            <w:tcMar>
-              <w:top w:type="dxa" w:w="60"/>
-              <w:left w:type="dxa" w:w="80"/>
-              <w:bottom w:type="dxa" w:w="60"/>
-              <w:right w:type="dxa" w:w="80"/>
-            </w:tcMar>
-          </w:tcPr>
-          <w:p>
-            <w:pPr>
-              <w:jc w:val="center"/>
-            </w:pPr>
-            <w:r>
-              <w:rPr>
-                <w:sz w:val="18"/>
-                <w:szCs w:val="18"/>
-              </w:rPr>
-              <w:t xml:space="preserve">0</w:t>
-            </w:r>
-          </w:p>
-        </w:tc>
-        <w:tc>
-          <w:tcPr>
-            <w:shd w:fill="E8F5E9" w:color="E8F5E9" w:val="solid"/>
-            <w:tcMar>
-              <w:top w:type="dxa" w:w="60"/>
-              <w:left w:type="dxa" w:w="80"/>
-              <w:bottom w:type="dxa" w:w="60"/>
-              <w:right w:type="dxa" w:w="80"/>
-            </w:tcMar>
-          </w:tcPr>
-          <w:p>
-            <w:pPr>
-              <w:jc w:val="center"/>
-            </w:pPr>
-            <w:r>
-              <w:rPr>
-                <w:sz w:val="18"/>
-                <w:szCs w:val="18"/>
-              </w:rPr>
-              <w:t xml:space="preserve">0</w:t>
             </w:r>
           </w:p>
         </w:tc>
@@ -2351,30 +2351,30 @@
                 <w:sz w:val="18"/>
                 <w:szCs w:val="18"/>
               </w:rPr>
-              <w:t xml:space="preserve">85%</w:t>
-            </w:r>
-          </w:p>
-        </w:tc>
-        <w:tc>
-          <w:tcPr>
-            <w:shd w:fill="E8F5E9" w:color="E8F5E9" w:val="solid"/>
-            <w:tcMar>
-              <w:top w:type="dxa" w:w="60"/>
-              <w:left w:type="dxa" w:w="80"/>
-              <w:bottom w:type="dxa" w:w="60"/>
-              <w:right w:type="dxa" w:w="80"/>
-            </w:tcMar>
-          </w:tcPr>
-          <w:p>
-            <w:pPr>
-              <w:jc w:val="center"/>
-            </w:pPr>
-            <w:r>
-              <w:rPr>
-                <w:sz w:val="18"/>
-                <w:szCs w:val="18"/>
-              </w:rPr>
-              <w:t xml:space="preserve">21066ms</w:t>
+              <w:t xml:space="preserve">80%</w:t>
+            </w:r>
+          </w:p>
+        </w:tc>
+        <w:tc>
+          <w:tcPr>
+            <w:shd w:fill="E8F5E9" w:color="E8F5E9" w:val="solid"/>
+            <w:tcMar>
+              <w:top w:type="dxa" w:w="60"/>
+              <w:left w:type="dxa" w:w="80"/>
+              <w:bottom w:type="dxa" w:w="60"/>
+              <w:right w:type="dxa" w:w="80"/>
+            </w:tcMar>
+          </w:tcPr>
+          <w:p>
+            <w:pPr>
+              <w:jc w:val="center"/>
+            </w:pPr>
+            <w:r>
+              <w:rPr>
+                <w:sz w:val="18"/>
+                <w:szCs w:val="18"/>
+              </w:rPr>
+              <w:t xml:space="preserve">21105ms</w:t>
             </w:r>
           </w:p>
         </w:tc>
@@ -2468,30 +2468,30 @@
                 <w:sz w:val="18"/>
                 <w:szCs w:val="18"/>
               </w:rPr>
-              <w:t xml:space="preserve">18</w:t>
-            </w:r>
-          </w:p>
-        </w:tc>
-        <w:tc>
-          <w:tcPr>
-            <w:shd w:fill="E8F5E9" w:color="E8F5E9" w:val="solid"/>
-            <w:tcMar>
-              <w:top w:type="dxa" w:w="60"/>
-              <w:left w:type="dxa" w:w="80"/>
-              <w:bottom w:type="dxa" w:w="60"/>
-              <w:right w:type="dxa" w:w="80"/>
-            </w:tcMar>
-          </w:tcPr>
-          <w:p>
-            <w:pPr>
-              <w:jc w:val="center"/>
-            </w:pPr>
-            <w:r>
-              <w:rPr>
-                <w:sz w:val="18"/>
-                <w:szCs w:val="18"/>
-              </w:rPr>
-              <w:t xml:space="preserve">2</w:t>
+              <w:t xml:space="preserve">19</w:t>
+            </w:r>
+          </w:p>
+        </w:tc>
+        <w:tc>
+          <w:tcPr>
+            <w:shd w:fill="E8F5E9" w:color="E8F5E9" w:val="solid"/>
+            <w:tcMar>
+              <w:top w:type="dxa" w:w="60"/>
+              <w:left w:type="dxa" w:w="80"/>
+              <w:bottom w:type="dxa" w:w="60"/>
+              <w:right w:type="dxa" w:w="80"/>
+            </w:tcMar>
+          </w:tcPr>
+          <w:p>
+            <w:pPr>
+              <w:jc w:val="center"/>
+            </w:pPr>
+            <w:r>
+              <w:rPr>
+                <w:sz w:val="18"/>
+                <w:szCs w:val="18"/>
+              </w:rPr>
+              <w:t xml:space="preserve">1</w:t>
             </w:r>
           </w:p>
         </w:tc>
@@ -2585,30 +2585,30 @@
                 <w:sz w:val="18"/>
                 <w:szCs w:val="18"/>
               </w:rPr>
-              <w:t xml:space="preserve">90%</w:t>
-            </w:r>
-          </w:p>
-        </w:tc>
-        <w:tc>
-          <w:tcPr>
-            <w:shd w:fill="E8F5E9" w:color="E8F5E9" w:val="solid"/>
-            <w:tcMar>
-              <w:top w:type="dxa" w:w="60"/>
-              <w:left w:type="dxa" w:w="80"/>
-              <w:bottom w:type="dxa" w:w="60"/>
-              <w:right w:type="dxa" w:w="80"/>
-            </w:tcMar>
-          </w:tcPr>
-          <w:p>
-            <w:pPr>
-              <w:jc w:val="center"/>
-            </w:pPr>
-            <w:r>
-              <w:rPr>
-                <w:sz w:val="18"/>
-                <w:szCs w:val="18"/>
-              </w:rPr>
-              <w:t xml:space="preserve">18598ms</w:t>
+              <w:t xml:space="preserve">95%</w:t>
+            </w:r>
+          </w:p>
+        </w:tc>
+        <w:tc>
+          <w:tcPr>
+            <w:shd w:fill="E8F5E9" w:color="E8F5E9" w:val="solid"/>
+            <w:tcMar>
+              <w:top w:type="dxa" w:w="60"/>
+              <w:left w:type="dxa" w:w="80"/>
+              <w:bottom w:type="dxa" w:w="60"/>
+              <w:right w:type="dxa" w:w="80"/>
+            </w:tcMar>
+          </w:tcPr>
+          <w:p>
+            <w:pPr>
+              <w:jc w:val="center"/>
+            </w:pPr>
+            <w:r>
+              <w:rPr>
+                <w:sz w:val="18"/>
+                <w:szCs w:val="18"/>
+              </w:rPr>
+              <w:t xml:space="preserve">19722ms</w:t>
             </w:r>
           </w:p>
         </w:tc>
@@ -2702,53 +2702,53 @@
                 <w:sz w:val="18"/>
                 <w:szCs w:val="18"/>
               </w:rPr>
-              <w:t xml:space="preserve">20</w:t>
-            </w:r>
-          </w:p>
-        </w:tc>
-        <w:tc>
-          <w:tcPr>
-            <w:shd w:fill="E8F5E9" w:color="E8F5E9" w:val="solid"/>
-            <w:tcMar>
-              <w:top w:type="dxa" w:w="60"/>
-              <w:left w:type="dxa" w:w="80"/>
-              <w:bottom w:type="dxa" w:w="60"/>
-              <w:right w:type="dxa" w:w="80"/>
-            </w:tcMar>
-          </w:tcPr>
-          <w:p>
-            <w:pPr>
-              <w:jc w:val="center"/>
-            </w:pPr>
-            <w:r>
-              <w:rPr>
-                <w:sz w:val="18"/>
-                <w:szCs w:val="18"/>
-              </w:rPr>
-              <w:t xml:space="preserve">0</w:t>
-            </w:r>
-          </w:p>
-        </w:tc>
-        <w:tc>
-          <w:tcPr>
-            <w:shd w:fill="E8F5E9" w:color="E8F5E9" w:val="solid"/>
-            <w:tcMar>
-              <w:top w:type="dxa" w:w="60"/>
-              <w:left w:type="dxa" w:w="80"/>
-              <w:bottom w:type="dxa" w:w="60"/>
-              <w:right w:type="dxa" w:w="80"/>
-            </w:tcMar>
-          </w:tcPr>
-          <w:p>
-            <w:pPr>
-              <w:jc w:val="center"/>
-            </w:pPr>
-            <w:r>
-              <w:rPr>
-                <w:sz w:val="18"/>
-                <w:szCs w:val="18"/>
-              </w:rPr>
-              <w:t xml:space="preserve">0</w:t>
+              <w:t xml:space="preserve">18</w:t>
+            </w:r>
+          </w:p>
+        </w:tc>
+        <w:tc>
+          <w:tcPr>
+            <w:shd w:fill="E8F5E9" w:color="E8F5E9" w:val="solid"/>
+            <w:tcMar>
+              <w:top w:type="dxa" w:w="60"/>
+              <w:left w:type="dxa" w:w="80"/>
+              <w:bottom w:type="dxa" w:w="60"/>
+              <w:right w:type="dxa" w:w="80"/>
+            </w:tcMar>
+          </w:tcPr>
+          <w:p>
+            <w:pPr>
+              <w:jc w:val="center"/>
+            </w:pPr>
+            <w:r>
+              <w:rPr>
+                <w:sz w:val="18"/>
+                <w:szCs w:val="18"/>
+              </w:rPr>
+              <w:t xml:space="preserve">1</w:t>
+            </w:r>
+          </w:p>
+        </w:tc>
+        <w:tc>
+          <w:tcPr>
+            <w:shd w:fill="E8F5E9" w:color="E8F5E9" w:val="solid"/>
+            <w:tcMar>
+              <w:top w:type="dxa" w:w="60"/>
+              <w:left w:type="dxa" w:w="80"/>
+              <w:bottom w:type="dxa" w:w="60"/>
+              <w:right w:type="dxa" w:w="80"/>
+            </w:tcMar>
+          </w:tcPr>
+          <w:p>
+            <w:pPr>
+              <w:jc w:val="center"/>
+            </w:pPr>
+            <w:r>
+              <w:rPr>
+                <w:sz w:val="18"/>
+                <w:szCs w:val="18"/>
+              </w:rPr>
+              <w:t xml:space="preserve">1</w:t>
             </w:r>
           </w:p>
         </w:tc>
@@ -2819,30 +2819,30 @@
                 <w:sz w:val="18"/>
                 <w:szCs w:val="18"/>
               </w:rPr>
-              <w:t xml:space="preserve">100%</w:t>
-            </w:r>
-          </w:p>
-        </w:tc>
-        <w:tc>
-          <w:tcPr>
-            <w:shd w:fill="E8F5E9" w:color="E8F5E9" w:val="solid"/>
-            <w:tcMar>
-              <w:top w:type="dxa" w:w="60"/>
-              <w:left w:type="dxa" w:w="80"/>
-              <w:bottom w:type="dxa" w:w="60"/>
-              <w:right w:type="dxa" w:w="80"/>
-            </w:tcMar>
-          </w:tcPr>
-          <w:p>
-            <w:pPr>
-              <w:jc w:val="center"/>
-            </w:pPr>
-            <w:r>
-              <w:rPr>
-                <w:sz w:val="18"/>
-                <w:szCs w:val="18"/>
-              </w:rPr>
-              <w:t xml:space="preserve">16893ms</w:t>
+              <w:t xml:space="preserve">90%</w:t>
+            </w:r>
+          </w:p>
+        </w:tc>
+        <w:tc>
+          <w:tcPr>
+            <w:shd w:fill="E8F5E9" w:color="E8F5E9" w:val="solid"/>
+            <w:tcMar>
+              <w:top w:type="dxa" w:w="60"/>
+              <w:left w:type="dxa" w:w="80"/>
+              <w:bottom w:type="dxa" w:w="60"/>
+              <w:right w:type="dxa" w:w="80"/>
+            </w:tcMar>
+          </w:tcPr>
+          <w:p>
+            <w:pPr>
+              <w:jc w:val="center"/>
+            </w:pPr>
+            <w:r>
+              <w:rPr>
+                <w:sz w:val="18"/>
+                <w:szCs w:val="18"/>
+              </w:rPr>
+              <w:t xml:space="preserve">15848ms</w:t>
             </w:r>
           </w:p>
         </w:tc>
@@ -2959,76 +2959,76 @@
                 <w:sz w:val="18"/>
                 <w:szCs w:val="18"/>
               </w:rPr>
-              <w:t xml:space="preserve">4</w:t>
-            </w:r>
-          </w:p>
-        </w:tc>
-        <w:tc>
-          <w:tcPr>
-            <w:shd w:fill="E8F5E9" w:color="E8F5E9" w:val="solid"/>
-            <w:tcMar>
-              <w:top w:type="dxa" w:w="60"/>
-              <w:left w:type="dxa" w:w="80"/>
-              <w:bottom w:type="dxa" w:w="60"/>
-              <w:right w:type="dxa" w:w="80"/>
-            </w:tcMar>
-          </w:tcPr>
-          <w:p>
-            <w:pPr>
-              <w:jc w:val="center"/>
-            </w:pPr>
-            <w:r>
-              <w:rPr>
-                <w:sz w:val="18"/>
-                <w:szCs w:val="18"/>
-              </w:rPr>
-              <w:t xml:space="preserve">0</w:t>
-            </w:r>
-          </w:p>
-        </w:tc>
-        <w:tc>
-          <w:tcPr>
-            <w:shd w:fill="E8F5E9" w:color="E8F5E9" w:val="solid"/>
-            <w:tcMar>
-              <w:top w:type="dxa" w:w="60"/>
-              <w:left w:type="dxa" w:w="80"/>
-              <w:bottom w:type="dxa" w:w="60"/>
-              <w:right w:type="dxa" w:w="80"/>
-            </w:tcMar>
-          </w:tcPr>
-          <w:p>
-            <w:pPr>
-              <w:jc w:val="center"/>
-            </w:pPr>
-            <w:r>
-              <w:rPr>
-                <w:sz w:val="18"/>
-                <w:szCs w:val="18"/>
-              </w:rPr>
-              <w:t xml:space="preserve">0</w:t>
-            </w:r>
-          </w:p>
-        </w:tc>
-        <w:tc>
-          <w:tcPr>
-            <w:shd w:fill="E8F5E9" w:color="E8F5E9" w:val="solid"/>
-            <w:tcMar>
-              <w:top w:type="dxa" w:w="60"/>
-              <w:left w:type="dxa" w:w="80"/>
-              <w:bottom w:type="dxa" w:w="60"/>
-              <w:right w:type="dxa" w:w="80"/>
-            </w:tcMar>
-          </w:tcPr>
-          <w:p>
-            <w:pPr>
-              <w:jc w:val="center"/>
-            </w:pPr>
-            <w:r>
-              <w:rPr>
-                <w:sz w:val="18"/>
-                <w:szCs w:val="18"/>
-              </w:rPr>
-              <w:t xml:space="preserve">0</w:t>
+              <w:t xml:space="preserve">3</w:t>
+            </w:r>
+          </w:p>
+        </w:tc>
+        <w:tc>
+          <w:tcPr>
+            <w:shd w:fill="E8F5E9" w:color="E8F5E9" w:val="solid"/>
+            <w:tcMar>
+              <w:top w:type="dxa" w:w="60"/>
+              <w:left w:type="dxa" w:w="80"/>
+              <w:bottom w:type="dxa" w:w="60"/>
+              <w:right w:type="dxa" w:w="80"/>
+            </w:tcMar>
+          </w:tcPr>
+          <w:p>
+            <w:pPr>
+              <w:jc w:val="center"/>
+            </w:pPr>
+            <w:r>
+              <w:rPr>
+                <w:sz w:val="18"/>
+                <w:szCs w:val="18"/>
+              </w:rPr>
+              <w:t xml:space="preserve">0</w:t>
+            </w:r>
+          </w:p>
+        </w:tc>
+        <w:tc>
+          <w:tcPr>
+            <w:shd w:fill="E8F5E9" w:color="E8F5E9" w:val="solid"/>
+            <w:tcMar>
+              <w:top w:type="dxa" w:w="60"/>
+              <w:left w:type="dxa" w:w="80"/>
+              <w:bottom w:type="dxa" w:w="60"/>
+              <w:right w:type="dxa" w:w="80"/>
+            </w:tcMar>
+          </w:tcPr>
+          <w:p>
+            <w:pPr>
+              <w:jc w:val="center"/>
+            </w:pPr>
+            <w:r>
+              <w:rPr>
+                <w:sz w:val="18"/>
+                <w:szCs w:val="18"/>
+              </w:rPr>
+              <w:t xml:space="preserve">0</w:t>
+            </w:r>
+          </w:p>
+        </w:tc>
+        <w:tc>
+          <w:tcPr>
+            <w:shd w:fill="E8F5E9" w:color="E8F5E9" w:val="solid"/>
+            <w:tcMar>
+              <w:top w:type="dxa" w:w="60"/>
+              <w:left w:type="dxa" w:w="80"/>
+              <w:bottom w:type="dxa" w:w="60"/>
+              <w:right w:type="dxa" w:w="80"/>
+            </w:tcMar>
+          </w:tcPr>
+          <w:p>
+            <w:pPr>
+              <w:jc w:val="center"/>
+            </w:pPr>
+            <w:r>
+              <w:rPr>
+                <w:sz w:val="18"/>
+                <w:szCs w:val="18"/>
+              </w:rPr>
+              <w:t xml:space="preserve">1</w:t>
             </w:r>
           </w:p>
         </w:tc>
@@ -3076,7 +3076,7 @@
                 <w:sz w:val="18"/>
                 <w:szCs w:val="18"/>
               </w:rPr>
-              <w:t xml:space="preserve">20224ms</w:t>
+              <w:t xml:space="preserve">20705ms</w:t>
             </w:r>
           </w:p>
         </w:tc>
@@ -3170,30 +3170,30 @@
                 <w:sz w:val="18"/>
                 <w:szCs w:val="18"/>
               </w:rPr>
-              <w:t xml:space="preserve">19</w:t>
-            </w:r>
-          </w:p>
-        </w:tc>
-        <w:tc>
-          <w:tcPr>
-            <w:shd w:fill="E8F5E9" w:color="E8F5E9" w:val="solid"/>
-            <w:tcMar>
-              <w:top w:type="dxa" w:w="60"/>
-              <w:left w:type="dxa" w:w="80"/>
-              <w:bottom w:type="dxa" w:w="60"/>
-              <w:right w:type="dxa" w:w="80"/>
-            </w:tcMar>
-          </w:tcPr>
-          <w:p>
-            <w:pPr>
-              <w:jc w:val="center"/>
-            </w:pPr>
-            <w:r>
-              <w:rPr>
-                <w:sz w:val="18"/>
-                <w:szCs w:val="18"/>
-              </w:rPr>
-              <w:t xml:space="preserve">1</w:t>
+              <w:t xml:space="preserve">20</w:t>
+            </w:r>
+          </w:p>
+        </w:tc>
+        <w:tc>
+          <w:tcPr>
+            <w:shd w:fill="E8F5E9" w:color="E8F5E9" w:val="solid"/>
+            <w:tcMar>
+              <w:top w:type="dxa" w:w="60"/>
+              <w:left w:type="dxa" w:w="80"/>
+              <w:bottom w:type="dxa" w:w="60"/>
+              <w:right w:type="dxa" w:w="80"/>
+            </w:tcMar>
+          </w:tcPr>
+          <w:p>
+            <w:pPr>
+              <w:jc w:val="center"/>
+            </w:pPr>
+            <w:r>
+              <w:rPr>
+                <w:sz w:val="18"/>
+                <w:szCs w:val="18"/>
+              </w:rPr>
+              <w:t xml:space="preserve">0</w:t>
             </w:r>
           </w:p>
         </w:tc>
@@ -3287,30 +3287,30 @@
                 <w:sz w:val="18"/>
                 <w:szCs w:val="18"/>
               </w:rPr>
-              <w:t xml:space="preserve">95%</w:t>
-            </w:r>
-          </w:p>
-        </w:tc>
-        <w:tc>
-          <w:tcPr>
-            <w:shd w:fill="E8F5E9" w:color="E8F5E9" w:val="solid"/>
-            <w:tcMar>
-              <w:top w:type="dxa" w:w="60"/>
-              <w:left w:type="dxa" w:w="80"/>
-              <w:bottom w:type="dxa" w:w="60"/>
-              <w:right w:type="dxa" w:w="80"/>
-            </w:tcMar>
-          </w:tcPr>
-          <w:p>
-            <w:pPr>
-              <w:jc w:val="center"/>
-            </w:pPr>
-            <w:r>
-              <w:rPr>
-                <w:sz w:val="18"/>
-                <w:szCs w:val="18"/>
-              </w:rPr>
-              <w:t xml:space="preserve">15492ms</w:t>
+              <w:t xml:space="preserve">100%</w:t>
+            </w:r>
+          </w:p>
+        </w:tc>
+        <w:tc>
+          <w:tcPr>
+            <w:shd w:fill="E8F5E9" w:color="E8F5E9" w:val="solid"/>
+            <w:tcMar>
+              <w:top w:type="dxa" w:w="60"/>
+              <w:left w:type="dxa" w:w="80"/>
+              <w:bottom w:type="dxa" w:w="60"/>
+              <w:right w:type="dxa" w:w="80"/>
+            </w:tcMar>
+          </w:tcPr>
+          <w:p>
+            <w:pPr>
+              <w:jc w:val="center"/>
+            </w:pPr>
+            <w:r>
+              <w:rPr>
+                <w:sz w:val="18"/>
+                <w:szCs w:val="18"/>
+              </w:rPr>
+              <w:t xml:space="preserve">15689ms</w:t>
             </w:r>
           </w:p>
         </w:tc>
@@ -3404,30 +3404,30 @@
                 <w:sz w:val="18"/>
                 <w:szCs w:val="18"/>
               </w:rPr>
-              <w:t xml:space="preserve">18</w:t>
-            </w:r>
-          </w:p>
-        </w:tc>
-        <w:tc>
-          <w:tcPr>
-            <w:shd w:fill="E8F5E9" w:color="E8F5E9" w:val="solid"/>
-            <w:tcMar>
-              <w:top w:type="dxa" w:w="60"/>
-              <w:left w:type="dxa" w:w="80"/>
-              <w:bottom w:type="dxa" w:w="60"/>
-              <w:right w:type="dxa" w:w="80"/>
-            </w:tcMar>
-          </w:tcPr>
-          <w:p>
-            <w:pPr>
-              <w:jc w:val="center"/>
-            </w:pPr>
-            <w:r>
-              <w:rPr>
-                <w:sz w:val="18"/>
-                <w:szCs w:val="18"/>
-              </w:rPr>
-              <w:t xml:space="preserve">0</w:t>
+              <w:t xml:space="preserve">16</w:t>
+            </w:r>
+          </w:p>
+        </w:tc>
+        <w:tc>
+          <w:tcPr>
+            <w:shd w:fill="E8F5E9" w:color="E8F5E9" w:val="solid"/>
+            <w:tcMar>
+              <w:top w:type="dxa" w:w="60"/>
+              <w:left w:type="dxa" w:w="80"/>
+              <w:bottom w:type="dxa" w:w="60"/>
+              <w:right w:type="dxa" w:w="80"/>
+            </w:tcMar>
+          </w:tcPr>
+          <w:p>
+            <w:pPr>
+              <w:jc w:val="center"/>
+            </w:pPr>
+            <w:r>
+              <w:rPr>
+                <w:sz w:val="18"/>
+                <w:szCs w:val="18"/>
+              </w:rPr>
+              <w:t xml:space="preserve">1</w:t>
             </w:r>
           </w:p>
         </w:tc>
@@ -3496,7 +3496,7 @@
                 <w:sz w:val="18"/>
                 <w:szCs w:val="18"/>
               </w:rPr>
-              <w:t xml:space="preserve">0</w:t>
+              <w:t xml:space="preserve">1</w:t>
             </w:r>
           </w:p>
         </w:tc>
@@ -3521,30 +3521,30 @@
                 <w:sz w:val="18"/>
                 <w:szCs w:val="18"/>
               </w:rPr>
-              <w:t xml:space="preserve">90%</w:t>
-            </w:r>
-          </w:p>
-        </w:tc>
-        <w:tc>
-          <w:tcPr>
-            <w:shd w:fill="E8F5E9" w:color="E8F5E9" w:val="solid"/>
-            <w:tcMar>
-              <w:top w:type="dxa" w:w="60"/>
-              <w:left w:type="dxa" w:w="80"/>
-              <w:bottom w:type="dxa" w:w="60"/>
-              <w:right w:type="dxa" w:w="80"/>
-            </w:tcMar>
-          </w:tcPr>
-          <w:p>
-            <w:pPr>
-              <w:jc w:val="center"/>
-            </w:pPr>
-            <w:r>
-              <w:rPr>
-                <w:sz w:val="18"/>
-                <w:szCs w:val="18"/>
-              </w:rPr>
-              <w:t xml:space="preserve">13357ms</w:t>
+              <w:t xml:space="preserve">80%</w:t>
+            </w:r>
+          </w:p>
+        </w:tc>
+        <w:tc>
+          <w:tcPr>
+            <w:shd w:fill="E8F5E9" w:color="E8F5E9" w:val="solid"/>
+            <w:tcMar>
+              <w:top w:type="dxa" w:w="60"/>
+              <w:left w:type="dxa" w:w="80"/>
+              <w:bottom w:type="dxa" w:w="60"/>
+              <w:right w:type="dxa" w:w="80"/>
+            </w:tcMar>
+          </w:tcPr>
+          <w:p>
+            <w:pPr>
+              <w:jc w:val="center"/>
+            </w:pPr>
+            <w:r>
+              <w:rPr>
+                <w:sz w:val="18"/>
+                <w:szCs w:val="18"/>
+              </w:rPr>
+              <w:t xml:space="preserve">13313ms</w:t>
             </w:r>
           </w:p>
         </w:tc>
@@ -3778,7 +3778,7 @@
                 <w:sz w:val="18"/>
                 <w:szCs w:val="18"/>
               </w:rPr>
-              <w:t xml:space="preserve">15269ms</w:t>
+              <w:t xml:space="preserve">14781ms</w:t>
             </w:r>
           </w:p>
         </w:tc>
@@ -3872,30 +3872,30 @@
                 <w:sz w:val="18"/>
                 <w:szCs w:val="18"/>
               </w:rPr>
-              <w:t xml:space="preserve">18</w:t>
-            </w:r>
-          </w:p>
-        </w:tc>
-        <w:tc>
-          <w:tcPr>
-            <w:shd w:fill="E8F5E9" w:color="E8F5E9" w:val="solid"/>
-            <w:tcMar>
-              <w:top w:type="dxa" w:w="60"/>
-              <w:left w:type="dxa" w:w="80"/>
-              <w:bottom w:type="dxa" w:w="60"/>
-              <w:right w:type="dxa" w:w="80"/>
-            </w:tcMar>
-          </w:tcPr>
-          <w:p>
-            <w:pPr>
-              <w:jc w:val="center"/>
-            </w:pPr>
-            <w:r>
-              <w:rPr>
-                <w:sz w:val="18"/>
-                <w:szCs w:val="18"/>
-              </w:rPr>
-              <w:t xml:space="preserve">2</w:t>
+              <w:t xml:space="preserve">20</w:t>
+            </w:r>
+          </w:p>
+        </w:tc>
+        <w:tc>
+          <w:tcPr>
+            <w:shd w:fill="E8F5E9" w:color="E8F5E9" w:val="solid"/>
+            <w:tcMar>
+              <w:top w:type="dxa" w:w="60"/>
+              <w:left w:type="dxa" w:w="80"/>
+              <w:bottom w:type="dxa" w:w="60"/>
+              <w:right w:type="dxa" w:w="80"/>
+            </w:tcMar>
+          </w:tcPr>
+          <w:p>
+            <w:pPr>
+              <w:jc w:val="center"/>
+            </w:pPr>
+            <w:r>
+              <w:rPr>
+                <w:sz w:val="18"/>
+                <w:szCs w:val="18"/>
+              </w:rPr>
+              <w:t xml:space="preserve">0</w:t>
             </w:r>
           </w:p>
         </w:tc>
@@ -3989,30 +3989,30 @@
                 <w:sz w:val="18"/>
                 <w:szCs w:val="18"/>
               </w:rPr>
-              <w:t xml:space="preserve">90%</w:t>
-            </w:r>
-          </w:p>
-        </w:tc>
-        <w:tc>
-          <w:tcPr>
-            <w:shd w:fill="E8F5E9" w:color="E8F5E9" w:val="solid"/>
-            <w:tcMar>
-              <w:top w:type="dxa" w:w="60"/>
-              <w:left w:type="dxa" w:w="80"/>
-              <w:bottom w:type="dxa" w:w="60"/>
-              <w:right w:type="dxa" w:w="80"/>
-            </w:tcMar>
-          </w:tcPr>
-          <w:p>
-            <w:pPr>
-              <w:jc w:val="center"/>
-            </w:pPr>
-            <w:r>
-              <w:rPr>
-                <w:sz w:val="18"/>
-                <w:szCs w:val="18"/>
-              </w:rPr>
-              <w:t xml:space="preserve">14117ms</w:t>
+              <w:t xml:space="preserve">100%</w:t>
+            </w:r>
+          </w:p>
+        </w:tc>
+        <w:tc>
+          <w:tcPr>
+            <w:shd w:fill="E8F5E9" w:color="E8F5E9" w:val="solid"/>
+            <w:tcMar>
+              <w:top w:type="dxa" w:w="60"/>
+              <w:left w:type="dxa" w:w="80"/>
+              <w:bottom w:type="dxa" w:w="60"/>
+              <w:right w:type="dxa" w:w="80"/>
+            </w:tcMar>
+          </w:tcPr>
+          <w:p>
+            <w:pPr>
+              <w:jc w:val="center"/>
+            </w:pPr>
+            <w:r>
+              <w:rPr>
+                <w:sz w:val="18"/>
+                <w:szCs w:val="18"/>
+              </w:rPr>
+              <w:t xml:space="preserve">13813ms</w:t>
             </w:r>
           </w:p>
         </w:tc>
@@ -4246,7 +4246,7 @@
                 <w:sz w:val="18"/>
                 <w:szCs w:val="18"/>
               </w:rPr>
-              <w:t xml:space="preserve">17992ms</w:t>
+              <w:t xml:space="preserve">17959ms</w:t>
             </w:r>
           </w:p>
         </w:tc>
@@ -4254,7 +4254,7 @@
       <w:tr>
         <w:tc>
           <w:tcPr>
-            <w:shd w:fill="FFF9C4" w:color="FFF9C4" w:val="solid"/>
+            <w:shd w:fill="E8F5E9" w:color="E8F5E9" w:val="solid"/>
             <w:tcMar>
               <w:top w:type="dxa" w:w="60"/>
               <w:left w:type="dxa" w:w="80"/>
@@ -4277,7 +4277,7 @@
         </w:tc>
         <w:tc>
           <w:tcPr>
-            <w:shd w:fill="FFF9C4" w:color="FFF9C4" w:val="solid"/>
+            <w:shd w:fill="E8F5E9" w:color="E8F5E9" w:val="solid"/>
             <w:tcMar>
               <w:top w:type="dxa" w:w="60"/>
               <w:left w:type="dxa" w:w="80"/>
@@ -4300,145 +4300,145 @@
         </w:tc>
         <w:tc>
           <w:tcPr>
-            <w:shd w:fill="FFF9C4" w:color="FFF9C4" w:val="solid"/>
-            <w:tcMar>
-              <w:top w:type="dxa" w:w="60"/>
-              <w:left w:type="dxa" w:w="80"/>
-              <w:bottom w:type="dxa" w:w="60"/>
-              <w:right w:type="dxa" w:w="80"/>
-            </w:tcMar>
-          </w:tcPr>
-          <w:p>
-            <w:pPr>
-              <w:jc w:val="center"/>
-            </w:pPr>
-            <w:r>
-              <w:rPr>
-                <w:sz w:val="18"/>
-                <w:szCs w:val="18"/>
-              </w:rPr>
-              <w:t xml:space="preserve">0</w:t>
-            </w:r>
-          </w:p>
-        </w:tc>
-        <w:tc>
-          <w:tcPr>
-            <w:shd w:fill="FFF9C4" w:color="FFF9C4" w:val="solid"/>
-            <w:tcMar>
-              <w:top w:type="dxa" w:w="60"/>
-              <w:left w:type="dxa" w:w="80"/>
-              <w:bottom w:type="dxa" w:w="60"/>
-              <w:right w:type="dxa" w:w="80"/>
-            </w:tcMar>
-          </w:tcPr>
-          <w:p>
-            <w:pPr>
-              <w:jc w:val="center"/>
-            </w:pPr>
-            <w:r>
-              <w:rPr>
-                <w:sz w:val="18"/>
-                <w:szCs w:val="18"/>
-              </w:rPr>
-              <w:t xml:space="preserve">13</w:t>
-            </w:r>
-          </w:p>
-        </w:tc>
-        <w:tc>
-          <w:tcPr>
-            <w:shd w:fill="FFF9C4" w:color="FFF9C4" w:val="solid"/>
-            <w:tcMar>
-              <w:top w:type="dxa" w:w="60"/>
-              <w:left w:type="dxa" w:w="80"/>
-              <w:bottom w:type="dxa" w:w="60"/>
-              <w:right w:type="dxa" w:w="80"/>
-            </w:tcMar>
-          </w:tcPr>
-          <w:p>
-            <w:pPr>
-              <w:jc w:val="center"/>
-            </w:pPr>
-            <w:r>
-              <w:rPr>
-                <w:sz w:val="18"/>
-                <w:szCs w:val="18"/>
-              </w:rPr>
-              <w:t xml:space="preserve">7</w:t>
-            </w:r>
-          </w:p>
-        </w:tc>
-        <w:tc>
-          <w:tcPr>
-            <w:shd w:fill="FFF9C4" w:color="FFF9C4" w:val="solid"/>
-            <w:tcMar>
-              <w:top w:type="dxa" w:w="60"/>
-              <w:left w:type="dxa" w:w="80"/>
-              <w:bottom w:type="dxa" w:w="60"/>
-              <w:right w:type="dxa" w:w="80"/>
-            </w:tcMar>
-          </w:tcPr>
-          <w:p>
-            <w:pPr>
-              <w:jc w:val="center"/>
-            </w:pPr>
-            <w:r>
-              <w:rPr>
-                <w:sz w:val="18"/>
-                <w:szCs w:val="18"/>
-              </w:rPr>
-              <w:t xml:space="preserve">0</w:t>
-            </w:r>
-          </w:p>
-        </w:tc>
-        <w:tc>
-          <w:tcPr>
-            <w:shd w:fill="FFF9C4" w:color="FFF9C4" w:val="solid"/>
-            <w:tcMar>
-              <w:top w:type="dxa" w:w="60"/>
-              <w:left w:type="dxa" w:w="80"/>
-              <w:bottom w:type="dxa" w:w="60"/>
-              <w:right w:type="dxa" w:w="80"/>
-            </w:tcMar>
-          </w:tcPr>
-          <w:p>
-            <w:pPr>
-              <w:jc w:val="center"/>
-            </w:pPr>
-            <w:r>
-              <w:rPr>
-                <w:sz w:val="18"/>
-                <w:szCs w:val="18"/>
-              </w:rPr>
-              <w:t xml:space="preserve">0</w:t>
-            </w:r>
-          </w:p>
-        </w:tc>
-        <w:tc>
-          <w:tcPr>
-            <w:shd w:fill="FFF9C4" w:color="FFF9C4" w:val="solid"/>
-            <w:tcMar>
-              <w:top w:type="dxa" w:w="60"/>
-              <w:left w:type="dxa" w:w="80"/>
-              <w:bottom w:type="dxa" w:w="60"/>
-              <w:right w:type="dxa" w:w="80"/>
-            </w:tcMar>
-          </w:tcPr>
-          <w:p>
-            <w:pPr>
-              <w:jc w:val="center"/>
-            </w:pPr>
-            <w:r>
-              <w:rPr>
-                <w:sz w:val="18"/>
-                <w:szCs w:val="18"/>
-              </w:rPr>
-              <w:t xml:space="preserve">0</w:t>
-            </w:r>
-          </w:p>
-        </w:tc>
-        <w:tc>
-          <w:tcPr>
-            <w:shd w:fill="FFF9C4" w:color="FFF9C4" w:val="solid"/>
+            <w:shd w:fill="E8F5E9" w:color="E8F5E9" w:val="solid"/>
+            <w:tcMar>
+              <w:top w:type="dxa" w:w="60"/>
+              <w:left w:type="dxa" w:w="80"/>
+              <w:bottom w:type="dxa" w:w="60"/>
+              <w:right w:type="dxa" w:w="80"/>
+            </w:tcMar>
+          </w:tcPr>
+          <w:p>
+            <w:pPr>
+              <w:jc w:val="center"/>
+            </w:pPr>
+            <w:r>
+              <w:rPr>
+                <w:sz w:val="18"/>
+                <w:szCs w:val="18"/>
+              </w:rPr>
+              <w:t xml:space="preserve">0</w:t>
+            </w:r>
+          </w:p>
+        </w:tc>
+        <w:tc>
+          <w:tcPr>
+            <w:shd w:fill="E8F5E9" w:color="E8F5E9" w:val="solid"/>
+            <w:tcMar>
+              <w:top w:type="dxa" w:w="60"/>
+              <w:left w:type="dxa" w:w="80"/>
+              <w:bottom w:type="dxa" w:w="60"/>
+              <w:right w:type="dxa" w:w="80"/>
+            </w:tcMar>
+          </w:tcPr>
+          <w:p>
+            <w:pPr>
+              <w:jc w:val="center"/>
+            </w:pPr>
+            <w:r>
+              <w:rPr>
+                <w:sz w:val="18"/>
+                <w:szCs w:val="18"/>
+              </w:rPr>
+              <w:t xml:space="preserve">14</w:t>
+            </w:r>
+          </w:p>
+        </w:tc>
+        <w:tc>
+          <w:tcPr>
+            <w:shd w:fill="E8F5E9" w:color="E8F5E9" w:val="solid"/>
+            <w:tcMar>
+              <w:top w:type="dxa" w:w="60"/>
+              <w:left w:type="dxa" w:w="80"/>
+              <w:bottom w:type="dxa" w:w="60"/>
+              <w:right w:type="dxa" w:w="80"/>
+            </w:tcMar>
+          </w:tcPr>
+          <w:p>
+            <w:pPr>
+              <w:jc w:val="center"/>
+            </w:pPr>
+            <w:r>
+              <w:rPr>
+                <w:sz w:val="18"/>
+                <w:szCs w:val="18"/>
+              </w:rPr>
+              <w:t xml:space="preserve">5</w:t>
+            </w:r>
+          </w:p>
+        </w:tc>
+        <w:tc>
+          <w:tcPr>
+            <w:shd w:fill="E8F5E9" w:color="E8F5E9" w:val="solid"/>
+            <w:tcMar>
+              <w:top w:type="dxa" w:w="60"/>
+              <w:left w:type="dxa" w:w="80"/>
+              <w:bottom w:type="dxa" w:w="60"/>
+              <w:right w:type="dxa" w:w="80"/>
+            </w:tcMar>
+          </w:tcPr>
+          <w:p>
+            <w:pPr>
+              <w:jc w:val="center"/>
+            </w:pPr>
+            <w:r>
+              <w:rPr>
+                <w:sz w:val="18"/>
+                <w:szCs w:val="18"/>
+              </w:rPr>
+              <w:t xml:space="preserve">0</w:t>
+            </w:r>
+          </w:p>
+        </w:tc>
+        <w:tc>
+          <w:tcPr>
+            <w:shd w:fill="E8F5E9" w:color="E8F5E9" w:val="solid"/>
+            <w:tcMar>
+              <w:top w:type="dxa" w:w="60"/>
+              <w:left w:type="dxa" w:w="80"/>
+              <w:bottom w:type="dxa" w:w="60"/>
+              <w:right w:type="dxa" w:w="80"/>
+            </w:tcMar>
+          </w:tcPr>
+          <w:p>
+            <w:pPr>
+              <w:jc w:val="center"/>
+            </w:pPr>
+            <w:r>
+              <w:rPr>
+                <w:sz w:val="18"/>
+                <w:szCs w:val="18"/>
+              </w:rPr>
+              <w:t xml:space="preserve">0</w:t>
+            </w:r>
+          </w:p>
+        </w:tc>
+        <w:tc>
+          <w:tcPr>
+            <w:shd w:fill="E8F5E9" w:color="E8F5E9" w:val="solid"/>
+            <w:tcMar>
+              <w:top w:type="dxa" w:w="60"/>
+              <w:left w:type="dxa" w:w="80"/>
+              <w:bottom w:type="dxa" w:w="60"/>
+              <w:right w:type="dxa" w:w="80"/>
+            </w:tcMar>
+          </w:tcPr>
+          <w:p>
+            <w:pPr>
+              <w:jc w:val="center"/>
+            </w:pPr>
+            <w:r>
+              <w:rPr>
+                <w:sz w:val="18"/>
+                <w:szCs w:val="18"/>
+              </w:rPr>
+              <w:t xml:space="preserve">1</w:t>
+            </w:r>
+          </w:p>
+        </w:tc>
+        <w:tc>
+          <w:tcPr>
+            <w:shd w:fill="E8F5E9" w:color="E8F5E9" w:val="solid"/>
             <w:tcMar>
               <w:top w:type="dxa" w:w="60"/>
               <w:left w:type="dxa" w:w="80"/>
@@ -4457,30 +4457,30 @@
                 <w:sz w:val="18"/>
                 <w:szCs w:val="18"/>
               </w:rPr>
-              <w:t xml:space="preserve">65%</w:t>
-            </w:r>
-          </w:p>
-        </w:tc>
-        <w:tc>
-          <w:tcPr>
-            <w:shd w:fill="FFF9C4" w:color="FFF9C4" w:val="solid"/>
-            <w:tcMar>
-              <w:top w:type="dxa" w:w="60"/>
-              <w:left w:type="dxa" w:w="80"/>
-              <w:bottom w:type="dxa" w:w="60"/>
-              <w:right w:type="dxa" w:w="80"/>
-            </w:tcMar>
-          </w:tcPr>
-          <w:p>
-            <w:pPr>
-              <w:jc w:val="center"/>
-            </w:pPr>
-            <w:r>
-              <w:rPr>
-                <w:sz w:val="18"/>
-                <w:szCs w:val="18"/>
-              </w:rPr>
-              <w:t xml:space="preserve">31969ms</w:t>
+              <w:t xml:space="preserve">70%</w:t>
+            </w:r>
+          </w:p>
+        </w:tc>
+        <w:tc>
+          <w:tcPr>
+            <w:shd w:fill="E8F5E9" w:color="E8F5E9" w:val="solid"/>
+            <w:tcMar>
+              <w:top w:type="dxa" w:w="60"/>
+              <w:left w:type="dxa" w:w="80"/>
+              <w:bottom w:type="dxa" w:w="60"/>
+              <w:right w:type="dxa" w:w="80"/>
+            </w:tcMar>
+          </w:tcPr>
+          <w:p>
+            <w:pPr>
+              <w:jc w:val="center"/>
+            </w:pPr>
+            <w:r>
+              <w:rPr>
+                <w:sz w:val="18"/>
+                <w:szCs w:val="18"/>
+              </w:rPr>
+              <w:t xml:space="preserve">33260ms</w:t>
             </w:r>
           </w:p>
         </w:tc>
@@ -4574,99 +4574,99 @@
                 <w:sz w:val="18"/>
                 <w:szCs w:val="18"/>
               </w:rPr>
-              <w:t xml:space="preserve">18</w:t>
-            </w:r>
-          </w:p>
-        </w:tc>
-        <w:tc>
-          <w:tcPr>
-            <w:shd w:fill="E8F5E9" w:color="E8F5E9" w:val="solid"/>
-            <w:tcMar>
-              <w:top w:type="dxa" w:w="60"/>
-              <w:left w:type="dxa" w:w="80"/>
-              <w:bottom w:type="dxa" w:w="60"/>
-              <w:right w:type="dxa" w:w="80"/>
-            </w:tcMar>
-          </w:tcPr>
-          <w:p>
-            <w:pPr>
-              <w:jc w:val="center"/>
-            </w:pPr>
-            <w:r>
-              <w:rPr>
-                <w:sz w:val="18"/>
-                <w:szCs w:val="18"/>
-              </w:rPr>
-              <w:t xml:space="preserve">2</w:t>
-            </w:r>
-          </w:p>
-        </w:tc>
-        <w:tc>
-          <w:tcPr>
-            <w:shd w:fill="E8F5E9" w:color="E8F5E9" w:val="solid"/>
-            <w:tcMar>
-              <w:top w:type="dxa" w:w="60"/>
-              <w:left w:type="dxa" w:w="80"/>
-              <w:bottom w:type="dxa" w:w="60"/>
-              <w:right w:type="dxa" w:w="80"/>
-            </w:tcMar>
-          </w:tcPr>
-          <w:p>
-            <w:pPr>
-              <w:jc w:val="center"/>
-            </w:pPr>
-            <w:r>
-              <w:rPr>
-                <w:sz w:val="18"/>
-                <w:szCs w:val="18"/>
-              </w:rPr>
-              <w:t xml:space="preserve">0</w:t>
-            </w:r>
-          </w:p>
-        </w:tc>
-        <w:tc>
-          <w:tcPr>
-            <w:shd w:fill="E8F5E9" w:color="E8F5E9" w:val="solid"/>
-            <w:tcMar>
-              <w:top w:type="dxa" w:w="60"/>
-              <w:left w:type="dxa" w:w="80"/>
-              <w:bottom w:type="dxa" w:w="60"/>
-              <w:right w:type="dxa" w:w="80"/>
-            </w:tcMar>
-          </w:tcPr>
-          <w:p>
-            <w:pPr>
-              <w:jc w:val="center"/>
-            </w:pPr>
-            <w:r>
-              <w:rPr>
-                <w:sz w:val="18"/>
-                <w:szCs w:val="18"/>
-              </w:rPr>
-              <w:t xml:space="preserve">0</w:t>
-            </w:r>
-          </w:p>
-        </w:tc>
-        <w:tc>
-          <w:tcPr>
-            <w:shd w:fill="E8F5E9" w:color="E8F5E9" w:val="solid"/>
-            <w:tcMar>
-              <w:top w:type="dxa" w:w="60"/>
-              <w:left w:type="dxa" w:w="80"/>
-              <w:bottom w:type="dxa" w:w="60"/>
-              <w:right w:type="dxa" w:w="80"/>
-            </w:tcMar>
-          </w:tcPr>
-          <w:p>
-            <w:pPr>
-              <w:jc w:val="center"/>
-            </w:pPr>
-            <w:r>
-              <w:rPr>
-                <w:sz w:val="18"/>
-                <w:szCs w:val="18"/>
-              </w:rPr>
-              <w:t xml:space="preserve">0</w:t>
+              <w:t xml:space="preserve">19</w:t>
+            </w:r>
+          </w:p>
+        </w:tc>
+        <w:tc>
+          <w:tcPr>
+            <w:shd w:fill="E8F5E9" w:color="E8F5E9" w:val="solid"/>
+            <w:tcMar>
+              <w:top w:type="dxa" w:w="60"/>
+              <w:left w:type="dxa" w:w="80"/>
+              <w:bottom w:type="dxa" w:w="60"/>
+              <w:right w:type="dxa" w:w="80"/>
+            </w:tcMar>
+          </w:tcPr>
+          <w:p>
+            <w:pPr>
+              <w:jc w:val="center"/>
+            </w:pPr>
+            <w:r>
+              <w:rPr>
+                <w:sz w:val="18"/>
+                <w:szCs w:val="18"/>
+              </w:rPr>
+              <w:t xml:space="preserve">0</w:t>
+            </w:r>
+          </w:p>
+        </w:tc>
+        <w:tc>
+          <w:tcPr>
+            <w:shd w:fill="E8F5E9" w:color="E8F5E9" w:val="solid"/>
+            <w:tcMar>
+              <w:top w:type="dxa" w:w="60"/>
+              <w:left w:type="dxa" w:w="80"/>
+              <w:bottom w:type="dxa" w:w="60"/>
+              <w:right w:type="dxa" w:w="80"/>
+            </w:tcMar>
+          </w:tcPr>
+          <w:p>
+            <w:pPr>
+              <w:jc w:val="center"/>
+            </w:pPr>
+            <w:r>
+              <w:rPr>
+                <w:sz w:val="18"/>
+                <w:szCs w:val="18"/>
+              </w:rPr>
+              <w:t xml:space="preserve">0</w:t>
+            </w:r>
+          </w:p>
+        </w:tc>
+        <w:tc>
+          <w:tcPr>
+            <w:shd w:fill="E8F5E9" w:color="E8F5E9" w:val="solid"/>
+            <w:tcMar>
+              <w:top w:type="dxa" w:w="60"/>
+              <w:left w:type="dxa" w:w="80"/>
+              <w:bottom w:type="dxa" w:w="60"/>
+              <w:right w:type="dxa" w:w="80"/>
+            </w:tcMar>
+          </w:tcPr>
+          <w:p>
+            <w:pPr>
+              <w:jc w:val="center"/>
+            </w:pPr>
+            <w:r>
+              <w:rPr>
+                <w:sz w:val="18"/>
+                <w:szCs w:val="18"/>
+              </w:rPr>
+              <w:t xml:space="preserve">0</w:t>
+            </w:r>
+          </w:p>
+        </w:tc>
+        <w:tc>
+          <w:tcPr>
+            <w:shd w:fill="E8F5E9" w:color="E8F5E9" w:val="solid"/>
+            <w:tcMar>
+              <w:top w:type="dxa" w:w="60"/>
+              <w:left w:type="dxa" w:w="80"/>
+              <w:bottom w:type="dxa" w:w="60"/>
+              <w:right w:type="dxa" w:w="80"/>
+            </w:tcMar>
+          </w:tcPr>
+          <w:p>
+            <w:pPr>
+              <w:jc w:val="center"/>
+            </w:pPr>
+            <w:r>
+              <w:rPr>
+                <w:sz w:val="18"/>
+                <w:szCs w:val="18"/>
+              </w:rPr>
+              <w:t xml:space="preserve">1</w:t>
             </w:r>
           </w:p>
         </w:tc>
@@ -4691,30 +4691,30 @@
                 <w:sz w:val="18"/>
                 <w:szCs w:val="18"/>
               </w:rPr>
-              <w:t xml:space="preserve">90%</w:t>
-            </w:r>
-          </w:p>
-        </w:tc>
-        <w:tc>
-          <w:tcPr>
-            <w:shd w:fill="E8F5E9" w:color="E8F5E9" w:val="solid"/>
-            <w:tcMar>
-              <w:top w:type="dxa" w:w="60"/>
-              <w:left w:type="dxa" w:w="80"/>
-              <w:bottom w:type="dxa" w:w="60"/>
-              <w:right w:type="dxa" w:w="80"/>
-            </w:tcMar>
-          </w:tcPr>
-          <w:p>
-            <w:pPr>
-              <w:jc w:val="center"/>
-            </w:pPr>
-            <w:r>
-              <w:rPr>
-                <w:sz w:val="18"/>
-                <w:szCs w:val="18"/>
-              </w:rPr>
-              <w:t xml:space="preserve">17499ms</w:t>
+              <w:t xml:space="preserve">95%</w:t>
+            </w:r>
+          </w:p>
+        </w:tc>
+        <w:tc>
+          <w:tcPr>
+            <w:shd w:fill="E8F5E9" w:color="E8F5E9" w:val="solid"/>
+            <w:tcMar>
+              <w:top w:type="dxa" w:w="60"/>
+              <w:left w:type="dxa" w:w="80"/>
+              <w:bottom w:type="dxa" w:w="60"/>
+              <w:right w:type="dxa" w:w="80"/>
+            </w:tcMar>
+          </w:tcPr>
+          <w:p>
+            <w:pPr>
+              <w:jc w:val="center"/>
+            </w:pPr>
+            <w:r>
+              <w:rPr>
+                <w:sz w:val="18"/>
+                <w:szCs w:val="18"/>
+              </w:rPr>
+              <w:t xml:space="preserve">16135ms</w:t>
             </w:r>
           </w:p>
         </w:tc>
@@ -4831,76 +4831,76 @@
                 <w:sz w:val="18"/>
                 <w:szCs w:val="18"/>
               </w:rPr>
+              <w:t xml:space="preserve">0</w:t>
+            </w:r>
+          </w:p>
+        </w:tc>
+        <w:tc>
+          <w:tcPr>
+            <w:shd w:fill="E8F5E9" w:color="E8F5E9" w:val="solid"/>
+            <w:tcMar>
+              <w:top w:type="dxa" w:w="60"/>
+              <w:left w:type="dxa" w:w="80"/>
+              <w:bottom w:type="dxa" w:w="60"/>
+              <w:right w:type="dxa" w:w="80"/>
+            </w:tcMar>
+          </w:tcPr>
+          <w:p>
+            <w:pPr>
+              <w:jc w:val="center"/>
+            </w:pPr>
+            <w:r>
+              <w:rPr>
+                <w:sz w:val="18"/>
+                <w:szCs w:val="18"/>
+              </w:rPr>
+              <w:t xml:space="preserve">0</w:t>
+            </w:r>
+          </w:p>
+        </w:tc>
+        <w:tc>
+          <w:tcPr>
+            <w:shd w:fill="E8F5E9" w:color="E8F5E9" w:val="solid"/>
+            <w:tcMar>
+              <w:top w:type="dxa" w:w="60"/>
+              <w:left w:type="dxa" w:w="80"/>
+              <w:bottom w:type="dxa" w:w="60"/>
+              <w:right w:type="dxa" w:w="80"/>
+            </w:tcMar>
+          </w:tcPr>
+          <w:p>
+            <w:pPr>
+              <w:jc w:val="center"/>
+            </w:pPr>
+            <w:r>
+              <w:rPr>
+                <w:sz w:val="18"/>
+                <w:szCs w:val="18"/>
+              </w:rPr>
+              <w:t xml:space="preserve">0</w:t>
+            </w:r>
+          </w:p>
+        </w:tc>
+        <w:tc>
+          <w:tcPr>
+            <w:shd w:fill="E8F5E9" w:color="E8F5E9" w:val="solid"/>
+            <w:tcMar>
+              <w:top w:type="dxa" w:w="60"/>
+              <w:left w:type="dxa" w:w="80"/>
+              <w:bottom w:type="dxa" w:w="60"/>
+              <w:right w:type="dxa" w:w="80"/>
+            </w:tcMar>
+          </w:tcPr>
+          <w:p>
+            <w:pPr>
+              <w:jc w:val="center"/>
+            </w:pPr>
+            <w:r>
+              <w:rPr>
+                <w:sz w:val="18"/>
+                <w:szCs w:val="18"/>
+              </w:rPr>
               <w:t xml:space="preserve">1</w:t>
-            </w:r>
-          </w:p>
-        </w:tc>
-        <w:tc>
-          <w:tcPr>
-            <w:shd w:fill="E8F5E9" w:color="E8F5E9" w:val="solid"/>
-            <w:tcMar>
-              <w:top w:type="dxa" w:w="60"/>
-              <w:left w:type="dxa" w:w="80"/>
-              <w:bottom w:type="dxa" w:w="60"/>
-              <w:right w:type="dxa" w:w="80"/>
-            </w:tcMar>
-          </w:tcPr>
-          <w:p>
-            <w:pPr>
-              <w:jc w:val="center"/>
-            </w:pPr>
-            <w:r>
-              <w:rPr>
-                <w:sz w:val="18"/>
-                <w:szCs w:val="18"/>
-              </w:rPr>
-              <w:t xml:space="preserve">0</w:t>
-            </w:r>
-          </w:p>
-        </w:tc>
-        <w:tc>
-          <w:tcPr>
-            <w:shd w:fill="E8F5E9" w:color="E8F5E9" w:val="solid"/>
-            <w:tcMar>
-              <w:top w:type="dxa" w:w="60"/>
-              <w:left w:type="dxa" w:w="80"/>
-              <w:bottom w:type="dxa" w:w="60"/>
-              <w:right w:type="dxa" w:w="80"/>
-            </w:tcMar>
-          </w:tcPr>
-          <w:p>
-            <w:pPr>
-              <w:jc w:val="center"/>
-            </w:pPr>
-            <w:r>
-              <w:rPr>
-                <w:sz w:val="18"/>
-                <w:szCs w:val="18"/>
-              </w:rPr>
-              <w:t xml:space="preserve">0</w:t>
-            </w:r>
-          </w:p>
-        </w:tc>
-        <w:tc>
-          <w:tcPr>
-            <w:shd w:fill="E8F5E9" w:color="E8F5E9" w:val="solid"/>
-            <w:tcMar>
-              <w:top w:type="dxa" w:w="60"/>
-              <w:left w:type="dxa" w:w="80"/>
-              <w:bottom w:type="dxa" w:w="60"/>
-              <w:right w:type="dxa" w:w="80"/>
-            </w:tcMar>
-          </w:tcPr>
-          <w:p>
-            <w:pPr>
-              <w:jc w:val="center"/>
-            </w:pPr>
-            <w:r>
-              <w:rPr>
-                <w:sz w:val="18"/>
-                <w:szCs w:val="18"/>
-              </w:rPr>
-              <w:t xml:space="preserve">0</w:t>
             </w:r>
           </w:p>
         </w:tc>
@@ -4948,7 +4948,7 @@
                 <w:sz w:val="18"/>
                 <w:szCs w:val="18"/>
               </w:rPr>
-              <w:t xml:space="preserve">17528ms</w:t>
+              <w:t xml:space="preserve">18192ms</w:t>
             </w:r>
           </w:p>
         </w:tc>
@@ -5019,30 +5019,30 @@
                 <w:sz w:val="18"/>
                 <w:szCs w:val="18"/>
               </w:rPr>
-              <w:t xml:space="preserve">1</w:t>
-            </w:r>
-          </w:p>
-        </w:tc>
-        <w:tc>
-          <w:tcPr>
-            <w:shd w:fill="E8F5E9" w:color="E8F5E9" w:val="solid"/>
-            <w:tcMar>
-              <w:top w:type="dxa" w:w="60"/>
-              <w:left w:type="dxa" w:w="80"/>
-              <w:bottom w:type="dxa" w:w="60"/>
-              <w:right w:type="dxa" w:w="80"/>
-            </w:tcMar>
-          </w:tcPr>
-          <w:p>
-            <w:pPr>
-              <w:jc w:val="center"/>
-            </w:pPr>
-            <w:r>
-              <w:rPr>
-                <w:sz w:val="18"/>
-                <w:szCs w:val="18"/>
-              </w:rPr>
-              <w:t xml:space="preserve">19</w:t>
+              <w:t xml:space="preserve">0</w:t>
+            </w:r>
+          </w:p>
+        </w:tc>
+        <w:tc>
+          <w:tcPr>
+            <w:shd w:fill="E8F5E9" w:color="E8F5E9" w:val="solid"/>
+            <w:tcMar>
+              <w:top w:type="dxa" w:w="60"/>
+              <w:left w:type="dxa" w:w="80"/>
+              <w:bottom w:type="dxa" w:w="60"/>
+              <w:right w:type="dxa" w:w="80"/>
+            </w:tcMar>
+          </w:tcPr>
+          <w:p>
+            <w:pPr>
+              <w:jc w:val="center"/>
+            </w:pPr>
+            <w:r>
+              <w:rPr>
+                <w:sz w:val="18"/>
+                <w:szCs w:val="18"/>
+              </w:rPr>
+              <w:t xml:space="preserve">20</w:t>
             </w:r>
           </w:p>
         </w:tc>
@@ -5182,7 +5182,7 @@
                 <w:sz w:val="18"/>
                 <w:szCs w:val="18"/>
               </w:rPr>
-              <w:t xml:space="preserve">16493ms</w:t>
+              <w:t xml:space="preserve">16920ms</w:t>
             </w:r>
           </w:p>
         </w:tc>
@@ -5259,7 +5259,7 @@
                 <w:sz w:val="18"/>
                 <w:szCs w:val="18"/>
               </w:rPr>
-              <w:t xml:space="preserve">2</w:t>
+              <w:t xml:space="preserve">0</w:t>
             </w:r>
           </w:p>
         </w:tc>
@@ -5309,7 +5309,7 @@
                 <w:sz w:val="18"/>
                 <w:szCs w:val="18"/>
               </w:rPr>
-              <w:t xml:space="preserve">27</w:t>
+              <w:t xml:space="preserve">16</w:t>
             </w:r>
           </w:p>
         </w:tc>
@@ -5334,7 +5334,7 @@
                 <w:sz w:val="18"/>
                 <w:szCs w:val="18"/>
               </w:rPr>
-              <w:t xml:space="preserve">2</w:t>
+              <w:t xml:space="preserve">5</w:t>
             </w:r>
           </w:p>
         </w:tc>
@@ -5384,7 +5384,7 @@
                 <w:sz w:val="18"/>
                 <w:szCs w:val="18"/>
               </w:rPr>
-              <w:t xml:space="preserve">0</w:t>
+              <w:t xml:space="preserve">10</w:t>
             </w:r>
           </w:p>
         </w:tc>
@@ -5434,7 +5434,7 @@
                 <w:sz w:val="18"/>
                 <w:szCs w:val="18"/>
               </w:rPr>
-              <w:t xml:space="preserve">17918ms</w:t>
+              <w:t xml:space="preserve">17880ms</w:t>
             </w:r>
           </w:p>
         </w:tc>
@@ -5464,14 +5464,14 @@
           <w:sz w:val="18"/>
           <w:szCs w:val="18"/>
         </w:rPr>
-        <w:t xml:space="preserve">[235] Energía Solar — VACIO: </w:t>
+        <w:t xml:space="preserve">[7] Fontanería — VACIO: </w:t>
       </w:r>
       <w:r>
         <w:rPr>
           <w:sz w:val="18"/>
           <w:szCs w:val="18"/>
         </w:rPr>
-        <w:t xml:space="preserve">Instalar sistema híbrido solar y aerotermia para vivienda eficiente, cálculo de </w:t>
+        <w:t xml:space="preserve">Instalación completa de baño nuevo con lavabo empotrado, inodoro suspendido, duc</w:t>
       </w:r>
       <w:r>
         <w:t xml:space="preserve"/>
@@ -5488,17 +5488,22 @@
           <w:sz w:val="18"/>
           <w:szCs w:val="18"/>
         </w:rPr>
-        <w:t xml:space="preserve">[239] Energía Solar — VACIO: </w:t>
+        <w:t xml:space="preserve">[22] Electricidad — PRECIO_INVALIDO: </w:t>
       </w:r>
       <w:r>
         <w:rPr>
           <w:sz w:val="18"/>
           <w:szCs w:val="18"/>
         </w:rPr>
-        <w:t xml:space="preserve">Proyecto de comunidad energética solar en barrio, 20 viviendas participantes, ge</w:t>
-      </w:r>
-      <w:r>
-        <w:t xml:space="preserve"/>
+        <w:t xml:space="preserve">Instalación de enchufe en terraza con protección IP exterior y toma de tierra</w:t>
+      </w:r>
+      <w:r>
+        <w:rPr>
+          <w:color w:val="CC0000"/>
+          <w:sz w:val="18"/>
+          <w:szCs w:val="18"/>
+        </w:rPr>
+        <w:t xml:space="preserve"> (Partida de catálogo con precio 0 o nulo)</w:t>
       </w:r>
     </w:p>
     <w:p>
@@ -5512,14 +5517,14 @@
           <w:sz w:val="18"/>
           <w:szCs w:val="18"/>
         </w:rPr>
-        <w:t xml:space="preserve">[341] Mantenimiento General — ERROR_TECNICO: </w:t>
+        <w:t xml:space="preserve">[104] Climatización — PRECIO_INVALIDO: </w:t>
       </w:r>
       <w:r>
         <w:rPr>
           <w:sz w:val="18"/>
           <w:szCs w:val="18"/>
         </w:rPr>
-        <w:t xml:space="preserve">Contrato de mantenimiento mensual de edificio de oficinas, electricidad, fontane</w:t>
+        <w:t xml:space="preserve">Reparar aire acondicionado que no enfría, revisar gas y compresor de la unidad e</w:t>
       </w:r>
       <w:r>
         <w:rPr>
@@ -5527,7 +5532,7 @@
           <w:sz w:val="18"/>
           <w:szCs w:val="18"/>
         </w:rPr>
-        <w:t xml:space="preserve"> (Tu plan actual no permite generar contratos de mantenimiento. Actualiza al Plan Empresa+ para acceder a este módulo.)</w:t>
+        <w:t xml:space="preserve"> (Partida de catálogo con precio 0 o nulo)</w:t>
       </w:r>
     </w:p>
     <w:p>
@@ -5541,14 +5546,38 @@
           <w:sz w:val="18"/>
           <w:szCs w:val="18"/>
         </w:rPr>
-        <w:t xml:space="preserve">[346] Mantenimiento General — ERROR_TECNICO: </w:t>
+        <w:t xml:space="preserve">[106] Climatización — VACIO: </w:t>
       </w:r>
       <w:r>
         <w:rPr>
           <w:sz w:val="18"/>
           <w:szCs w:val="18"/>
         </w:rPr>
-        <w:t xml:space="preserve">Contrato anual de mantenimiento de comunidad de vecinos, incluye piscina, jardin</w:t>
+        <w:t xml:space="preserve">Instalación de suelo radiante con bomba de calor en planta baja de 90 metros cua</w:t>
+      </w:r>
+      <w:r>
+        <w:t xml:space="preserve"/>
+      </w:r>
+    </w:p>
+    <w:p>
+      <w:pPr>
+        <w:spacing w:after="60"/>
+      </w:pPr>
+      <w:r>
+        <w:rPr>
+          <w:b/>
+          <w:bCs/>
+          <w:sz w:val="18"/>
+          <w:szCs w:val="18"/>
+        </w:rPr>
+        <w:t xml:space="preserve">[122] Tejados/Cubiertas — PRECIO_INVALIDO: </w:t>
+      </w:r>
+      <w:r>
+        <w:rPr>
+          <w:sz w:val="18"/>
+          <w:szCs w:val="18"/>
+        </w:rPr>
+        <w:t xml:space="preserve">Cambio completo de cubierta plana en piso ático, impermeabilización con lámina l</w:t>
       </w:r>
       <w:r>
         <w:rPr>
@@ -5556,7 +5585,142 @@
           <w:sz w:val="18"/>
           <w:szCs w:val="18"/>
         </w:rPr>
-        <w:t xml:space="preserve"> (Tu plan actual no permite generar contratos de mantenimiento. Actualiza al Plan Empresa+ para acceder a este módulo.)</w:t>
+        <w:t xml:space="preserve"> (Partida de catálogo con precio 0 o nulo)</w:t>
+      </w:r>
+    </w:p>
+    <w:p>
+      <w:pPr>
+        <w:spacing w:after="60"/>
+      </w:pPr>
+      <w:r>
+        <w:rPr>
+          <w:b/>
+          <w:bCs/>
+          <w:sz w:val="18"/>
+          <w:szCs w:val="18"/>
+        </w:rPr>
+        <w:t xml:space="preserve">[167] Suelos y Alicatados — PRECIO_INVALIDO: </w:t>
+      </w:r>
+      <w:r>
+        <w:rPr>
+          <w:sz w:val="18"/>
+          <w:szCs w:val="18"/>
+        </w:rPr>
+        <w:t xml:space="preserve">Alicatar piscina con gresite azul, vaciado y colocación en paredes y fondo, 40 m</w:t>
+      </w:r>
+      <w:r>
+        <w:rPr>
+          <w:color w:val="CC0000"/>
+          <w:sz w:val="18"/>
+          <w:szCs w:val="18"/>
+        </w:rPr>
+        <w:t xml:space="preserve"> (Partida de catálogo con precio 0 o nulo)</w:t>
+      </w:r>
+    </w:p>
+    <w:p>
+      <w:pPr>
+        <w:spacing w:after="60"/>
+      </w:pPr>
+      <w:r>
+        <w:rPr>
+          <w:b/>
+          <w:bCs/>
+          <w:sz w:val="18"/>
+          <w:szCs w:val="18"/>
+        </w:rPr>
+        <w:t xml:space="preserve">[183] Cerrajería — PRECIO_INVALIDO: </w:t>
+      </w:r>
+      <w:r>
+        <w:rPr>
+          <w:sz w:val="18"/>
+          <w:szCs w:val="18"/>
+        </w:rPr>
+        <w:t xml:space="preserve">Apertura de urgencia de puerta de casa, me he quedado encerrado fuera sin llaves</w:t>
+      </w:r>
+      <w:r>
+        <w:rPr>
+          <w:color w:val="CC0000"/>
+          <w:sz w:val="18"/>
+          <w:szCs w:val="18"/>
+        </w:rPr>
+        <w:t xml:space="preserve"> (Partida de catálogo con precio 0 o nulo)</w:t>
+      </w:r>
+    </w:p>
+    <w:p>
+      <w:pPr>
+        <w:spacing w:after="60"/>
+      </w:pPr>
+      <w:r>
+        <w:rPr>
+          <w:b/>
+          <w:bCs/>
+          <w:sz w:val="18"/>
+          <w:szCs w:val="18"/>
+        </w:rPr>
+        <w:t xml:space="preserve">[222] Energía Solar — VACIO: </w:t>
+      </w:r>
+      <w:r>
+        <w:rPr>
+          <w:sz w:val="18"/>
+          <w:szCs w:val="18"/>
+        </w:rPr>
+        <w:t xml:space="preserve">Presupuesto para instalación solar con baterías de litio para desconectarse de l</w:t>
+      </w:r>
+      <w:r>
+        <w:t xml:space="preserve"/>
+      </w:r>
+    </w:p>
+    <w:p>
+      <w:pPr>
+        <w:spacing w:after="60"/>
+      </w:pPr>
+      <w:r>
+        <w:rPr>
+          <w:b/>
+          <w:bCs/>
+          <w:sz w:val="18"/>
+          <w:szCs w:val="18"/>
+        </w:rPr>
+        <w:t xml:space="preserve">[235] Energía Solar — VACIO: </w:t>
+      </w:r>
+      <w:r>
+        <w:rPr>
+          <w:sz w:val="18"/>
+          <w:szCs w:val="18"/>
+        </w:rPr>
+        <w:t xml:space="preserve">Instalar sistema híbrido solar y aerotermia para vivienda eficiente, cálculo de </w:t>
+      </w:r>
+      <w:r>
+        <w:t xml:space="preserve"/>
+      </w:r>
+    </w:p>
+    <w:p>
+      <w:pPr>
+        <w:spacing w:after="60"/>
+      </w:pPr>
+      <w:r>
+        <w:rPr>
+          <w:b/>
+          <w:bCs/>
+          <w:sz w:val="18"/>
+          <w:szCs w:val="18"/>
+        </w:rPr>
+        <w:t xml:space="preserve">[236] Energía Solar — PRECIO_INVALIDO: </w:t>
+      </w:r>
+      <w:r>
+        <w:rPr>
+          <w:sz w:val="18"/>
+          <w:szCs w:val="18"/>
+        </w:rPr>
+        <w:t xml:space="preserve">Monitorizar producción de instalación fotovoltaica con aplicación y alertas de f</w:t>
+      </w:r>
+      <w:r>
+        <w:rPr>
+          <w:color w:val="CC0000"/>
+          <w:sz w:val="18"/>
+          <w:szCs w:val="18"/>
+        </w:rPr>
+        <w:t xml:space="preserve"> (Partida de catálogo con precio 0 o nulo)</w:t>
       </w:r>
     </w:p>
     <w:p>
@@ -5599,7 +5763,7 @@
         <w:t xml:space="preserve">Coincidencia oficio ≥ 80%: </w:t>
       </w:r>
       <w:r>
-        <w:t xml:space="preserve">❌ NO CUMPLE (74%)</w:t>
+        <w:t xml:space="preserve">❌ NO CUMPLE (73%)</w:t>
       </w:r>
     </w:p>
     <w:p>
@@ -5614,7 +5778,7 @@
         <w:t xml:space="preserve">Latencia media ≤ 10 000ms: </w:t>
       </w:r>
       <w:r>
-        <w:t xml:space="preserve">❌ NO CUMPLE (17918ms)</w:t>
+        <w:t xml:space="preserve">❌ NO CUMPLE (17880ms)</w:t>
       </w:r>
     </w:p>
     <w:p>

</xml_diff>